<commit_message>
the anchoring clause was modifying the femora
"...plus per-level ribs and femora, anchored on the lowest rib-bearing vertebra above and
the first sacral segment below" attached "anchored" to the nearest noun phrase. Femora are
not anchored on anything; lumbar levels are, and that construction is what the paper is
about. The clause now sits against what it modifies and the structures follow as a list.

Paid for so the abstract stays under the limit: "resolve these alternatives" -> "resolve
them", the alternatives having just been enumerated in the preceding sentence, and "Classes
exist for ... so a variant is recorded" -> "Classes for ... let a variant be recorded".

298 words. Still 10 typeset pages, 0 errors. Review copies rebuilt.

Co-Authored-By: Claude Opus 5 <noreply@anthropic.com>
</commit_message>
<xml_diff>
--- a/paper/mpda/CTSpinoPelvic1K_review.docx
+++ b/paper/mpda/CTSpinoPelvic1K_review.docx
@@ -89,7 +89,13 @@
         <w:t xml:space="preserve"> </w:t>
       </w:r>
       <w:r>
-        <w:t xml:space="preserve">can resolve these alternatives without the count. It provides 802 CT records with</w:t>
+        <w:t xml:space="preserve">can resolve them without the count. It provides 802 CT records anchoring each lumbar level on</w:t>
+      </w:r>
+      <w:r>
+        <w:t xml:space="preserve"> </w:t>
+      </w:r>
+      <w:r>
+        <w:t xml:space="preserve">the lowest rib-bearing vertebra above and the first sacral segment below, with</w:t>
       </w:r>
       <w:r>
         <w:t xml:space="preserve"> </w:t>
@@ -111,25 +117,19 @@
         <w:t xml:space="preserve"> </w:t>
       </w:r>
       <w:r>
-        <w:t xml:space="preserve">pelvic annotation on one coordinate frame, plus</w:t>
-      </w:r>
-      <w:r>
-        <w:t xml:space="preserve"> </w:t>
-      </w:r>
-      <w:r>
-        <w:t xml:space="preserve">per-level ribs and femora, anchored on the lowest rib-bearing vertebra above and the first</w:t>
-      </w:r>
-      <w:r>
-        <w:t xml:space="preserve"> </w:t>
-      </w:r>
-      <w:r>
-        <w:t xml:space="preserve">sacral segment below. Classes exist for a sixth lumbar vertebra, a thirteenth thoracic</w:t>
-      </w:r>
-      <w:r>
-        <w:t xml:space="preserve"> </w:t>
-      </w:r>
-      <w:r>
-        <w:t xml:space="preserve">vertebra, a separate first sacral segment, and lumbar ribs, so a variant is recorded as</w:t>
+        <w:t xml:space="preserve">pelvic annotation on one coordinate frame, per-level</w:t>
+      </w:r>
+      <w:r>
+        <w:t xml:space="preserve"> </w:t>
+      </w:r>
+      <w:r>
+        <w:t xml:space="preserve">ribs and femora. Classes for a sixth lumbar vertebra, a thirteenth thoracic</w:t>
+      </w:r>
+      <w:r>
+        <w:t xml:space="preserve"> </w:t>
+      </w:r>
+      <w:r>
+        <w:t xml:space="preserve">vertebra, a separate first sacral segment, and lumbar ribs let a variant be recorded as</w:t>
       </w:r>
       <w:r>
         <w:t xml:space="preserve"> </w:t>

</xml_diff>

<commit_message>
the prior-art passage said true things in a tangled way
Every fact in it had just been verified against the sources; the sentences were the problem.
"do not make this tractable, and not because they are small" led with a negation of a
negation; "cannot be written down in them at any segmentation quality" was a phrase nobody
says; "is the instructive case, and Fig. 1(b) gives it" made the reader wait for the point.

Now: what each kind of collection lacks, in three parallel clauses; the consequence in one
plain sentence; then VerSe as the example that makes the point most clearly -- it
deliberately enriched for variants, graded them by Castellvi, and left the graded vertebrae
fused to the sacrum unsegmented. That last clause is exactly what Liebl et al. wrote.

Citations and both figure references unchanged. Still 10 typeset pages, 0 errors.

Co-Authored-By: Claude Fable 5.1 <noreply@anthropic.com>
</commit_message>
<xml_diff>
--- a/paper/mpda/CTSpinoPelvic1K_review.docx
+++ b/paper/mpda/CTSpinoPelvic1K_review.docx
@@ -472,7 +472,7 @@
         <w:pStyle w:val="BodyText"/>
       </w:pPr>
       <w:r>
-        <w:t xml:space="preserve">Existing public collections do not make this tractable, and not because they are small</w:t>
+        <w:t xml:space="preserve">Existing public collections cannot address this, and size is not the reason</w:t>
       </w:r>
       <w:r>
         <w:t xml:space="preserve"> </w:t>
@@ -489,37 +489,37 @@
         </w:r>
       </w:hyperlink>
       <w:r>
-        <w:t xml:space="preserve">): the spine collections omit the pelvis, the pelvic ones carry no</w:t>
-      </w:r>
-      <w:r>
-        <w:t xml:space="preserve"> </w:t>
-      </w:r>
-      <w:r>
-        <w:t xml:space="preserve">vertebral count, and the whole-body scheme, TotalSegmentator, has neither an L6 class nor a class for a rib</w:t>
-      </w:r>
-      <w:r>
-        <w:t xml:space="preserve"> </w:t>
-      </w:r>
-      <w:r>
-        <w:t xml:space="preserve">borne by a lumbar vertebra, so a six-lumbar spine cannot be written down in them at any</w:t>
-      </w:r>
-      <w:r>
-        <w:t xml:space="preserve"> </w:t>
-      </w:r>
-      <w:r>
-        <w:t xml:space="preserve">segmentation quality. VerSe </w:t>
-      </w:r>
-      <w:r>
-        <w:t xml:space="preserve"> </w:t>
-      </w:r>
-      <w:r>
-        <w:t xml:space="preserve">is the instructive case, and</w:t>
-      </w:r>
-      <w:r>
-        <w:t xml:space="preserve"> </w:t>
-      </w:r>
-      <w:r>
-        <w:t xml:space="preserve">Fig. </w:t>
+        <w:t xml:space="preserve">). Spine datasets omit the pelvis; pelvic datasets do not number the</w:t>
+      </w:r>
+      <w:r>
+        <w:t xml:space="preserve"> </w:t>
+      </w:r>
+      <w:r>
+        <w:t xml:space="preserve">vertebrae; and TotalSegmentator, the whole-body scheme, has no class for a sixth lumbar</w:t>
+      </w:r>
+      <w:r>
+        <w:t xml:space="preserve"> </w:t>
+      </w:r>
+      <w:r>
+        <w:t xml:space="preserve">vertebra or for a rib on a lumbar vertebra. A six-lumbar spine therefore cannot be recorded</w:t>
+      </w:r>
+      <w:r>
+        <w:t xml:space="preserve"> </w:t>
+      </w:r>
+      <w:r>
+        <w:t xml:space="preserve">in any of them, however good the segmentation. VerSe </w:t>
+      </w:r>
+      <w:r>
+        <w:t xml:space="preserve"> </w:t>
+      </w:r>
+      <w:r>
+        <w:t xml:space="preserve">makes the</w:t>
+      </w:r>
+      <w:r>
+        <w:t xml:space="preserve"> </w:t>
+      </w:r>
+      <w:r>
+        <w:t xml:space="preserve">point most clearly (Fig. </w:t>
       </w:r>
       <w:hyperlink w:anchor="fig:priorart">
         <w:r>
@@ -530,13 +530,19 @@
         </w:r>
       </w:hyperlink>
       <w:r>
-        <w:t xml:space="preserve">(b) gives it: a collection can enrich for anatomical variants</w:t>
-      </w:r>
-      <w:r>
-        <w:t xml:space="preserve"> </w:t>
-      </w:r>
-      <w:r>
-        <w:t xml:space="preserve">deliberately, grade them, and still be unable to represent the ones it grades.</w:t>
+        <w:t xml:space="preserve">b): it deliberately enriched for anatomical</w:t>
+      </w:r>
+      <w:r>
+        <w:t xml:space="preserve"> </w:t>
+      </w:r>
+      <w:r>
+        <w:t xml:space="preserve">variants and graded them by Castellvi, yet left the graded vertebrae fused to the sacrum</w:t>
+      </w:r>
+      <w:r>
+        <w:t xml:space="preserve"> </w:t>
+      </w:r>
+      <w:r>
+        <w:t xml:space="preserve">unsegmented.</w:t>
       </w:r>
     </w:p>
     <w:p>

</xml_diff>

<commit_message>
drop the match_type footnote; a densified release makes it moot for readers
The sentence told users which manifest field to filter on for the four record types. It was
added to prevent a trap, but it is implementation detail: the release is densified, so every
record carries a pelvis and fused / separate / spine-only is construction history rather than
something a user must act on. The field documentation ships with the archive. Author's call.

Still 10 typeset pages, 0 errors.

Co-Authored-By: Claude Fable 5.1 <noreply@anthropic.com>
</commit_message>
<xml_diff>
--- a/paper/mpda/CTSpinoPelvic1K_review.docx
+++ b/paper/mpda/CTSpinoPelvic1K_review.docx
@@ -1372,83 +1372,6 @@
           <w:iCs/>
         </w:rPr>
         <w:t xml:space="preserve">pelvic_only</w:t>
-      </w:r>
-      <w:r>
-        <w:t xml:space="preserve">. These four are the values of</w:t>
-      </w:r>
-      <w:r>
-        <w:t xml:space="preserve"> </w:t>
-      </w:r>
-      <w:r>
-        <w:t xml:space="preserve">the manifest’s</w:t>
-      </w:r>
-      <w:r>
-        <w:t xml:space="preserve"> </w:t>
-      </w:r>
-      <w:r>
-        <w:rPr>
-          <w:rStyle w:val="VerbatimChar"/>
-        </w:rPr>
-        <w:t xml:space="preserve">match_type</w:t>
-      </w:r>
-      <w:r>
-        <w:t xml:space="preserve"> </w:t>
-      </w:r>
-      <w:r>
-        <w:t xml:space="preserve">field; the coarser</w:t>
-      </w:r>
-      <w:r>
-        <w:t xml:space="preserve"> </w:t>
-      </w:r>
-      <w:r>
-        <w:rPr>
-          <w:rStyle w:val="VerbatimChar"/>
-        </w:rPr>
-        <w:t xml:space="preserve">config</w:t>
-      </w:r>
-      <w:r>
-        <w:t xml:space="preserve"> </w:t>
-      </w:r>
-      <w:r>
-        <w:t xml:space="preserve">field folds</w:t>
-      </w:r>
-      <w:r>
-        <w:t xml:space="preserve"> </w:t>
-      </w:r>
-      <w:r>
-        <w:rPr>
-          <w:i/>
-          <w:iCs/>
-        </w:rPr>
-        <w:t xml:space="preserve">separate</w:t>
-      </w:r>
-      <w:r>
-        <w:t xml:space="preserve"> </w:t>
-      </w:r>
-      <w:r>
-        <w:t xml:space="preserve">into</w:t>
-      </w:r>
-      <w:r>
-        <w:t xml:space="preserve"> </w:t>
-      </w:r>
-      <w:r>
-        <w:rPr>
-          <w:i/>
-          <w:iCs/>
-        </w:rPr>
-        <w:t xml:space="preserve">spine_only</w:t>
-      </w:r>
-      <w:r>
-        <w:t xml:space="preserve">, so a user wanting the four types should read</w:t>
-      </w:r>
-      <w:r>
-        <w:t xml:space="preserve"> </w:t>
-      </w:r>
-      <w:r>
-        <w:rPr>
-          <w:rStyle w:val="VerbatimChar"/>
-        </w:rPr>
-        <w:t xml:space="preserve">match_type</w:t>
       </w:r>
       <w:r>
         <w:t xml:space="preserve">. The split is the crosswalk’s</w:t>

</xml_diff>

<commit_message>
Castellvi: 33 graded cases; the readers' normal reference row is not a grade
The grading sheet carries 33 transitional cases and one row labelled "reference NL", a normal
spine one reader added for comparison. The consensus script had written it into the manifest
as grade "0" with a consensus flag, so the completeness table said 34 against the text's 33.
The row stays in docs/castellvi_consensus.csv; its manifest fields are removed, the paper,
figure, title page and release notes all say 33, and the disagreement count is six.

Co-Authored-By: Claude Fable 5.1 <noreply@anthropic.com>
</commit_message>
<xml_diff>
--- a/paper/mpda/CTSpinoPelvic1K_review.docx
+++ b/paper/mpda/CTSpinoPelvic1K_review.docx
@@ -3187,37 +3187,37 @@
         <w:pStyle w:val="BodyText"/>
       </w:pPr>
       <w:r>
-        <w:t xml:space="preserve">Two radiology resident physicians graded every case independently and resolved their seven</w:t>
-      </w:r>
-      <w:r>
-        <w:t xml:space="preserve"> </w:t>
-      </w:r>
-      <w:r>
-        <w:t xml:space="preserve">disagreements by consensus; both reads and the consensus are in the manifest, with one</w:t>
-      </w:r>
-      <w:r>
-        <w:t xml:space="preserve"> </w:t>
-      </w:r>
-      <w:r>
-        <w:t xml:space="preserve">normal reference read. The distinction the classification turns on — bony fusion against</w:t>
-      </w:r>
-      <w:r>
-        <w:t xml:space="preserve"> </w:t>
-      </w:r>
-      <w:r>
-        <w:t xml:space="preserve">articulation without it </w:t>
-      </w:r>
-      <w:r>
-        <w:t xml:space="preserve"> </w:t>
-      </w:r>
-      <w:r>
-        <w:t xml:space="preserve">— is the one carrying clinical weight, and</w:t>
-      </w:r>
-      <w:r>
-        <w:t xml:space="preserve"> </w:t>
-      </w:r>
-      <w:r>
-        <w:t xml:space="preserve">it is where the disagreements lay: four of the seven were III against II.</w:t>
+        <w:t xml:space="preserve">Two radiology resident physicians graded every case independently and resolved their six</w:t>
+      </w:r>
+      <w:r>
+        <w:t xml:space="preserve"> </w:t>
+      </w:r>
+      <w:r>
+        <w:t xml:space="preserve">disagreements by consensus; both reads and the consensus are in the manifest. The distinction</w:t>
+      </w:r>
+      <w:r>
+        <w:t xml:space="preserve"> </w:t>
+      </w:r>
+      <w:r>
+        <w:t xml:space="preserve">the classification turns on — bony fusion against articulation without</w:t>
+      </w:r>
+      <w:r>
+        <w:t xml:space="preserve"> </w:t>
+      </w:r>
+      <w:r>
+        <w:t xml:space="preserve">it </w:t>
+      </w:r>
+      <w:r>
+        <w:t xml:space="preserve"> </w:t>
+      </w:r>
+      <w:r>
+        <w:t xml:space="preserve">— is the one carrying clinical weight, and it is where the</w:t>
+      </w:r>
+      <w:r>
+        <w:t xml:space="preserve"> </w:t>
+      </w:r>
+      <w:r>
+        <w:t xml:space="preserve">disagreements lay: four of the six were III against II.</w:t>
       </w:r>
     </w:p>
     <w:tbl>
@@ -4748,7 +4748,7 @@
               <w:jc w:val="right"/>
             </w:pPr>
             <w:r>
-              <w:t xml:space="preserve">34</w:t>
+              <w:t xml:space="preserve">33</w:t>
             </w:r>
           </w:p>
         </w:tc>
@@ -4760,7 +4760,7 @@
               <w:jc w:val="right"/>
             </w:pPr>
             <w:r>
-              <w:t xml:space="preserve">4.2%</w:t>
+              <w:t xml:space="preserve">4.1%</w:t>
             </w:r>
           </w:p>
         </w:tc>

</xml_diff>

<commit_message>
Ashley's Overleaf edits merged: prose through Methods and Applications, and a Discussion with limitations and future directions
Three-way merge of her copy (base 2cc7a6f) onto the current file. Her wording is kept
throughout; three copy-edits on the new Discussion: femora for house style, a missing space,
and the TotalSegmentator sentence brought back to the claim the introduction makes.

Co-Authored-By: Claude Fable 5.1 <noreply@anthropic.com>
</commit_message>
<xml_diff>
--- a/paper/mpda/CTSpinoPelvic1K_review.docx
+++ b/paper/mpda/CTSpinoPelvic1K_review.docx
@@ -1370,7 +1370,7 @@
         <w:t xml:space="preserve"> </w:t>
       </w:r>
       <w:r>
-        <w:t xml:space="preserve">and no rigid realignment recovers them; such a mask looks competent in isolation and reveals</w:t>
+        <w:t xml:space="preserve">and no rigid realignment recovers them. Such a mask looks competent in isolation and reveals</w:t>
       </w:r>
       <w:r>
         <w:t xml:space="preserve"> </w:t>
@@ -1439,13 +1439,7 @@
         <w:pStyle w:val="FirstParagraph"/>
       </w:pPr>
       <w:r>
-        <w:t xml:space="preserve">The two annotation sets were placed independently and do not always land on the same</w:t>
-      </w:r>
-      <w:r>
-        <w:t xml:space="preserve"> </w:t>
-      </w:r>
-      <w:r>
-        <w:t xml:space="preserve">series (Fig. </w:t>
+        <w:t xml:space="preserve">CTSpine1K and CTPelvic1K each annotated a patient independently, so their labels are not guaranteed to come from the same CT series (Fig. </w:t>
       </w:r>
       <w:hyperlink w:anchor="fig:pipeline">
         <w:r>
@@ -1456,50 +1450,7 @@
         </w:r>
       </w:hyperlink>
       <w:r>
-        <w:t xml:space="preserve">). The split is the crosswalk’s main finding: in the 351</w:t>
-      </w:r>
-      <w:r>
-        <w:t xml:space="preserve"> </w:t>
-      </w:r>
-      <w:r>
-        <w:t xml:space="preserve">separate records — nearly half of all patients — the two public collections annotated</w:t>
-      </w:r>
-      <w:r>
-        <w:t xml:space="preserve"> </w:t>
-      </w:r>
-      <w:r>
-        <w:rPr>
-          <w:i/>
-          <w:iCs/>
-        </w:rPr>
-        <w:t xml:space="preserve">different volumes of the same person</w:t>
-      </w:r>
-      <w:r>
-        <w:t xml:space="preserve">, and neither recorded which. A pelvic annotation</w:t>
-      </w:r>
-      <w:r>
-        <w:t xml:space="preserve"> </w:t>
-      </w:r>
-      <w:r>
-        <w:t xml:space="preserve">on the other acquisition of a prone/supine pair cannot be combined with the spine annotation</w:t>
-      </w:r>
-      <w:r>
-        <w:t xml:space="preserve"> </w:t>
-      </w:r>
-      <w:r>
-        <w:t xml:space="preserve">without resampling across a change of posture, so those records are retained and held out of</w:t>
-      </w:r>
-      <w:r>
-        <w:t xml:space="preserve"> </w:t>
-      </w:r>
-      <w:r>
-        <w:t xml:space="preserve">the postural analyses: two acquisitions of one patient differing in alignment are a resource</w:t>
-      </w:r>
-      <w:r>
-        <w:t xml:space="preserve"> </w:t>
-      </w:r>
-      <w:r>
-        <w:t xml:space="preserve">for a mobility study, not a defect.</w:t>
+        <w:t xml:space="preserve">). This turned out to matter for 351 patients, nearly half the cohort: the two collections had labeled different acquisitions of the same person, one prone and one supine, with neither recording which. Because posture changes spinal alignment, a spine label from one acquisition cannot simply be paired with a pelvic label from the other. These 351 records are released but held out of any analysis that assumes a single posture. Two labeled acquisitions of the same patient in different postures are, instead, a resource for studying postural alignment, not a defect.</w:t>
       </w:r>
     </w:p>
     <w:bookmarkEnd w:id="13"/>
@@ -1523,7 +1474,7 @@
         <w:t xml:space="preserve"> </w:t>
       </w:r>
       <w:r>
-        <w:t xml:space="preserve">missing structures were pseudolabeled — asymmetrically (Fig. </w:t>
+        <w:t xml:space="preserve">missing structures were pseudolabeled, asymmetrically (Fig. </w:t>
       </w:r>
       <w:hyperlink w:anchor="fig:pipeline">
         <w:r>
@@ -1580,7 +1531,7 @@
         <w:t xml:space="preserve"> </w:t>
       </w:r>
       <w:r>
-        <w:t xml:space="preserve">corrected by hand, which is tractable at twenty.</w:t>
+        <w:t xml:space="preserve">corrected by hand, tractable at that scale.</w:t>
       </w:r>
     </w:p>
     <w:bookmarkEnd w:id="14"/>
@@ -1664,7 +1615,7 @@
         <w:t xml:space="preserve"> </w:t>
       </w:r>
       <w:r>
-        <w:t xml:space="preserve">segmented to the edge. This is not a limitation its authors report — their evaluation</w:t>
+        <w:t xml:space="preserve">segmented to the edge. This is not a limitation reported by its authors: their evaluation</w:t>
       </w:r>
       <w:r>
         <w:t xml:space="preserve"> </w:t>
@@ -1676,7 +1627,7 @@
         <w:t xml:space="preserve"> </w:t>
       </w:r>
       <w:r>
-        <w:t xml:space="preserve">attributes errors to costal-process fusion — so it is recorded here as an observation</w:t>
+        <w:t xml:space="preserve">attributes errors to costal-process fusion, so it is recorded here as an observation</w:t>
       </w:r>
       <w:r>
         <w:t xml:space="preserve"> </w:t>
@@ -1714,13 +1665,13 @@
         <w:t xml:space="preserve"> </w:t>
       </w:r>
       <w:r>
-        <w:t xml:space="preserve">end of the bone: the most medial portion of the rib — roughly the last tenth to sixth</w:t>
-      </w:r>
-      <w:r>
-        <w:t xml:space="preserve"> </w:t>
-      </w:r>
-      <w:r>
-        <w:t xml:space="preserve">approaching the costovertebral joint — is frequently absent. A rib truncated at its</w:t>
+        <w:t xml:space="preserve">end of the bone: the most medial portion of the rib (roughly the last tenth to sixth</w:t>
+      </w:r>
+      <w:r>
+        <w:t xml:space="preserve"> </w:t>
+      </w:r>
+      <w:r>
+        <w:t xml:space="preserve">approaching the costovertebral joint) is frequently absent. A rib truncated at its</w:t>
       </w:r>
       <w:r>
         <w:t xml:space="preserve"> </w:t>
@@ -1732,13 +1683,13 @@
         <w:t xml:space="preserve"> </w:t>
       </w:r>
       <w:r>
-        <w:t xml:space="preserve">check — the quality-control gate on the rib class labels, which matches each rib to the</w:t>
-      </w:r>
-      <w:r>
-        <w:t xml:space="preserve"> </w:t>
-      </w:r>
-      <w:r>
-        <w:t xml:space="preserve">vertebra its number implies — has nothing to test.</w:t>
+        <w:t xml:space="preserve">check (the quality-control gate on the rib class labels, which matches each rib to the</w:t>
+      </w:r>
+      <w:r>
+        <w:t xml:space="preserve"> </w:t>
+      </w:r>
+      <w:r>
+        <w:t xml:space="preserve">vertebra its number implies) has nothing to test.</w:t>
       </w:r>
     </w:p>
     <w:p>
@@ -1813,7 +1764,7 @@
         <w:t xml:space="preserve"> </w:t>
       </w:r>
       <w:r>
-        <w:t xml:space="preserve">articulates with — a single bone with two numbers being a numbering error by construction,</w:t>
+        <w:t xml:space="preserve">articulates with, since a single bone carrying two numbers is a numbering error by construction,</w:t>
       </w:r>
       <w:r>
         <w:t xml:space="preserve"> </w:t>
@@ -1846,13 +1797,7 @@
         <w:t xml:space="preserve"> </w:t>
       </w:r>
       <w:r>
-        <w:t xml:space="preserve">individually inspected, so the layer’s guarantee is that it is free of the failure modes the</w:t>
-      </w:r>
-      <w:r>
-        <w:t xml:space="preserve"> </w:t>
-      </w:r>
-      <w:r>
-        <w:t xml:space="preserve">rule detects, and no stronger. The residual rib–vertebra offsets reported in</w:t>
+        <w:t xml:space="preserve">individually inspected, so the layer only guarantees freedom from the failure modes the rule detects, no more. The residual rib–vertebra offsets reported in</w:t>
       </w:r>
       <w:r>
         <w:t xml:space="preserve"> </w:t>
@@ -2012,19 +1957,13 @@
         <w:t xml:space="preserve"> </w:t>
       </w:r>
       <w:r>
-        <w:t xml:space="preserve">is the sacrum’s own cranio-caudal axis, made orthogonal to a left–right axis that is</w:t>
-      </w:r>
-      <w:r>
-        <w:t xml:space="preserve"> </w:t>
-      </w:r>
-      <w:r>
-        <w:t xml:space="preserve">measured rather than assumed — the normal of the reflection plane best mapping the sacrum</w:t>
-      </w:r>
-      <w:r>
-        <w:t xml:space="preserve"> </w:t>
-      </w:r>
-      <w:r>
-        <w:t xml:space="preserve">onto itself, which removes the patient’s rotation within the scanner. That rotation is not</w:t>
+        <w:t xml:space="preserve">is the sacrum’s own cranio-caudal axis, made orthogonal to a left–right axis</w:t>
+      </w:r>
+      <w:r>
+        <w:t xml:space="preserve"> </w:t>
+      </w:r>
+      <w:r>
+        <w:t xml:space="preserve">measured directly rather than assumed, so as to remove the patient’s rotation within the scanner. That rotation is not</w:t>
       </w:r>
       <w:r>
         <w:t xml:space="preserve"> </w:t>
@@ -2116,7 +2055,7 @@
         <w:pStyle w:val="BodyText"/>
       </w:pPr>
       <w:r>
-        <w:t xml:space="preserve">Neither anchor is novel: TotalSegmentator </w:t>
+        <w:t xml:space="preserve">Neither anchor is novel on its own: TotalSegmentator </w:t>
       </w:r>
       <w:r>
         <w:t xml:space="preserve"> </w:t>
@@ -4932,7 +4871,7 @@
         <w:t xml:space="preserve"> </w:t>
       </w:r>
       <w:r>
-        <w:t xml:space="preserve">from sex-stratified measures — a limitation of those measures rather than of the cohort,</w:t>
+        <w:t xml:space="preserve">from sex-stratified measures (a limitation of those measures rather than of the cohort),</w:t>
       </w:r>
       <w:r>
         <w:t xml:space="preserve"> </w:t>
@@ -5194,13 +5133,13 @@
         <w:t xml:space="preserve">spinopelvic interface</w:t>
       </w:r>
       <w:r>
-        <w:t xml:space="preserve">: spine and pelvis carry</w:t>
-      </w:r>
-      <w:r>
-        <w:t xml:space="preserve"> </w:t>
-      </w:r>
-      <w:r>
-        <w:t xml:space="preserve">radiologist-sourced annotation on one coordinate frame in 802 records, which makes sacral</w:t>
+        <w:t xml:space="preserve">. Spine and pelvis carry</w:t>
+      </w:r>
+      <w:r>
+        <w:t xml:space="preserve"> </w:t>
+      </w:r>
+      <w:r>
+        <w:t xml:space="preserve">radiologist-sourced annotation on one coordinate frame in 802 records, making sacral</w:t>
       </w:r>
       <w:r>
         <w:t xml:space="preserve"> </w:t>
@@ -5553,7 +5492,7 @@
         <w:t xml:space="preserve"> </w:t>
       </w:r>
       <w:r>
-        <w:t xml:space="preserve">femoral heads in one frame, which is this release’s construction; in 351 patients the</w:t>
+        <w:t xml:space="preserve">femoral heads in one frame, which is this release’s construction. In 351 patients the</w:t>
       </w:r>
       <w:r>
         <w:t xml:space="preserve"> </w:t>
@@ -5573,7 +5512,7 @@
         <w:pStyle w:val="BodyText"/>
       </w:pPr>
       <w:r>
-        <w:t xml:space="preserve">Its limitations are part of it, and they are stated at the level of detail a reader would</w:t>
+        <w:t xml:space="preserve">Its limitations are stated at the level of detail a reader would</w:t>
       </w:r>
       <w:r>
         <w:t xml:space="preserve"> </w:t>
@@ -5946,7 +5885,55 @@
         <w:t xml:space="preserve"> </w:t>
       </w:r>
       <w:r>
-        <w:t xml:space="preserve">same series, together with classes for the anatomy an enumeration anomaly actually produces.</w:t>
+        <w:t xml:space="preserve">same series, together with classes for the anatomy an enumeration anomaly actually produces. VerSe </w:t>
+      </w:r>
+      <w:r>
+        <w:t xml:space="preserve"> </w:t>
+      </w:r>
+      <w:r>
+        <w:t xml:space="preserve">comes closest in intent: it also enriched its cohort for transitional anatomy and graded each case by Castellvi. The difference is what a graded case leaves behind. VerSe names the anomaly but does not segment the sacrum, so the fused or articulating structure the grade describes has no mask to go with it. This release segments that structure directly, as L6 or as a separately carved S1, so a user has the anatomy itself to measure rather than only a grade that describes it. TotalSegmentator </w:t>
+      </w:r>
+      <w:r>
+        <w:t xml:space="preserve"> </w:t>
+      </w:r>
+      <w:r>
+        <w:t xml:space="preserve">invites a different comparison, since it segments far more of the body than any single source used here. But its label scheme simply has no class for a sixth lumbar vertebra or for a rib on a lumbar body. A six-lumbar spine cannot be recorded in it: the column must be renumbered or a level dropped to fit. What this release adds, then, is not more anatomy per scan (TotalSegmentator already covers more), but the specific classes an enumeration anomaly needs in order to be recorded accurately.</w:t>
+      </w:r>
+    </w:p>
+    <w:p>
+      <w:pPr>
+        <w:pStyle w:val="BodyText"/>
+      </w:pPr>
+      <w:r>
+        <w:rPr>
+          <w:i/>
+          <w:iCs/>
+        </w:rPr>
+        <w:t xml:space="preserve">Limitations.</w:t>
+      </w:r>
+      <w:r>
+        <w:t xml:space="preserve"> </w:t>
+      </w:r>
+      <w:r>
+        <w:t xml:space="preserve">The cohort comes from one acquisition protocol of a colorectal-screening population aged 50 and over, so how well it generalizes to a pathologic population is untested. The rib layer’s human review was triaged by an automated rule rather than performed on every bone, so it guarantees only the absence of the failure modes that rule detects.</w:t>
+      </w:r>
+    </w:p>
+    <w:p>
+      <w:pPr>
+        <w:pStyle w:val="BodyText"/>
+      </w:pPr>
+      <w:r>
+        <w:rPr>
+          <w:i/>
+          <w:iCs/>
+        </w:rPr>
+        <w:t xml:space="preserve">Future directions.</w:t>
+      </w:r>
+      <w:r>
+        <w:t xml:space="preserve"> </w:t>
+      </w:r>
+      <w:r>
+        <w:t xml:space="preserve">The version history shows the scheme being extended more than once: femora and the S1 anchor, then per-level ribs, then lumbar ribs and surgical hardware, were each folded into the existing release rather than requiring a new dataset. The same path is open going forward: imaging from beyond this cohort’s single protocol, and the C2 anchor this acquisition cannot supply, are the natural next additions.</w:t>
       </w:r>
     </w:p>
     <w:bookmarkEnd w:id="55"/>
@@ -5988,7 +5975,7 @@
         <w:t xml:space="preserve"> </w:t>
       </w:r>
       <w:r>
-        <w:t xml:space="preserve">downward from C2 — which is every record here.</w:t>
+        <w:t xml:space="preserve">downward from C2, which is every record here.</w:t>
       </w:r>
     </w:p>
     <w:bookmarkEnd w:id="56"/>

</xml_diff>

<commit_message>
Submission pass: abstract under 300 words, the self-citation anonymized under \reviewtrue, corresponding email on the title page, last overfull line fixed
Co-Authored-By: Claude Fable 5.1 <noreply@anthropic.com>
</commit_message>
<xml_diff>
--- a/paper/mpda/CTSpinoPelvic1K_review.docx
+++ b/paper/mpda/CTSpinoPelvic1K_review.docx
@@ -47,22 +47,22 @@
         <w:t xml:space="preserve"> </w:t>
       </w:r>
       <w:r>
-        <w:t xml:space="preserve">vertebra (LSTV) is present. Levels are conventionally established by counting downward from</w:t>
-      </w:r>
-      <w:r>
-        <w:t xml:space="preserve"> </w:t>
-      </w:r>
-      <w:r>
-        <w:t xml:space="preserve">C2, the reference standard for numeration </w:t>
-      </w:r>
-      <w:r>
-        <w:t xml:space="preserve">. An abdominal field of</w:t>
-      </w:r>
-      <w:r>
-        <w:t xml:space="preserve"> </w:t>
-      </w:r>
-      <w:r>
-        <w:t xml:space="preserve">view lacks that landmark, leaving a specific ambiguity: four rib-free lumbar</w:t>
+        <w:t xml:space="preserve">vertebra (LSTV) is present. Counting down from C2, the reference standard for</w:t>
+      </w:r>
+      <w:r>
+        <w:t xml:space="preserve"> </w:t>
+      </w:r>
+      <w:r>
+        <w:t xml:space="preserve">numeration </w:t>
+      </w:r>
+      <w:r>
+        <w:t xml:space="preserve">, is impossible in an abdominal field of view, which leaves a</w:t>
+      </w:r>
+      <w:r>
+        <w:t xml:space="preserve"> </w:t>
+      </w:r>
+      <w:r>
+        <w:t xml:space="preserve">specific ambiguity: four rib-free lumbar</w:t>
       </w:r>
       <w:r>
         <w:t xml:space="preserve"> </w:t>
@@ -117,13 +117,19 @@
         <w:t xml:space="preserve"> </w:t>
       </w:r>
       <w:r>
-        <w:t xml:space="preserve">pelvic annotation on one frame, per-level ribs and femora. Classes for a sixth lumbar vertebra, a thirteenth thoracic</w:t>
-      </w:r>
-      <w:r>
-        <w:t xml:space="preserve"> </w:t>
-      </w:r>
-      <w:r>
-        <w:t xml:space="preserve">vertebra, a separate first sacral segment, and lumbar ribs make the set expressive enough for anatomical anomalies.</w:t>
+        <w:t xml:space="preserve">pelvic annotation on one frame, per-level ribs and</w:t>
+      </w:r>
+      <w:r>
+        <w:t xml:space="preserve"> </w:t>
+      </w:r>
+      <w:r>
+        <w:t xml:space="preserve">femora. Classes for a sixth lumbar vertebra, a thirteenth thoracic vertebra, a separate first</w:t>
+      </w:r>
+      <w:r>
+        <w:t xml:space="preserve"> </w:t>
+      </w:r>
+      <w:r>
+        <w:t xml:space="preserve">sacral segment and lumbar ribs cover the anomalies.</w:t>
       </w:r>
     </w:p>
     <w:p>
@@ -253,13 +259,7 @@
         <w:t xml:space="preserve"> </w:t>
       </w:r>
       <w:r>
-        <w:t xml:space="preserve">Castellvi grades read independently by two radiology resident physicians and resolved by</w:t>
-      </w:r>
-      <w:r>
-        <w:t xml:space="preserve"> </w:t>
-      </w:r>
-      <w:r>
-        <w:t xml:space="preserve">consensus.</w:t>
+        <w:t xml:space="preserve">Castellvi grades are a two-reader consensus.</w:t>
       </w:r>
     </w:p>
     <w:p>
@@ -2605,13 +2605,13 @@
         <w:t xml:space="preserve"> </w:t>
       </w:r>
       <w:r>
-        <w:t xml:space="preserve">Large-language-model assistance was used for</w:t>
-      </w:r>
-      <w:r>
-        <w:t xml:space="preserve"> </w:t>
-      </w:r>
-      <w:r>
-        <w:t xml:space="preserve">manuscript preparation — drafting and editing of text, and generation of analysis and</w:t>
+        <w:t xml:space="preserve">Assistance from large language models was used</w:t>
+      </w:r>
+      <w:r>
+        <w:t xml:space="preserve"> </w:t>
+      </w:r>
+      <w:r>
+        <w:t xml:space="preserve">for manuscript preparation — drafting and editing of text, and generation of analysis and</w:t>
       </w:r>
       <w:r>
         <w:t xml:space="preserve"> </w:t>

</xml_diff>

<commit_message>
Author-guideline pass: Acknowledgements heading with the COI statement below it; rendered figures at 300 dpi
Co-Authored-By: Claude Fable 5.1 <noreply@anthropic.com>
</commit_message>
<xml_diff>
--- a/paper/mpda/CTSpinoPelvic1K_review.docx
+++ b/paper/mpda/CTSpinoPelvic1K_review.docx
@@ -6027,12 +6027,36 @@
       </w:r>
     </w:p>
     <w:bookmarkEnd w:id="57"/>
-    <w:bookmarkStart w:id="58" w:name="conflict-of-interest"/>
+    <w:bookmarkStart w:id="58" w:name="acknowledgements"/>
     <w:p>
       <w:pPr>
         <w:pStyle w:val="Heading1"/>
       </w:pPr>
       <w:r>
+        <w:t xml:space="preserve">Acknowledgements</w:t>
+      </w:r>
+    </w:p>
+    <w:p>
+      <w:pPr>
+        <w:pStyle w:val="FirstParagraph"/>
+      </w:pPr>
+      <w:r>
+        <w:t xml:space="preserve">Acknowledgements are given on the title page, per the journal’s double-anonymized review</w:t>
+      </w:r>
+      <w:r>
+        <w:t xml:space="preserve"> </w:t>
+      </w:r>
+      <w:r>
+        <w:t xml:space="preserve">policy. This work received no funding.</w:t>
+      </w:r>
+    </w:p>
+    <w:bookmarkEnd w:id="58"/>
+    <w:bookmarkStart w:id="59" w:name="conflict-of-interest"/>
+    <w:p>
+      <w:pPr>
+        <w:pStyle w:val="Heading1"/>
+      </w:pPr>
+      <w:r>
         <w:t xml:space="preserve">Conflict of Interest</w:t>
       </w:r>
     </w:p>
@@ -6044,8 +6068,8 @@
         <w:t xml:space="preserve">The authors have no relevant conflicts of interest to disclose.</w:t>
       </w:r>
     </w:p>
-    <w:bookmarkEnd w:id="58"/>
-    <w:bookmarkStart w:id="59" w:name="ethics"/>
+    <w:bookmarkEnd w:id="59"/>
+    <w:bookmarkStart w:id="60" w:name="ethics"/>
     <w:p>
       <w:pPr>
         <w:pStyle w:val="Heading1"/>
@@ -7005,7 +7029,7 @@
         <w:t xml:space="preserve">doi:10.3390/jcm15072584.</w:t>
       </w:r>
     </w:p>
-    <w:bookmarkEnd w:id="59"/>
+    <w:bookmarkEnd w:id="60"/>
     <w:sectPr>
       <w:footnotePr>
         <w:numRestart w:val="eachSect"/>

</xml_diff>

<commit_message>
Abstract opener: the count from C2 is reliable; what abdominal CT lacks is C2
Co-Authored-By: Claude Fable 5.1 <noreply@anthropic.com>
</commit_message>
<xml_diff>
--- a/paper/mpda/CTSpinoPelvic1K_review.docx
+++ b/paper/mpda/CTSpinoPelvic1K_review.docx
@@ -41,28 +41,22 @@
         <w:t xml:space="preserve"> </w:t>
       </w:r>
       <w:r>
-        <w:t xml:space="preserve">Lumbar levels cannot be numbered reliably when a lumbosacral transitional</w:t>
-      </w:r>
-      <w:r>
-        <w:t xml:space="preserve"> </w:t>
-      </w:r>
-      <w:r>
-        <w:t xml:space="preserve">vertebra (LSTV) is present. Counting down from C2, the reference standard for</w:t>
-      </w:r>
-      <w:r>
-        <w:t xml:space="preserve"> </w:t>
-      </w:r>
-      <w:r>
-        <w:t xml:space="preserve">numeration </w:t>
-      </w:r>
-      <w:r>
-        <w:t xml:space="preserve">, is impossible in an abdominal field of view, which leaves a</w:t>
-      </w:r>
-      <w:r>
-        <w:t xml:space="preserve"> </w:t>
-      </w:r>
-      <w:r>
-        <w:t xml:space="preserve">specific ambiguity: four rib-free lumbar</w:t>
+        <w:t xml:space="preserve">A lumbar vertebra is named by counting down from C2, the reference standard</w:t>
+      </w:r>
+      <w:r>
+        <w:t xml:space="preserve"> </w:t>
+      </w:r>
+      <w:r>
+        <w:t xml:space="preserve">for numeration </w:t>
+      </w:r>
+      <w:r>
+        <w:t xml:space="preserve">. Abdominal CT does not contain C2, and where a lumbosacral</w:t>
+      </w:r>
+      <w:r>
+        <w:t xml:space="preserve"> </w:t>
+      </w:r>
+      <w:r>
+        <w:t xml:space="preserve">transitional vertebra (LSTV) alters the count the local anatomy is ambiguous: four rib-free lumbar</w:t>
       </w:r>
       <w:r>
         <w:t xml:space="preserve"> </w:t>

</xml_diff>

<commit_message>
The six-vertebra ambiguity has a third reading, a lumbarized S1; the dataset enables the question rather than tests it
Co-Authored-By: Claude Fable 5.1 <noreply@anthropic.com>
</commit_message>
<xml_diff>
--- a/paper/mpda/CTSpinoPelvic1K_review.docx
+++ b/paper/mpda/CTSpinoPelvic1K_review.docx
@@ -68,22 +68,22 @@
         <w:t xml:space="preserve"> </w:t>
       </w:r>
       <w:r>
-        <w:t xml:space="preserve">may mean a true sixth lumbar vertebra or a T12 whose ribs are</w:t>
-      </w:r>
-      <w:r>
-        <w:t xml:space="preserve"> </w:t>
-      </w:r>
-      <w:r>
-        <w:t xml:space="preserve">aplastic </w:t>
-      </w:r>
-      <w:r>
-        <w:t xml:space="preserve">. CTSpinoPelvic1K is built to test whether local morphology</w:t>
-      </w:r>
-      <w:r>
-        <w:t xml:space="preserve"> </w:t>
-      </w:r>
-      <w:r>
-        <w:t xml:space="preserve">can resolve them without counting from the C2 anchor. It provides 802 CT records anchoring each lumbar level on</w:t>
+        <w:t xml:space="preserve">may mean a true sixth lumbar vertebra, a T12 whose ribs are aplastic, or an S1 lumbarized</w:t>
+      </w:r>
+      <w:r>
+        <w:t xml:space="preserve"> </w:t>
+      </w:r>
+      <w:r>
+        <w:t xml:space="preserve">away from the sacrum </w:t>
+      </w:r>
+      <w:r>
+        <w:t xml:space="preserve">. CTSpinoPelvic1K is built so that this can be</w:t>
+      </w:r>
+      <w:r>
+        <w:t xml:space="preserve"> </w:t>
+      </w:r>
+      <w:r>
+        <w:t xml:space="preserve">asked of the data: whether local morphology resolves them without counting from C2. It provides 802 CT records anchoring each lumbar level on</w:t>
       </w:r>
       <w:r>
         <w:t xml:space="preserve"> </w:t>
@@ -413,19 +413,19 @@
         <w:t xml:space="preserve"> </w:t>
       </w:r>
       <w:r>
-        <w:t xml:space="preserve">vertebra or a T12 whose ribs are aplastic. Each pair yields the same count, and the</w:t>
-      </w:r>
-      <w:r>
-        <w:t xml:space="preserve"> </w:t>
-      </w:r>
-      <w:r>
-        <w:t xml:space="preserve">morphology that would separate the two readings is not decisive to a human reader in every</w:t>
-      </w:r>
-      <w:r>
-        <w:t xml:space="preserve"> </w:t>
-      </w:r>
-      <w:r>
-        <w:t xml:space="preserve">case. Whether it nonetheless differs enough for a learned classifier to separate them, or at</w:t>
+        <w:t xml:space="preserve">vertebra, a T12 whose ribs are aplastic, or an S1 lumbarized away from the sacrum. Each</w:t>
+      </w:r>
+      <w:r>
+        <w:t xml:space="preserve"> </w:t>
+      </w:r>
+      <w:r>
+        <w:t xml:space="preserve">set yields the same count, and the morphology that would separate the readings is not</w:t>
+      </w:r>
+      <w:r>
+        <w:t xml:space="preserve"> </w:t>
+      </w:r>
+      <w:r>
+        <w:t xml:space="preserve">decisive to a human reader in every case. Whether it nonetheless differs enough for a learned classifier to separate them, or at</w:t>
       </w:r>
       <w:r>
         <w:t xml:space="preserve"> </w:t>
@@ -800,13 +800,19 @@
         <w:t xml:space="preserve"> </w:t>
       </w:r>
       <w:r>
-        <w:t xml:space="preserve">leave four rib-free vertebrae above the sacrum, and a true sixth lumbar vertebra and a T12</w:t>
-      </w:r>
-      <w:r>
-        <w:t xml:space="preserve"> </w:t>
-      </w:r>
-      <w:r>
-        <w:t xml:space="preserve">with aplastic ribs both leave six. The count alone cannot separate the readings.</w:t>
+        <w:t xml:space="preserve">leave four rib-free vertebrae above the sacrum, and a true sixth lumbar vertebra, a T12</w:t>
+      </w:r>
+      <w:r>
+        <w:t xml:space="preserve"> </w:t>
+      </w:r>
+      <w:r>
+        <w:t xml:space="preserve">with aplastic ribs and a lumbarized S1 all leave six. The count alone cannot separate the</w:t>
+      </w:r>
+      <w:r>
+        <w:t xml:space="preserve"> </w:t>
+      </w:r>
+      <w:r>
+        <w:t xml:space="preserve">readings.</w:t>
       </w:r>
     </w:p>
     <w:p>

</xml_diff>

<commit_message>
no em dashes: each rewritten as a comma, colon, period or parenthesis
Co-Authored-By: Claude Fable 5.1 <noreply@anthropic.com>
</commit_message>
<xml_diff>
--- a/paper/mpda/CTSpinoPelvic1K_review.docx
+++ b/paper/mpda/CTSpinoPelvic1K_review.docx
@@ -68,13 +68,13 @@
         <w:t xml:space="preserve"> </w:t>
       </w:r>
       <w:r>
-        <w:t xml:space="preserve">may mean a true sixth lumbar vertebra, a T12 whose ribs are aplastic, or an S1 lumbarized</w:t>
-      </w:r>
-      <w:r>
-        <w:t xml:space="preserve"> </w:t>
-      </w:r>
-      <w:r>
-        <w:t xml:space="preserve">away from the sacrum </w:t>
+        <w:t xml:space="preserve">may mean a sixth lumbar vertebra, a T12 whose ribs are aplastic, or an S1 lumbarized from</w:t>
+      </w:r>
+      <w:r>
+        <w:t xml:space="preserve"> </w:t>
+      </w:r>
+      <w:r>
+        <w:t xml:space="preserve">the sacrum </w:t>
       </w:r>
       <w:r>
         <w:t xml:space="preserve">. CTSpinoPelvic1K is built so that this can be</w:t>
@@ -294,13 +294,13 @@
         <w:t xml:space="preserve"> </w:t>
       </w:r>
       <w:r>
-        <w:t xml:space="preserve">two ends of the lumbar column — the thoracolumbar transitional vertebra (TLTV) above, the</w:t>
-      </w:r>
-      <w:r>
-        <w:t xml:space="preserve"> </w:t>
-      </w:r>
-      <w:r>
-        <w:t xml:space="preserve">lumbosacral transitional vertebra (LSTV) below — and they disturb identification in two</w:t>
+        <w:t xml:space="preserve">two ends of the lumbar column, the thoracolumbar transitional vertebra (TLTV) above and the</w:t>
+      </w:r>
+      <w:r>
+        <w:t xml:space="preserve"> </w:t>
+      </w:r>
+      <w:r>
+        <w:t xml:space="preserve">lumbosacral transitional vertebra (LSTV) below, and they disturb identification in two</w:t>
       </w:r>
       <w:r>
         <w:t xml:space="preserve"> </w:t>
@@ -368,7 +368,7 @@
         <w:t xml:space="preserve"> </w:t>
       </w:r>
       <w:r>
-        <w:t xml:space="preserve">vertebrae each region contains — eleven or thirteen</w:t>
+        <w:t xml:space="preserve">vertebrae each region contains: eleven or thirteen</w:t>
       </w:r>
       <w:r>
         <w:t xml:space="preserve"> </w:t>
@@ -437,7 +437,7 @@
         <w:t xml:space="preserve"> </w:t>
       </w:r>
       <w:r>
-        <w:t xml:space="preserve">support. Absent that, what remains is the sequence — conventionally established by</w:t>
+        <w:t xml:space="preserve">support. Absent that, what remains is the sequence, conventionally established by</w:t>
       </w:r>
       <w:r>
         <w:t xml:space="preserve"> </w:t>
@@ -716,13 +716,13 @@
         <w:t xml:space="preserve"> </w:t>
       </w:r>
       <w:r>
-        <w:t xml:space="preserve">— a hypoplastic twelfth rib, one of the cardinal</w:t>
-      </w:r>
-      <w:r>
-        <w:t xml:space="preserve"> </w:t>
-      </w:r>
-      <w:r>
-        <w:t xml:space="preserve">indicators of a thoracolumbar transitional vertebra — produce overlapping appearances.</w:t>
+        <w:t xml:space="preserve">(a hypoplastic twelfth rib, one of the cardinal</w:t>
+      </w:r>
+      <w:r>
+        <w:t xml:space="preserve"> </w:t>
+      </w:r>
+      <w:r>
+        <w:t xml:space="preserve">indicators of a thoracolumbar transitional vertebra) produce overlapping appearances.</w:t>
       </w:r>
     </w:p>
     <w:p>
@@ -752,7 +752,7 @@
         <w:t xml:space="preserve"> </w:t>
       </w:r>
       <w:r>
-        <w:t xml:space="preserve">every abdominal scan — the sacrum below and the lowest rib-bearing vertebra above — so</w:t>
+        <w:t xml:space="preserve">every abdominal scan, the sacrum below and the lowest rib-bearing vertebra above, so</w:t>
       </w:r>
       <w:r>
         <w:t xml:space="preserve"> </w:t>
@@ -1847,7 +1847,7 @@
         <w:t xml:space="preserve"> </w:t>
       </w:r>
       <w:r>
-        <w:t xml:space="preserve">identifier above that range — S1 carved from the sacrum (29), hips (30–31), femora</w:t>
+        <w:t xml:space="preserve">identifier above that range: S1 carved from the sacrum (29), hips (30–31), femora</w:t>
       </w:r>
       <w:r>
         <w:t xml:space="preserve"> </w:t>
@@ -1915,7 +1915,7 @@
         <w:t xml:space="preserve"> </w:t>
       </w:r>
       <w:r>
-        <w:t xml:space="preserve">by what it supports rather than by being an endpoint — S1 supplies the sacral endplate</w:t>
+        <w:t xml:space="preserve">by what it supports rather than by being an endpoint. S1 supplies the sacral endplate</w:t>
       </w:r>
       <w:r>
         <w:t xml:space="preserve"> </w:t>
@@ -2146,13 +2146,13 @@
         <w:t xml:space="preserve"> </w:t>
       </w:r>
       <w:r>
-        <w:t xml:space="preserve">either call it rib 12 — asserting the vertebra beneath it is thoracic, the very question at</w:t>
-      </w:r>
-      <w:r>
-        <w:t xml:space="preserve"> </w:t>
-      </w:r>
-      <w:r>
-        <w:t xml:space="preserve">issue — or discard it. TotalSegmentator carries ribs 1–12 per side and no such class, and</w:t>
+        <w:t xml:space="preserve">either call it rib 12, asserting the vertebra beneath it is thoracic, the very question at</w:t>
+      </w:r>
+      <w:r>
+        <w:t xml:space="preserve"> </w:t>
+      </w:r>
+      <w:r>
+        <w:t xml:space="preserve">issue, or discard it. TotalSegmentator carries ribs 1–12 per side and no such class, and</w:t>
       </w:r>
       <w:r>
         <w:t xml:space="preserve"> </w:t>
@@ -2287,7 +2287,7 @@
         <w:t xml:space="preserve"> </w:t>
       </w:r>
       <w:r>
-        <w:t xml:space="preserve">release contains and not as a finding — sixteen records cannot support a statement about</w:t>
+        <w:t xml:space="preserve">release contains and not as a finding: sixteen records cannot support a statement about</w:t>
       </w:r>
       <w:r>
         <w:t xml:space="preserve"> </w:t>
@@ -2611,13 +2611,13 @@
         <w:t xml:space="preserve"> </w:t>
       </w:r>
       <w:r>
-        <w:t xml:space="preserve">for manuscript preparation — drafting and editing of text, and generation of analysis and</w:t>
-      </w:r>
-      <w:r>
-        <w:t xml:space="preserve"> </w:t>
-      </w:r>
-      <w:r>
-        <w:t xml:space="preserve">figure code — under author review. It was not used to generate, annotate or interpret any</w:t>
+        <w:t xml:space="preserve">for manuscript preparation (drafting and editing of text, and generation of analysis and</w:t>
+      </w:r>
+      <w:r>
+        <w:t xml:space="preserve"> </w:t>
+      </w:r>
+      <w:r>
+        <w:t xml:space="preserve">figure code) under author review. It was not used to generate, annotate or interpret any</w:t>
       </w:r>
       <w:r>
         <w:t xml:space="preserve"> </w:t>
@@ -2851,7 +2851,7 @@
         <w:t xml:space="preserve"> </w:t>
       </w:r>
       <w:r>
-        <w:t xml:space="preserve">examined — and because more than half the ribs in a screening abdominal CT being</w:t>
+        <w:t xml:space="preserve">examined, and because more than half the ribs in a screening abdominal CT being</w:t>
       </w:r>
       <w:r>
         <w:t xml:space="preserve"> </w:t>
@@ -2942,7 +2942,7 @@
         <w:t xml:space="preserve"> </w:t>
       </w:r>
       <w:r>
-        <w:t xml:space="preserve">are assigned to a lumbar vertebra — not because no lumbar ribs exist,</w:t>
+        <w:t xml:space="preserve">are assigned to a lumbar vertebra, not because no lumbar ribs exist,</w:t>
       </w:r>
       <w:r>
         <w:t xml:space="preserve"> </w:t>
@@ -3138,7 +3138,7 @@
         <w:t xml:space="preserve"> </w:t>
       </w:r>
       <w:r>
-        <w:t xml:space="preserve">the classification turns on — bony fusion against articulation without</w:t>
+        <w:t xml:space="preserve">the classification turns on, bony fusion against articulation without</w:t>
       </w:r>
       <w:r>
         <w:t xml:space="preserve"> </w:t>
@@ -3147,10 +3147,7 @@
         <w:t xml:space="preserve">it </w:t>
       </w:r>
       <w:r>
-        <w:t xml:space="preserve"> </w:t>
-      </w:r>
-      <w:r>
-        <w:t xml:space="preserve">— is the one carrying clinical weight, and it is where the</w:t>
+        <w:t xml:space="preserve">, is the one carrying clinical weight, and it is where the</w:t>
       </w:r>
       <w:r>
         <w:t xml:space="preserve"> </w:t>
@@ -4983,7 +4980,7 @@
         <w:t xml:space="preserve"> </w:t>
       </w:r>
       <w:r>
-        <w:t xml:space="preserve">does not vary with age, while pelvic tilt increases — the descriptive signature of a</w:t>
+        <w:t xml:space="preserve">does not vary with age, while pelvic tilt increases, the descriptive signature of a</w:t>
       </w:r>
       <w:r>
         <w:t xml:space="preserve"> </w:t>
@@ -5145,7 +5142,7 @@
         <w:t xml:space="preserve"> </w:t>
       </w:r>
       <w:r>
-        <w:t xml:space="preserve">morphology measurable against the lumbar column rather than in isolation — the sacral</w:t>
+        <w:t xml:space="preserve">morphology measurable against the lumbar column rather than in isolation: the sacral</w:t>
       </w:r>
       <w:r>
         <w:t xml:space="preserve"> </w:t>
@@ -5418,13 +5415,13 @@
         <w:t xml:space="preserve"> </w:t>
       </w:r>
       <w:r>
-        <w:t xml:space="preserve">classical figures — body height crosses over, dorsal exceeding ventral at T11–T12 and</w:t>
-      </w:r>
-      <w:r>
-        <w:t xml:space="preserve"> </w:t>
-      </w:r>
-      <w:r>
-        <w:t xml:space="preserve">reversing by L4–L5, and pedicle width widens steeply into the lower lumbar spine — and</w:t>
+        <w:t xml:space="preserve">classical figures (body height crosses over, dorsal exceeding ventral at T11–T12 and</w:t>
+      </w:r>
+      <w:r>
+        <w:t xml:space="preserve"> </w:t>
+      </w:r>
+      <w:r>
+        <w:t xml:space="preserve">reversing by L4–L5, and pedicle width widens steeply into the lower lumbar spine) and</w:t>
       </w:r>
       <w:r>
         <w:t xml:space="preserve"> </w:t>
@@ -5658,7 +5655,7 @@
         <w:t xml:space="preserve"> </w:t>
       </w:r>
       <w:r>
-        <w:t xml:space="preserve">declared in the scheme and occurs in no record — established by counting identifiers</w:t>
+        <w:t xml:space="preserve">declared in the scheme and occurs in no record, established by counting identifiers</w:t>
       </w:r>
       <w:r>
         <w:t xml:space="preserve"> </w:t>
@@ -5755,13 +5752,13 @@
         <w:t xml:space="preserve"> </w:t>
       </w:r>
       <w:r>
-        <w:t xml:space="preserve">uniformly adjudicated — which is precisely why the measures reported here are count-free</w:t>
-      </w:r>
-      <w:r>
-        <w:t xml:space="preserve"> </w:t>
-      </w:r>
-      <w:r>
-        <w:t xml:space="preserve">— and the Castellvi grades are a consensus of two radiology resident physicians.</w:t>
+        <w:t xml:space="preserve">uniformly adjudicated, which is precisely why the measures reported here are count-free,</w:t>
+      </w:r>
+      <w:r>
+        <w:t xml:space="preserve"> </w:t>
+      </w:r>
+      <w:r>
+        <w:t xml:space="preserve">and the Castellvi grades are a consensus of two radiology resident physicians.</w:t>
       </w:r>
       <w:r>
         <w:t xml:space="preserve"> </w:t>
@@ -5815,7 +5812,7 @@
         <w:t xml:space="preserve"> </w:t>
       </w:r>
       <w:r>
-        <w:t xml:space="preserve">carries no S1, one lacks T12, and nine lack an L5 identifier — in every case because the</w:t>
+        <w:t xml:space="preserve">carries no S1, one lacks T12, and nine lack an L5 identifier, in every case because the</w:t>
       </w:r>
       <w:r>
         <w:t xml:space="preserve"> </w:t>

</xml_diff>

<commit_message>
preprint and review copies rebuilt from the current source
Co-Authored-By: Claude Fable 5.1 <noreply@anthropic.com>
</commit_message>
<xml_diff>
--- a/paper/mpda/CTSpinoPelvic1K_review.docx
+++ b/paper/mpda/CTSpinoPelvic1K_review.docx
@@ -331,73 +331,99 @@
         <w:t xml:space="preserve"> </w:t>
       </w:r>
       <w:r>
-        <w:t xml:space="preserve">a lumbosacral one may be partly or completely assimilated to the sacrum, with an anteriorly</w:t>
-      </w:r>
-      <w:r>
-        <w:t xml:space="preserve"> </w:t>
-      </w:r>
-      <w:r>
-        <w:t xml:space="preserve">wedged body, a reduced disc beneath it and hypoplastic facet joints, or conversely separated</w:t>
-      </w:r>
-      <w:r>
-        <w:t xml:space="preserve"> </w:t>
-      </w:r>
-      <w:r>
-        <w:t xml:space="preserve">from it with a squared body, lumbar-type facets and a full-height disc </w:t>
-      </w:r>
-      <w:r>
-        <w:t xml:space="preserve">.</w:t>
-      </w:r>
-      <w:r>
-        <w:t xml:space="preserve"> </w:t>
-      </w:r>
-      <w:r>
-        <w:t xml:space="preserve">They also change</w:t>
-      </w:r>
-      <w:r>
-        <w:t xml:space="preserve"> </w:t>
+        <w:t xml:space="preserve">a lumbosacral one may be partly or completely assimilated to the sacrum</w:t>
+      </w:r>
+      <w:r>
+        <w:t xml:space="preserve"> </w:t>
+      </w:r>
+      <w:r>
+        <w:t xml:space="preserve">(</w:t>
       </w:r>
       <w:r>
         <w:rPr>
           <w:i/>
           <w:iCs/>
         </w:rPr>
-        <w:t xml:space="preserve">how many</w:t>
-      </w:r>
-      <w:r>
-        <w:t xml:space="preserve"> </w:t>
-      </w:r>
-      <w:r>
-        <w:t xml:space="preserve">vertebrae each region contains: eleven or thirteen</w:t>
-      </w:r>
-      <w:r>
-        <w:t xml:space="preserve"> </w:t>
-      </w:r>
-      <w:r>
-        <w:t xml:space="preserve">thoracic, four or six lumbar.</w:t>
-      </w:r>
-    </w:p>
-    <w:p>
-      <w:pPr>
-        <w:pStyle w:val="BodyText"/>
-      </w:pPr>
-      <w:r>
-        <w:t xml:space="preserve">Either change alone would be tractable. Together they make it difficult to state definitively</w:t>
-      </w:r>
-      <w:r>
-        <w:t xml:space="preserve"> </w:t>
-      </w:r>
-      <w:r>
-        <w:t xml:space="preserve">what any vertebra at these borders</w:t>
-      </w:r>
-      <w:r>
-        <w:t xml:space="preserve"> </w:t>
+        <w:t xml:space="preserve">sacralization</w:t>
+      </w:r>
+      <w:r>
+        <w:t xml:space="preserve">), with an anteriorly wedged body, a reduced disc beneath it and</w:t>
+      </w:r>
+      <w:r>
+        <w:t xml:space="preserve"> </w:t>
+      </w:r>
+      <w:r>
+        <w:t xml:space="preserve">hypoplastic facet joints, or conversely separated from it (</w:t>
       </w:r>
       <w:r>
         <w:rPr>
           <w:i/>
           <w:iCs/>
         </w:rPr>
+        <w:t xml:space="preserve">lumbarization</w:t>
+      </w:r>
+      <w:r>
+        <w:t xml:space="preserve">), with a</w:t>
+      </w:r>
+      <w:r>
+        <w:t xml:space="preserve"> </w:t>
+      </w:r>
+      <w:r>
+        <w:t xml:space="preserve">squared body, lumbar-type facets and a full-height disc </w:t>
+      </w:r>
+      <w:r>
+        <w:t xml:space="preserve">. They also</w:t>
+      </w:r>
+      <w:r>
+        <w:t xml:space="preserve"> </w:t>
+      </w:r>
+      <w:r>
+        <w:t xml:space="preserve">change</w:t>
+      </w:r>
+      <w:r>
+        <w:t xml:space="preserve"> </w:t>
+      </w:r>
+      <w:r>
+        <w:rPr>
+          <w:i/>
+          <w:iCs/>
+        </w:rPr>
+        <w:t xml:space="preserve">how many</w:t>
+      </w:r>
+      <w:r>
+        <w:t xml:space="preserve"> </w:t>
+      </w:r>
+      <w:r>
+        <w:t xml:space="preserve">vertebrae each region contains: eleven or thirteen thoracic, four or</w:t>
+      </w:r>
+      <w:r>
+        <w:t xml:space="preserve"> </w:t>
+      </w:r>
+      <w:r>
+        <w:t xml:space="preserve">six lumbar.</w:t>
+      </w:r>
+    </w:p>
+    <w:p>
+      <w:pPr>
+        <w:pStyle w:val="BodyText"/>
+      </w:pPr>
+      <w:r>
+        <w:t xml:space="preserve">Either change alone would be tractable. Together they make it difficult to state definitively</w:t>
+      </w:r>
+      <w:r>
+        <w:t xml:space="preserve"> </w:t>
+      </w:r>
+      <w:r>
+        <w:t xml:space="preserve">what any vertebra at these borders</w:t>
+      </w:r>
+      <w:r>
+        <w:t xml:space="preserve"> </w:t>
+      </w:r>
+      <w:r>
+        <w:rPr>
+          <w:i/>
+          <w:iCs/>
+        </w:rPr>
         <w:t xml:space="preserve">is</w:t>
       </w:r>
       <w:r>
@@ -425,7 +451,7 @@
         <w:t xml:space="preserve"> </w:t>
       </w:r>
       <w:r>
-        <w:t xml:space="preserve">decisive to a human reader in every case. Whether it nonetheless differs enough for a learned classifier to separate them, or at</w:t>
+        <w:t xml:space="preserve">decisive to a human reader in every case. Whether it differs enough for a learned classifier to separate them, or at</w:t>
       </w:r>
       <w:r>
         <w:t xml:space="preserve"> </w:t>
@@ -507,19 +533,40 @@
         <w:t xml:space="preserve"> </w:t>
       </w:r>
       <w:r>
-        <w:t xml:space="preserve">in any of them, however good the segmentation. VerSe </w:t>
-      </w:r>
-      <w:r>
-        <w:t xml:space="preserve"> </w:t>
-      </w:r>
-      <w:r>
-        <w:t xml:space="preserve">makes the</w:t>
-      </w:r>
-      <w:r>
-        <w:t xml:space="preserve"> </w:t>
-      </w:r>
-      <w:r>
-        <w:t xml:space="preserve">point most clearly (Table </w:t>
+        <w:t xml:space="preserve">in any of them, however good the segmentation, and a segmenter trained on them inherits the</w:t>
+      </w:r>
+      <w:r>
+        <w:t xml:space="preserve"> </w:t>
+      </w:r>
+      <w:r>
+        <w:t xml:space="preserve">gap: faced with an enumeration anomaly it must shift the whole column by a level or absorb a</w:t>
+      </w:r>
+      <w:r>
+        <w:t xml:space="preserve"> </w:t>
+      </w:r>
+      <w:r>
+        <w:t xml:space="preserve">vertebra into its neighbor. The size of that problem has now been measured on CT, where</w:t>
+      </w:r>
+      <w:r>
+        <w:t xml:space="preserve"> </w:t>
+      </w:r>
+      <w:r>
+        <w:t xml:space="preserve">prior labeling methods assigned every vertebra correctly in 77% of subjects and an</w:t>
+      </w:r>
+      <w:r>
+        <w:t xml:space="preserve"> </w:t>
+      </w:r>
+      <w:r>
+        <w:t xml:space="preserve">anomaly-aware method raised that to 99% </w:t>
+      </w:r>
+      <w:r>
+        <w:t xml:space="preserve">. VerSe </w:t>
+      </w:r>
+      <w:r>
+        <w:t xml:space="preserve"> </w:t>
+      </w:r>
+      <w:r>
+        <w:t xml:space="preserve">makes the point most clearly (Table </w:t>
       </w:r>
       <w:hyperlink w:anchor="tab:priorart">
         <w:r>
@@ -530,19 +577,19 @@
         </w:r>
       </w:hyperlink>
       <w:r>
-        <w:t xml:space="preserve">): it deliberately enriched for anatomical</w:t>
-      </w:r>
-      <w:r>
-        <w:t xml:space="preserve"> </w:t>
-      </w:r>
-      <w:r>
-        <w:t xml:space="preserve">variants and graded them by Castellvi, yet left the graded vertebrae fused to the sacrum</w:t>
-      </w:r>
-      <w:r>
-        <w:t xml:space="preserve"> </w:t>
-      </w:r>
-      <w:r>
-        <w:t xml:space="preserve">unsegmented.</w:t>
+        <w:t xml:space="preserve">): it deliberately enriched for</w:t>
+      </w:r>
+      <w:r>
+        <w:t xml:space="preserve"> </w:t>
+      </w:r>
+      <w:r>
+        <w:t xml:space="preserve">anatomical variants and graded them by Castellvi, yet left the graded vertebrae fused to the</w:t>
+      </w:r>
+      <w:r>
+        <w:t xml:space="preserve"> </w:t>
+      </w:r>
+      <w:r>
+        <w:t xml:space="preserve">sacrum unsegmented.</w:t>
       </w:r>
     </w:p>
     <w:p>
@@ -550,6 +597,62 @@
         <w:pStyle w:val="BodyText"/>
       </w:pPr>
       <w:r>
+        <w:t xml:space="preserve">The intraoperative side of the problem has prior art of its own. LevelCheck registers the</w:t>
+      </w:r>
+      <w:r>
+        <w:t xml:space="preserve"> </w:t>
+      </w:r>
+      <w:r>
+        <w:t xml:space="preserve">intraoperative radiograph to the preoperative CT and projects the CT’s vertebral labels onto</w:t>
+      </w:r>
+      <w:r>
+        <w:t xml:space="preserve"> </w:t>
+      </w:r>
+      <w:r>
+        <w:t xml:space="preserve">it, localizing the target level in a limited field of view to within a few percent of cases</w:t>
+      </w:r>
+      <w:r>
+        <w:t xml:space="preserve"> </w:t>
+      </w:r>
+      <w:r>
+        <w:t xml:space="preserve">in clinical use </w:t>
+      </w:r>
+      <w:r>
+        <w:t xml:space="preserve">. The labels it projects are placed by</w:t>
+      </w:r>
+      <w:r>
+        <w:t xml:space="preserve"> </w:t>
+      </w:r>
+      <w:r>
+        <w:t xml:space="preserve">hand on the CT, by a skilled operator and verified by the surgeon </w:t>
+      </w:r>
+      <w:r>
+        <w:t xml:space="preserve">: the</w:t>
+      </w:r>
+      <w:r>
+        <w:t xml:space="preserve"> </w:t>
+      </w:r>
+      <w:r>
+        <w:t xml:space="preserve">method assumes a correctly labeled CT and does not supply one. Automating that step, and</w:t>
+      </w:r>
+      <w:r>
+        <w:t xml:space="preserve"> </w:t>
+      </w:r>
+      <w:r>
+        <w:t xml:space="preserve">getting it right precisely where the anatomy is anomalous, is what a dataset carrying the</w:t>
+      </w:r>
+      <w:r>
+        <w:t xml:space="preserve"> </w:t>
+      </w:r>
+      <w:r>
+        <w:t xml:space="preserve">classes those anomalies produce is for.</w:t>
+      </w:r>
+    </w:p>
+    <w:p>
+      <w:pPr>
+        <w:pStyle w:val="BodyText"/>
+      </w:pPr>
+      <w:r>
         <w:t xml:space="preserve">CTSpinoPelvic1K places the spine, pelvis, ribs and femora in one coordinate frame and gives</w:t>
       </w:r>
       <w:r>
@@ -562,13 +665,13 @@
         <w:t xml:space="preserve"> </w:t>
       </w:r>
       <w:r>
-        <w:t xml:space="preserve">rib borne by a lumbar vertebra. A scheme without those classes must record such anatomy as</w:t>
-      </w:r>
-      <w:r>
-        <w:t xml:space="preserve"> </w:t>
-      </w:r>
-      <w:r>
-        <w:t xml:space="preserve">something it is not.</w:t>
+        <w:t xml:space="preserve">rib borne by a lumbar vertebra. A scheme without those classes lacks a class vocabulary</w:t>
+      </w:r>
+      <w:r>
+        <w:t xml:space="preserve"> </w:t>
+      </w:r>
+      <w:r>
+        <w:t xml:space="preserve">expressive enough to describe anatomic anomalies.</w:t>
       </w:r>
     </w:p>
     <w:p>
@@ -660,25 +763,19 @@
         <w:t xml:space="preserve"> </w:t>
       </w:r>
       <w:r>
-        <w:t xml:space="preserve">No scan in this corpus contains C2 or the whole</w:t>
-      </w:r>
-      <w:r>
-        <w:t xml:space="preserve"> </w:t>
-      </w:r>
-      <w:r>
-        <w:t xml:space="preserve">cervical spine, so the conventional count cannot be performed. That is a property of</w:t>
-      </w:r>
-      <w:r>
-        <w:t xml:space="preserve"> </w:t>
-      </w:r>
-      <w:r>
-        <w:t xml:space="preserve">abdominal imaging rather than of the annotation, and it means a variant at the thoracolumbar</w:t>
-      </w:r>
-      <w:r>
-        <w:t xml:space="preserve"> </w:t>
-      </w:r>
-      <w:r>
-        <w:t xml:space="preserve">junction cannot be</w:t>
+        <w:t xml:space="preserve">No scan in this corpus contains C2, so the</w:t>
+      </w:r>
+      <w:r>
+        <w:t xml:space="preserve"> </w:t>
+      </w:r>
+      <w:r>
+        <w:t xml:space="preserve">conventional count cannot be performed: a property of abdominal imaging, not of the</w:t>
+      </w:r>
+      <w:r>
+        <w:t xml:space="preserve"> </w:t>
+      </w:r>
+      <w:r>
+        <w:t xml:space="preserve">annotation. A thirteenth thoracic vertebra, a lumbar rib and a</w:t>
       </w:r>
       <w:r>
         <w:t xml:space="preserve"> </w:t>
@@ -688,41 +785,109 @@
           <w:i/>
           <w:iCs/>
         </w:rPr>
-        <w:t xml:space="preserve">resolved by counting</w:t>
-      </w:r>
-      <w:r>
-        <w:t xml:space="preserve"> </w:t>
-      </w:r>
-      <w:r>
-        <w:t xml:space="preserve">here at all: a thirteenth thoracic vertebra, a</w:t>
-      </w:r>
-      <w:r>
-        <w:t xml:space="preserve"> </w:t>
-      </w:r>
-      <w:r>
-        <w:t xml:space="preserve">lumbar rib, and a</w:t>
-      </w:r>
-      <w:r>
-        <w:t xml:space="preserve"> </w:t>
-      </w:r>
+        <w:t xml:space="preserve">stump rib</w:t>
+      </w:r>
+      <w:r>
+        <w:t xml:space="preserve"> </w:t>
+      </w:r>
+      <w:r>
+        <w:t xml:space="preserve">(a</w:t>
+      </w:r>
+      <w:r>
+        <w:t xml:space="preserve"> </w:t>
+      </w:r>
+      <w:r>
+        <w:t xml:space="preserve">hypoplastic twelfth rib, a cardinal indicator of a thoracolumbar transitional vertebra)</w:t>
+      </w:r>
+      <w:r>
+        <w:t xml:space="preserve"> </w:t>
+      </w:r>
+      <w:r>
+        <w:t xml:space="preserve">leave the same number of rib-free vertebrae between the two borders of the lumbar spine, the</w:t>
+      </w:r>
+      <w:r>
+        <w:t xml:space="preserve"> </w:t>
+      </w:r>
+      <w:r>
+        <w:t xml:space="preserve">last rib-bearing vertebra and the sacrum.</w:t>
+      </w:r>
+    </w:p>
+    <w:p>
+      <w:pPr>
+        <w:pStyle w:val="BodyText"/>
+      </w:pPr>
       <w:r>
         <w:rPr>
           <w:i/>
           <w:iCs/>
         </w:rPr>
-        <w:t xml:space="preserve">stump rib</w:t>
-      </w:r>
-      <w:r>
-        <w:t xml:space="preserve"> </w:t>
-      </w:r>
-      <w:r>
-        <w:t xml:space="preserve">(a hypoplastic twelfth rib, one of the cardinal</w:t>
-      </w:r>
-      <w:r>
-        <w:t xml:space="preserve"> </w:t>
-      </w:r>
-      <w:r>
-        <w:t xml:space="preserve">indicators of a thoracolumbar transitional vertebra) produce overlapping appearances.</w:t>
+        <w:t xml:space="preserve">What the release does in addition.</w:t>
+      </w:r>
+      <w:r>
+        <w:t xml:space="preserve"> </w:t>
+      </w:r>
+      <w:r>
+        <w:t xml:space="preserve">Every vertebra carries the identifier its</w:t>
+      </w:r>
+      <w:r>
+        <w:t xml:space="preserve"> </w:t>
+      </w:r>
+      <w:r>
+        <w:t xml:space="preserve">radiologist-sourced annotation assigned, corrected where the source was wrong; those labels</w:t>
+      </w:r>
+      <w:r>
+        <w:t xml:space="preserve"> </w:t>
+      </w:r>
+      <w:r>
+        <w:t xml:space="preserve">are the ground truth. Alongside them, every released measurement is also expressed against</w:t>
+      </w:r>
+      <w:r>
+        <w:t xml:space="preserve"> </w:t>
+      </w:r>
+      <w:r>
+        <w:t xml:space="preserve">the two landmarks present in essentially every abdominal scan, the sacrum below and the</w:t>
+      </w:r>
+      <w:r>
+        <w:t xml:space="preserve"> </w:t>
+      </w:r>
+      <w:r>
+        <w:t xml:space="preserve">lowest rib-bearing vertebra above, so that the measurement is positional rather than</w:t>
+      </w:r>
+      <w:r>
+        <w:t xml:space="preserve"> </w:t>
+      </w:r>
+      <w:r>
+        <w:t xml:space="preserve">nominal: a vertebra by how many rib-free vertebrae</w:t>
+      </w:r>
+      <w:r>
+        <w:t xml:space="preserve"> </w:t>
+      </w:r>
+      <w:r>
+        <w:t xml:space="preserve">separate it from the sacrum, a lowest rib by its length as a fraction of the rib above it, a</w:t>
+      </w:r>
+      <w:r>
+        <w:t xml:space="preserve"> </w:t>
+      </w:r>
+      <w:r>
+        <w:t xml:space="preserve">transverse process by its span and its distance from the ala. None of these changes according</w:t>
+      </w:r>
+      <w:r>
+        <w:t xml:space="preserve"> </w:t>
+      </w:r>
+      <w:r>
+        <w:t xml:space="preserve">to whether a reader would have said L5 or S1, so cases that disagree about the name remain</w:t>
+      </w:r>
+      <w:r>
+        <w:t xml:space="preserve"> </w:t>
+      </w:r>
+      <w:r>
+        <w:t xml:space="preserve">comparable, and where the junction is in view the count is determined and the two</w:t>
+      </w:r>
+      <w:r>
+        <w:t xml:space="preserve"> </w:t>
+      </w:r>
+      <w:r>
+        <w:t xml:space="preserve">descriptions agree.</w:t>
       </w:r>
     </w:p>
     <w:p>
@@ -734,96 +899,6 @@
           <w:i/>
           <w:iCs/>
         </w:rPr>
-        <w:t xml:space="preserve">What the release does instead.</w:t>
-      </w:r>
-      <w:r>
-        <w:t xml:space="preserve"> </w:t>
-      </w:r>
-      <w:r>
-        <w:t xml:space="preserve">No vertebral label is asserted where it cannot be</w:t>
-      </w:r>
-      <w:r>
-        <w:t xml:space="preserve"> </w:t>
-      </w:r>
-      <w:r>
-        <w:t xml:space="preserve">supported. Every quantity is expressed against the two landmarks present in essentially</w:t>
-      </w:r>
-      <w:r>
-        <w:t xml:space="preserve"> </w:t>
-      </w:r>
-      <w:r>
-        <w:t xml:space="preserve">every abdominal scan, the sacrum below and the lowest rib-bearing vertebra above, so</w:t>
-      </w:r>
-      <w:r>
-        <w:t xml:space="preserve"> </w:t>
-      </w:r>
-      <w:r>
-        <w:t xml:space="preserve">the description is positional rather than nominal: a vertebra by how many rib-free vertebrae</w:t>
-      </w:r>
-      <w:r>
-        <w:t xml:space="preserve"> </w:t>
-      </w:r>
-      <w:r>
-        <w:t xml:space="preserve">separate it from the sacrum, a lowest rib by its length as a fraction of the rib above it, a</w:t>
-      </w:r>
-      <w:r>
-        <w:t xml:space="preserve"> </w:t>
-      </w:r>
-      <w:r>
-        <w:t xml:space="preserve">transverse process by its span and its distance from the ala. None of these changes according</w:t>
-      </w:r>
-      <w:r>
-        <w:t xml:space="preserve"> </w:t>
-      </w:r>
-      <w:r>
-        <w:t xml:space="preserve">to whether a reader would have said L5 or S1, so cases that disagree about the name remain</w:t>
-      </w:r>
-      <w:r>
-        <w:t xml:space="preserve"> </w:t>
-      </w:r>
-      <w:r>
-        <w:t xml:space="preserve">comparable. Where the junction is in view the count is determined and the conventional name</w:t>
-      </w:r>
-      <w:r>
-        <w:t xml:space="preserve"> </w:t>
-      </w:r>
-      <w:r>
-        <w:t xml:space="preserve">follows, and the two descriptions agree. The positional description is, by construction,</w:t>
-      </w:r>
-      <w:r>
-        <w:t xml:space="preserve"> </w:t>
-      </w:r>
-      <w:r>
-        <w:t xml:space="preserve">blind to the ambiguity: an L1 bearing a lumbar rib and an L5 assimilated to the sacrum both</w:t>
-      </w:r>
-      <w:r>
-        <w:t xml:space="preserve"> </w:t>
-      </w:r>
-      <w:r>
-        <w:t xml:space="preserve">leave four rib-free vertebrae above the sacrum, and a true sixth lumbar vertebra, a T12</w:t>
-      </w:r>
-      <w:r>
-        <w:t xml:space="preserve"> </w:t>
-      </w:r>
-      <w:r>
-        <w:t xml:space="preserve">with aplastic ribs and a lumbarized S1 all leave six. The count alone cannot separate the</w:t>
-      </w:r>
-      <w:r>
-        <w:t xml:space="preserve"> </w:t>
-      </w:r>
-      <w:r>
-        <w:t xml:space="preserve">readings.</w:t>
-      </w:r>
-    </w:p>
-    <w:p>
-      <w:pPr>
-        <w:pStyle w:val="BodyText"/>
-      </w:pPr>
-      <w:r>
-        <w:rPr>
-          <w:i/>
-          <w:iCs/>
-        </w:rPr>
         <w:t xml:space="preserve">But the vertebrae themselves are known to differ.</w:t>
       </w:r>
       <w:r>
@@ -908,19 +983,19 @@
         <w:t xml:space="preserve"> </w:t>
       </w:r>
       <w:r>
-        <w:t xml:space="preserve">accuracy over 1485 vertebrae. Size is deliberately removed, because a classifier given raw</w:t>
-      </w:r>
-      <w:r>
-        <w:t xml:space="preserve"> </w:t>
-      </w:r>
-      <w:r>
-        <w:t xml:space="preserve">millimeters separates thoracic from lumbar immediately and has learned nothing that helps at</w:t>
-      </w:r>
-      <w:r>
-        <w:t xml:space="preserve"> </w:t>
-      </w:r>
-      <w:r>
-        <w:t xml:space="preserve">the junction, where the two are nearly the same size.</w:t>
+        <w:t xml:space="preserve">accuracy over 1485 vertebrae. Size is removed because raw millimeters separate thoracic</w:t>
+      </w:r>
+      <w:r>
+        <w:t xml:space="preserve"> </w:t>
+      </w:r>
+      <w:r>
+        <w:t xml:space="preserve">from lumbar trivially and teach nothing about the junction, where the two are nearly the</w:t>
+      </w:r>
+      <w:r>
+        <w:t xml:space="preserve"> </w:t>
+      </w:r>
+      <w:r>
+        <w:t xml:space="preserve">same size.</w:t>
       </w:r>
     </w:p>
     <w:p>
@@ -2061,25 +2136,25 @@
         <w:t xml:space="preserve"> </w:t>
       </w:r>
       <w:r>
-        <w:t xml:space="preserve">carries a separate S1</w:t>
-      </w:r>
-      <w:r>
-        <w:t xml:space="preserve"> </w:t>
-      </w:r>
-      <w:r>
-        <w:t xml:space="preserve">class and per-level ribs, and VerSe </w:t>
-      </w:r>
-      <w:r>
-        <w:t xml:space="preserve"> </w:t>
-      </w:r>
-      <w:r>
-        <w:t xml:space="preserve">carries L6. Because this release uses</w:t>
-      </w:r>
-      <w:r>
-        <w:t xml:space="preserve"> </w:t>
-      </w:r>
-      <w:r>
-        <w:t xml:space="preserve">the VerSe identifiers, its L6</w:t>
+        <w:t xml:space="preserve">carries a</w:t>
+      </w:r>
+      <w:r>
+        <w:t xml:space="preserve"> </w:t>
+      </w:r>
+      <w:r>
+        <w:t xml:space="preserve">separate S1 class and per-level ribs, and VerSe </w:t>
+      </w:r>
+      <w:r>
+        <w:t xml:space="preserve"> </w:t>
+      </w:r>
+      <w:r>
+        <w:t xml:space="preserve">carries L6, whose</w:t>
+      </w:r>
+      <w:r>
+        <w:t xml:space="preserve"> </w:t>
+      </w:r>
+      <w:r>
+        <w:t xml:space="preserve">identifier this release keeps, so its L6</w:t>
       </w:r>
       <w:r>
         <w:t xml:space="preserve"> </w:t>
@@ -2095,19 +2170,13 @@
         <w:t xml:space="preserve"> </w:t>
       </w:r>
       <w:r>
-        <w:t xml:space="preserve">VerSe’s, interoperable rather than local to this</w:t>
-      </w:r>
-      <w:r>
-        <w:t xml:space="preserve"> </w:t>
-      </w:r>
-      <w:r>
-        <w:t xml:space="preserve">work. L6 is retained not for novelty but because a scheme without it cannot record a</w:t>
-      </w:r>
-      <w:r>
-        <w:t xml:space="preserve"> </w:t>
-      </w:r>
-      <w:r>
-        <w:t xml:space="preserve">six-lumbar spine at all, and must renumber the column or drop a level to fit.</w:t>
+        <w:t xml:space="preserve">VerSe’s. L6 is retained because a scheme</w:t>
+      </w:r>
+      <w:r>
+        <w:t xml:space="preserve"> </w:t>
+      </w:r>
+      <w:r>
+        <w:t xml:space="preserve">without it cannot record a six-lumbar spine at all.</w:t>
       </w:r>
     </w:p>
     <w:p>
@@ -2158,13 +2227,54 @@
         <w:t xml:space="preserve"> </w:t>
       </w:r>
       <w:r>
-        <w:t xml:space="preserve">VerSe’s T13 is a vertebra rather than a rib. 16 released records carry a lumbar rib and 18</w:t>
-      </w:r>
-      <w:r>
-        <w:t xml:space="preserve"> </w:t>
-      </w:r>
-      <w:r>
-        <w:t xml:space="preserve">carry an L6.</w:t>
+        <w:t xml:space="preserve">VerSe’s T13 is a vertebra rather than a rib. This scheme can record both: VerSe’s T13 (28)</w:t>
+      </w:r>
+      <w:r>
+        <w:t xml:space="preserve"> </w:t>
+      </w:r>
+      <w:r>
+        <w:t xml:space="preserve">for a thoracic-type thirteenth vertebra with a true rib, and 74/75 for a lumbar-type body</w:t>
+      </w:r>
+      <w:r>
+        <w:t xml:space="preserve"> </w:t>
+      </w:r>
+      <w:r>
+        <w:t xml:space="preserve">bearing a rudimentary one, so either reading is recorded as itself. No record here carries</w:t>
+      </w:r>
+      <w:r>
+        <w:t xml:space="preserve"> </w:t>
+      </w:r>
+      <w:r>
+        <w:t xml:space="preserve">a T13; the sixteen lumbar-rib cases were read as lumbar-type bodies. Where a border vertebra</w:t>
+      </w:r>
+      <w:r>
+        <w:t xml:space="preserve"> </w:t>
+      </w:r>
+      <w:r>
+        <w:t xml:space="preserve">could not be settled by its readers the label stands as read, and reclassifying those</w:t>
+      </w:r>
+      <w:r>
+        <w:t xml:space="preserve"> </w:t>
+      </w:r>
+      <w:r>
+        <w:t xml:space="preserve">records with a classifier trained on local vertebral morphology</w:t>
+      </w:r>
+      <w:r>
+        <w:t xml:space="preserve"> </w:t>
+      </w:r>
+      <w:r>
+        <w:t xml:space="preserve">(Sec. </w:t>
+      </w:r>
+      <w:hyperlink w:anchor="sec:applications">
+        <w:r>
+          <w:rPr>
+            <w:rStyle w:val="Hyperlink"/>
+          </w:rPr>
+          <w:t xml:space="preserve">5</w:t>
+        </w:r>
+      </w:hyperlink>
+      <w:r>
+        <w:t xml:space="preserve">) is the intended path for a later release.</w:t>
       </w:r>
     </w:p>
     <w:bookmarkStart w:id="19" w:name="fig:anchors"/>
@@ -2275,25 +2385,13 @@
         <w:pStyle w:val="BodyText"/>
       </w:pPr>
       <w:r>
-        <w:t xml:space="preserve">Sixteen records carry a lumbar rib in the released volumes: thirteen bilateral and three</w:t>
-      </w:r>
-      <w:r>
-        <w:t xml:space="preserve"> </w:t>
-      </w:r>
-      <w:r>
-        <w:t xml:space="preserve">unilateral, all three on the right. That laterality is reported because it is what the</w:t>
-      </w:r>
-      <w:r>
-        <w:t xml:space="preserve"> </w:t>
-      </w:r>
-      <w:r>
-        <w:t xml:space="preserve">release contains and not as a finding: sixteen records cannot support a statement about</w:t>
-      </w:r>
-      <w:r>
-        <w:t xml:space="preserve"> </w:t>
-      </w:r>
-      <w:r>
-        <w:t xml:space="preserve">side preference, and none is made.</w:t>
+        <w:t xml:space="preserve">Sixteen records carry a lumbar rib: thirteen bilateral and three unilateral, all on the</w:t>
+      </w:r>
+      <w:r>
+        <w:t xml:space="preserve"> </w:t>
+      </w:r>
+      <w:r>
+        <w:t xml:space="preserve">right, a count too small to support any statement about side preference.</w:t>
       </w:r>
     </w:p>
     <w:p>
@@ -2333,7 +2431,7 @@
         <w:t xml:space="preserve"> </w:t>
       </w:r>
       <w:r>
-        <w:t xml:space="preserve">that report them. That is a correction rather than a design note: through v5 the</w:t>
+        <w:t xml:space="preserve">that report them. That is a correction: through v5,</w:t>
       </w:r>
       <w:r>
         <w:t xml:space="preserve"> </w:t>
@@ -2348,13 +2446,13 @@
         <w:t xml:space="preserve"> </w:t>
       </w:r>
       <w:r>
-        <w:t xml:space="preserve">flag was true for exactly one record, which contains no L6, and false for</w:t>
-      </w:r>
-      <w:r>
-        <w:t xml:space="preserve"> </w:t>
-      </w:r>
-      <w:r>
-        <w:t xml:space="preserve">all eighteen that do, while</w:t>
+        <w:t xml:space="preserve">was true for one</w:t>
+      </w:r>
+      <w:r>
+        <w:t xml:space="preserve"> </w:t>
+      </w:r>
+      <w:r>
+        <w:t xml:space="preserve">record that contains no L6 and false for all eighteen that do,</w:t>
       </w:r>
       <w:r>
         <w:t xml:space="preserve"> </w:t>
@@ -2369,7 +2467,13 @@
         <w:t xml:space="preserve"> </w:t>
       </w:r>
       <w:r>
-        <w:t xml:space="preserve">was false everywhere and</w:t>
+        <w:t xml:space="preserve">was</w:t>
+      </w:r>
+      <w:r>
+        <w:t xml:space="preserve"> </w:t>
+      </w:r>
+      <w:r>
+        <w:t xml:space="preserve">false everywhere, and</w:t>
       </w:r>
       <w:r>
         <w:t xml:space="preserve"> </w:t>
@@ -2384,25 +2488,13 @@
         <w:t xml:space="preserve"> </w:t>
       </w:r>
       <w:r>
-        <w:t xml:space="preserve">read zero in 799 of 802 records. A reader selecting the six-lumbar</w:t>
-      </w:r>
-      <w:r>
-        <w:t xml:space="preserve"> </w:t>
-      </w:r>
-      <w:r>
-        <w:t xml:space="preserve">cases on those fields would have received one record that is not one, and a reader selecting</w:t>
-      </w:r>
-      <w:r>
-        <w:t xml:space="preserve"> </w:t>
-      </w:r>
-      <w:r>
-        <w:t xml:space="preserve">lumbar ribs an empty set, with nothing to indicate either. The fields are rebuilt for this</w:t>
-      </w:r>
-      <w:r>
-        <w:t xml:space="preserve"> </w:t>
-      </w:r>
-      <w:r>
-        <w:t xml:space="preserve">release by counting identifiers 25 and 74–75 in each volume, and</w:t>
+        <w:t xml:space="preserve">read zero in 799 of 802 records. The fields</w:t>
+      </w:r>
+      <w:r>
+        <w:t xml:space="preserve"> </w:t>
+      </w:r>
+      <w:r>
+        <w:t xml:space="preserve">are rebuilt for this release by counting identifiers 25 and 74–75 in each volume, with</w:t>
       </w:r>
       <w:r>
         <w:t xml:space="preserve"> </w:t>
@@ -2417,7 +2509,7 @@
         <w:t xml:space="preserve"> </w:t>
       </w:r>
       <w:r>
-        <w:t xml:space="preserve">is added alongside them.</w:t>
+        <w:t xml:space="preserve">added alongside them.</w:t>
       </w:r>
     </w:p>
     <w:bookmarkEnd w:id="20"/>
@@ -2605,31 +2697,25 @@
         <w:t xml:space="preserve"> </w:t>
       </w:r>
       <w:r>
-        <w:t xml:space="preserve">Assistance from large language models was used</w:t>
-      </w:r>
-      <w:r>
-        <w:t xml:space="preserve"> </w:t>
-      </w:r>
-      <w:r>
-        <w:t xml:space="preserve">for manuscript preparation (drafting and editing of text, and generation of analysis and</w:t>
-      </w:r>
-      <w:r>
-        <w:t xml:space="preserve"> </w:t>
-      </w:r>
-      <w:r>
-        <w:t xml:space="preserve">figure code) under author review. It was not used to generate, annotate or interpret any</w:t>
-      </w:r>
-      <w:r>
-        <w:t xml:space="preserve"> </w:t>
-      </w:r>
-      <w:r>
-        <w:t xml:space="preserve">imaging data, and no scientific claim in this manuscript originates from it. All numbers</w:t>
-      </w:r>
-      <w:r>
-        <w:t xml:space="preserve"> </w:t>
-      </w:r>
-      <w:r>
-        <w:t xml:space="preserve">reported here are computed by the released code from the released volumes.</w:t>
+        <w:t xml:space="preserve">Large language models assisted with drafting</w:t>
+      </w:r>
+      <w:r>
+        <w:t xml:space="preserve"> </w:t>
+      </w:r>
+      <w:r>
+        <w:t xml:space="preserve">and editing text and with analysis and figure code, under author review. They were not</w:t>
+      </w:r>
+      <w:r>
+        <w:t xml:space="preserve"> </w:t>
+      </w:r>
+      <w:r>
+        <w:t xml:space="preserve">used to generate, annotate or interpret imaging data; every number reported here is</w:t>
+      </w:r>
+      <w:r>
+        <w:t xml:space="preserve"> </w:t>
+      </w:r>
+      <w:r>
+        <w:t xml:space="preserve">computed by the released code from the released volumes.</w:t>
       </w:r>
     </w:p>
     <w:bookmarkEnd w:id="23"/>
@@ -2722,13 +2808,13 @@
         <w:t xml:space="preserve">each sided pair separately</w:t>
       </w:r>
       <w:r>
-        <w:t xml:space="preserve">, and both simpler alternatives miss</w:t>
-      </w:r>
-      <w:r>
-        <w:t xml:space="preserve"> </w:t>
-      </w:r>
-      <w:r>
-        <w:t xml:space="preserve">cases it catches. Testing the ribs alone passed all 802 records while four of them carried</w:t>
+        <w:t xml:space="preserve">: testing the ribs alone passed all</w:t>
+      </w:r>
+      <w:r>
+        <w:t xml:space="preserve"> </w:t>
+      </w:r>
+      <w:r>
+        <w:t xml:space="preserve">802 records while four carried</w:t>
       </w:r>
       <w:r>
         <w:t xml:space="preserve"> </w:t>
@@ -2743,31 +2829,25 @@
         <w:t xml:space="preserve"> </w:t>
       </w:r>
       <w:r>
-        <w:t xml:space="preserve">on the patient’s right. Pooling all sided structures into one test</w:t>
-      </w:r>
-      <w:r>
-        <w:t xml:space="preserve"> </w:t>
-      </w:r>
-      <w:r>
-        <w:t xml:space="preserve">recovered three of those four and missed the fourth, because hips and femora outweigh the</w:t>
-      </w:r>
-      <w:r>
-        <w:t xml:space="preserve"> </w:t>
-      </w:r>
-      <w:r>
-        <w:t xml:space="preserve">ribs by voxel count, so a large correctly-sided structure masks a smaller transposed one. A</w:t>
-      </w:r>
-      <w:r>
-        <w:t xml:space="preserve"> </w:t>
-      </w:r>
-      <w:r>
-        <w:t xml:space="preserve">gate that passes everything is not evidence of a clean corpus until it has been shown capable</w:t>
-      </w:r>
-      <w:r>
-        <w:t xml:space="preserve"> </w:t>
-      </w:r>
-      <w:r>
-        <w:t xml:space="preserve">of failing.</w:t>
+        <w:t xml:space="preserve">on the patient’s right, and pooling all</w:t>
+      </w:r>
+      <w:r>
+        <w:t xml:space="preserve"> </w:t>
+      </w:r>
+      <w:r>
+        <w:t xml:space="preserve">sided structures into one test still missed one of those four, because a large</w:t>
+      </w:r>
+      <w:r>
+        <w:t xml:space="preserve"> </w:t>
+      </w:r>
+      <w:r>
+        <w:t xml:space="preserve">correctly-sided structure masks a smaller transposed one. A gate that passes everything is</w:t>
+      </w:r>
+      <w:r>
+        <w:t xml:space="preserve"> </w:t>
+      </w:r>
+      <w:r>
+        <w:t xml:space="preserve">not evidence of a clean corpus until it has been shown capable of failing.</w:t>
       </w:r>
     </w:p>
     <w:p>
@@ -2839,7 +2919,7 @@
         <w:t xml:space="preserve"> </w:t>
       </w:r>
       <w:r>
-        <w:t xml:space="preserve">residual offsets against all 11</w:t>
+        <w:t xml:space="preserve">offsets against all 11</w:t>
       </w:r>
       <w:r>
         <w:t xml:space="preserve">,</w:t>
@@ -2851,19 +2931,13 @@
         <w:t xml:space="preserve"> </w:t>
       </w:r>
       <w:r>
-        <w:t xml:space="preserve">examined, and because more than half the ribs in a screening abdominal CT being</w:t>
-      </w:r>
-      <w:r>
-        <w:t xml:space="preserve"> </w:t>
-      </w:r>
-      <w:r>
-        <w:t xml:space="preserve">unevaluable is itself a fact about the corpus worth reporting. Both offsets are</w:t>
-      </w:r>
-      <w:r>
-        <w:t xml:space="preserve"> </w:t>
-      </w:r>
-      <w:r>
-        <w:t xml:space="preserve">field-of-view truncations on individually characterized cases, one at</w:t>
+        <w:t xml:space="preserve">examined. Both offsets are field-of-view truncations on individually characterized cases,</w:t>
+      </w:r>
+      <w:r>
+        <w:t xml:space="preserve"> </w:t>
+      </w:r>
+      <w:r>
+        <w:t xml:space="preserve">one at</w:t>
       </w:r>
       <w:r>
         <w:t xml:space="preserve"> </w:t>
@@ -2900,13 +2974,7 @@
         </m:r>
       </m:oMath>
       <w:r>
-        <w:t xml:space="preserve">, and are reported rather than suppressed: a threshold tuned until the count reaches</w:t>
-      </w:r>
-      <w:r>
-        <w:t xml:space="preserve"> </w:t>
-      </w:r>
-      <w:r>
-        <w:t xml:space="preserve">zero yields a cleaner number and a less informative one.</w:t>
+        <w:t xml:space="preserve">, reported rather than suppressed.</w:t>
       </w:r>
     </w:p>
     <w:p>
@@ -4140,13 +4208,13 @@
         <w:t xml:space="preserve"> </w:t>
       </w:r>
       <w:r>
-        <w:t xml:space="preserve">a held-out test set. Users reporting a single held-out number should carve one out and state which records</w:t>
-      </w:r>
-      <w:r>
-        <w:t xml:space="preserve"> </w:t>
-      </w:r>
-      <w:r>
-        <w:t xml:space="preserve">it holds, because the folds shipped here will not do that job.</w:t>
+        <w:t xml:space="preserve">a held-out test set; users reporting a</w:t>
+      </w:r>
+      <w:r>
+        <w:t xml:space="preserve"> </w:t>
+      </w:r>
+      <w:r>
+        <w:t xml:space="preserve">single held-out number should carve one out and state which records it holds.</w:t>
       </w:r>
     </w:p>
     <w:p>
@@ -4154,43 +4222,25 @@
         <w:pStyle w:val="BodyText"/>
       </w:pPr>
       <w:r>
-        <w:t xml:space="preserve">Stratification is on the transitional subtype rather than on a binary LSTV flag, and it</w:t>
-      </w:r>
-      <w:r>
-        <w:t xml:space="preserve"> </w:t>
-      </w:r>
-      <w:r>
-        <w:t xml:space="preserve">enforces a minimum of each rare subtype in every validation fold: each fold’s validation</w:t>
-      </w:r>
-      <w:r>
-        <w:t xml:space="preserve"> </w:t>
-      </w:r>
-      <w:r>
-        <w:t xml:space="preserve">set carries three sacralization and three lumbarization records, so no fold is evaluated on</w:t>
-      </w:r>
-      <w:r>
-        <w:t xml:space="preserve"> </w:t>
-      </w:r>
-      <w:r>
-        <w:t xml:space="preserve">a cohort missing the class the dataset exists for. With 15 lumbarization and 15</w:t>
-      </w:r>
-      <w:r>
-        <w:t xml:space="preserve"> </w:t>
-      </w:r>
-      <w:r>
-        <w:t xml:space="preserve">sacralization records across 802, that is the practical limit of what stratification can</w:t>
-      </w:r>
-      <w:r>
-        <w:t xml:space="preserve"> </w:t>
-      </w:r>
-      <w:r>
-        <w:t xml:space="preserve">guarantee, and it is why a fold-level metric on the rare classes carries an error bar far</w:t>
-      </w:r>
-      <w:r>
-        <w:t xml:space="preserve"> </w:t>
-      </w:r>
-      <w:r>
-        <w:t xml:space="preserve">wider than its own decimal places.</w:t>
+        <w:t xml:space="preserve">Stratification is on the transitional subtype rather than a binary LSTV flag: every</w:t>
+      </w:r>
+      <w:r>
+        <w:t xml:space="preserve"> </w:t>
+      </w:r>
+      <w:r>
+        <w:t xml:space="preserve">validation fold carries three sacralization and three lumbarization records. With 15 of</w:t>
+      </w:r>
+      <w:r>
+        <w:t xml:space="preserve"> </w:t>
+      </w:r>
+      <w:r>
+        <w:t xml:space="preserve">each across 802 that is the most stratification can guarantee, and it is why a fold-level</w:t>
+      </w:r>
+      <w:r>
+        <w:t xml:space="preserve"> </w:t>
+      </w:r>
+      <w:r>
+        <w:t xml:space="preserve">metric on the rare classes carries an error bar far wider than its own decimal places.</w:t>
       </w:r>
     </w:p>
     <w:tbl>
@@ -4862,19 +4912,13 @@
         <w:t xml:space="preserve"> </w:t>
       </w:r>
       <w:r>
-        <w:t xml:space="preserve">All 802 are counted in totals, and records outside the female/male dichotomy are excluded</w:t>
-      </w:r>
-      <w:r>
-        <w:t xml:space="preserve"> </w:t>
-      </w:r>
-      <w:r>
-        <w:t xml:space="preserve">from sex-stratified measures (a limitation of those measures rather than of the cohort),</w:t>
-      </w:r>
-      <w:r>
-        <w:t xml:space="preserve"> </w:t>
-      </w:r>
-      <w:r>
-        <w:t xml:space="preserve">stated because folding eleven people into</w:t>
+        <w:t xml:space="preserve">All 802 are counted in totals; the eleven records outside the female/male dichotomy are</w:t>
+      </w:r>
+      <w:r>
+        <w:t xml:space="preserve"> </w:t>
+      </w:r>
+      <w:r>
+        <w:t xml:space="preserve">excluded from sex-stratified measures rather than folded into</w:t>
       </w:r>
       <w:r>
         <w:t xml:space="preserve"> </w:t>
@@ -4883,22 +4927,13 @@
         <w:t xml:space="preserve">“unrecorded”</w:t>
       </w:r>
       <w:r>
-        <w:t xml:space="preserve"> </w:t>
-      </w:r>
-      <w:r>
-        <w:t xml:space="preserve">would misdescribe the source. The lower age bound is the screening guideline</w:t>
-      </w:r>
-      <w:r>
-        <w:t xml:space="preserve"> </w:t>
-      </w:r>
-      <w:r>
-        <w:t xml:space="preserve">rather than a selection applied here, and it is why the measures below sit closer to a</w:t>
-      </w:r>
-      <w:r>
-        <w:t xml:space="preserve"> </w:t>
-      </w:r>
-      <w:r>
-        <w:t xml:space="preserve">reference range than a surgical series would.</w:t>
+        <w:t xml:space="preserve">. The lower</w:t>
+      </w:r>
+      <w:r>
+        <w:t xml:space="preserve"> </w:t>
+      </w:r>
+      <w:r>
+        <w:t xml:space="preserve">age bound is the screening guideline, not a selection applied here.</w:t>
       </w:r>
     </w:p>
     <w:p>
@@ -6276,6 +6311,32 @@
         <w:pStyle w:val="BodyText"/>
       </w:pPr>
       <w:r>
+        <w:t xml:space="preserve">H. M</w:t>
+      </w:r>
+      <w:r>
+        <w:t xml:space="preserve">ö</w:t>
+      </w:r>
+      <w:r>
+        <w:t xml:space="preserve">ller, H. Schoen, R. Graf, et al.,</w:t>
+      </w:r>
+      <w:r>
+        <w:t xml:space="preserve"> </w:t>
+      </w:r>
+      <w:r>
+        <w:t xml:space="preserve">: solving enumeration anomaly aware vertebra labeling across imaging sequences, 2026,</w:t>
+      </w:r>
+      <w:r>
+        <w:t xml:space="preserve"> </w:t>
+      </w:r>
+      <w:r>
+        <w:t xml:space="preserve">arXiv:2601.14066. doi:10.48550/arXiv.2601.14066.</w:t>
+      </w:r>
+    </w:p>
+    <w:p>
+      <w:pPr>
+        <w:pStyle w:val="BodyText"/>
+      </w:pPr>
+      <w:r>
         <w:t xml:space="preserve">A. Sekuboyina et al.,</w:t>
       </w:r>
       <w:r>
@@ -6359,6 +6420,159 @@
       </w:r>
       <w:r>
         <w:t xml:space="preserve">doi:10.1038/s41597-021-01060-0.</w:t>
+      </w:r>
+    </w:p>
+    <w:p>
+      <w:pPr>
+        <w:pStyle w:val="BodyText"/>
+      </w:pPr>
+      <w:r>
+        <w:t xml:space="preserve">Y. Otake, S. Schafer, J. W. Stayman, et al.,</w:t>
+      </w:r>
+      <w:r>
+        <w:t xml:space="preserve"> </w:t>
+      </w:r>
+      <w:r>
+        <w:t xml:space="preserve">Automatic localization of vertebral levels in x-ray fluoroscopy using</w:t>
+      </w:r>
+      <w:r>
+        <w:t xml:space="preserve"> </w:t>
+      </w:r>
+      <w:r>
+        <w:t xml:space="preserve">3D-2D</w:t>
+      </w:r>
+      <w:r>
+        <w:t xml:space="preserve"> </w:t>
+      </w:r>
+      <w:r>
+        <w:t xml:space="preserve">registration: a tool to reduce wrong-site surgery,</w:t>
+      </w:r>
+      <w:r>
+        <w:t xml:space="preserve"> </w:t>
+      </w:r>
+      <w:r>
+        <w:t xml:space="preserve">Phys. Med. Biol.</w:t>
+      </w:r>
+      <w:r>
+        <w:t xml:space="preserve"> </w:t>
+      </w:r>
+      <w:r>
+        <w:rPr>
+          <w:b/>
+          <w:bCs/>
+        </w:rPr>
+        <w:t xml:space="preserve">57</w:t>
+      </w:r>
+      <w:r>
+        <w:t xml:space="preserve">, 5485–5508 (2012),</w:t>
+      </w:r>
+      <w:r>
+        <w:t xml:space="preserve"> </w:t>
+      </w:r>
+      <w:r>
+        <w:t xml:space="preserve">doi:10.1088/0031-9155/57/17/5485.</w:t>
+      </w:r>
+    </w:p>
+    <w:p>
+      <w:pPr>
+        <w:pStyle w:val="BodyText"/>
+      </w:pPr>
+      <w:r>
+        <w:t xml:space="preserve">S.-F. L. Lo, Y. Otake, V. Puvanesarajah, et al.,</w:t>
+      </w:r>
+      <w:r>
+        <w:t xml:space="preserve"> </w:t>
+      </w:r>
+      <w:r>
+        <w:t xml:space="preserve">Automatic localization of target vertebrae in spine surgery: clinical evaluation of the</w:t>
+      </w:r>
+      <w:r>
+        <w:t xml:space="preserve"> </w:t>
+      </w:r>
+      <w:r>
+        <w:t xml:space="preserve">LevelCheck</w:t>
+      </w:r>
+      <w:r>
+        <w:t xml:space="preserve"> </w:t>
+      </w:r>
+      <w:r>
+        <w:t xml:space="preserve">registration algorithm,</w:t>
+      </w:r>
+      <w:r>
+        <w:t xml:space="preserve"> </w:t>
+      </w:r>
+      <w:r>
+        <w:t xml:space="preserve">Spine (Phila. Pa. 1976)</w:t>
+      </w:r>
+      <w:r>
+        <w:t xml:space="preserve"> </w:t>
+      </w:r>
+      <w:r>
+        <w:rPr>
+          <w:b/>
+          <w:bCs/>
+        </w:rPr>
+        <w:t xml:space="preserve">40</w:t>
+      </w:r>
+      <w:r>
+        <w:t xml:space="preserve">, E476–E483 (2015),</w:t>
+      </w:r>
+      <w:r>
+        <w:t xml:space="preserve"> </w:t>
+      </w:r>
+      <w:r>
+        <w:t xml:space="preserve">doi:10.1097/BRS.0000000000000814.</w:t>
+      </w:r>
+    </w:p>
+    <w:p>
+      <w:pPr>
+        <w:pStyle w:val="BodyText"/>
+      </w:pPr>
+      <w:r>
+        <w:t xml:space="preserve">T. De Silva, S.-F. L. Lo, N. Aygun, et al.,</w:t>
+      </w:r>
+      <w:r>
+        <w:t xml:space="preserve"> </w:t>
+      </w:r>
+      <w:r>
+        <w:t xml:space="preserve">Utility of the</w:t>
+      </w:r>
+      <w:r>
+        <w:t xml:space="preserve"> </w:t>
+      </w:r>
+      <w:r>
+        <w:t xml:space="preserve">LevelCheck</w:t>
+      </w:r>
+      <w:r>
+        <w:t xml:space="preserve"> </w:t>
+      </w:r>
+      <w:r>
+        <w:t xml:space="preserve">algorithm for decision support in vertebral localization,</w:t>
+      </w:r>
+      <w:r>
+        <w:t xml:space="preserve"> </w:t>
+      </w:r>
+      <w:r>
+        <w:t xml:space="preserve">Spine (Phila. Pa. 1976)</w:t>
+      </w:r>
+      <w:r>
+        <w:t xml:space="preserve"> </w:t>
+      </w:r>
+      <w:r>
+        <w:rPr>
+          <w:b/>
+          <w:bCs/>
+        </w:rPr>
+        <w:t xml:space="preserve">41</w:t>
+      </w:r>
+      <w:r>
+        <w:t xml:space="preserve">, E1249–E1256 (2016),</w:t>
+      </w:r>
+      <w:r>
+        <w:t xml:space="preserve"> </w:t>
+      </w:r>
+      <w:r>
+        <w:t xml:space="preserve">doi:10.1097/BRS.0000000000001589.</w:t>
       </w:r>
     </w:p>
     <w:p>

</xml_diff>

<commit_message>
the reference standard stated as it is: whole-spine imaging, counted caudally from C2, for atypical spines
Co-Authored-By: Claude Fable 5.1 <noreply@anthropic.com>
</commit_message>
<xml_diff>
--- a/paper/mpda/CTSpinoPelvic1K_review.docx
+++ b/paper/mpda/CTSpinoPelvic1K_review.docx
@@ -41,13 +41,19 @@
         <w:t xml:space="preserve"> </w:t>
       </w:r>
       <w:r>
-        <w:t xml:space="preserve">A lumbar vertebra is named by counting down from C2, the reference standard</w:t>
-      </w:r>
-      <w:r>
-        <w:t xml:space="preserve"> </w:t>
-      </w:r>
-      <w:r>
-        <w:t xml:space="preserve">for numeration </w:t>
+        <w:t xml:space="preserve">Radiologic convention resolves vertebral numbering in an atypical spine by</w:t>
+      </w:r>
+      <w:r>
+        <w:t xml:space="preserve"> </w:t>
+      </w:r>
+      <w:r>
+        <w:t xml:space="preserve">counting caudally from C2 on whole-spine imaging, the reference standard for</w:t>
+      </w:r>
+      <w:r>
+        <w:t xml:space="preserve"> </w:t>
+      </w:r>
+      <w:r>
+        <w:t xml:space="preserve">numeration </w:t>
       </w:r>
       <w:r>
         <w:t xml:space="preserve">. Abdominal CT does not contain C2, and where a lumbosacral</w:t>
@@ -463,22 +469,22 @@
         <w:t xml:space="preserve"> </w:t>
       </w:r>
       <w:r>
-        <w:t xml:space="preserve">support. Absent that, what remains is the sequence, conventionally established by</w:t>
-      </w:r>
-      <w:r>
-        <w:t xml:space="preserve"> </w:t>
-      </w:r>
-      <w:r>
-        <w:t xml:space="preserve">counting downward from C2, the reference standard for numeration </w:t>
-      </w:r>
-      <w:r>
-        <w:t xml:space="preserve">, and</w:t>
-      </w:r>
-      <w:r>
-        <w:t xml:space="preserve"> </w:t>
-      </w:r>
-      <w:r>
-        <w:t xml:space="preserve">unavailable in any spine-limited acquisition. LSTV is common,</w:t>
+        <w:t xml:space="preserve">support. Absent that, what remains is the sequence, which the reference standard establishes</w:t>
+      </w:r>
+      <w:r>
+        <w:t xml:space="preserve"> </w:t>
+      </w:r>
+      <w:r>
+        <w:t xml:space="preserve">by counting caudally from C2 on whole-spine imaging </w:t>
+      </w:r>
+      <w:r>
+        <w:t xml:space="preserve">, unavailable in any</w:t>
+      </w:r>
+      <w:r>
+        <w:t xml:space="preserve"> </w:t>
+      </w:r>
+      <w:r>
+        <w:t xml:space="preserve">spine-limited acquisition. LSTV is common,</w:t>
       </w:r>
       <w:r>
         <w:t xml:space="preserve"> </w:t>

</xml_diff>

<commit_message>
abstract under 300 again; preprint and review copies rebuilt
Co-Authored-By: Claude Fable 5.1 <noreply@anthropic.com>
</commit_message>
<xml_diff>
--- a/paper/mpda/CTSpinoPelvic1K_review.docx
+++ b/paper/mpda/CTSpinoPelvic1K_review.docx
@@ -41,19 +41,13 @@
         <w:t xml:space="preserve"> </w:t>
       </w:r>
       <w:r>
-        <w:t xml:space="preserve">Radiologic convention resolves vertebral numbering in an atypical spine by</w:t>
-      </w:r>
-      <w:r>
-        <w:t xml:space="preserve"> </w:t>
-      </w:r>
-      <w:r>
-        <w:t xml:space="preserve">counting caudally from C2 on whole-spine imaging, the reference standard for</w:t>
-      </w:r>
-      <w:r>
-        <w:t xml:space="preserve"> </w:t>
-      </w:r>
-      <w:r>
-        <w:t xml:space="preserve">numeration </w:t>
+        <w:t xml:space="preserve">The reference standard for numbering an atypical spine counts caudally</w:t>
+      </w:r>
+      <w:r>
+        <w:t xml:space="preserve"> </w:t>
+      </w:r>
+      <w:r>
+        <w:t xml:space="preserve">from C2 on whole-spine imaging </w:t>
       </w:r>
       <w:r>
         <w:t xml:space="preserve">. Abdominal CT does not contain C2, and where a lumbosacral</w:t>
@@ -225,13 +219,7 @@
         <w:t xml:space="preserve"> </w:t>
       </w:r>
       <w:r>
-        <w:t xml:space="preserve">spinopelvic assessment at the lumbosacral interface; variant studies; opportunistic</w:t>
-      </w:r>
-      <w:r>
-        <w:t xml:space="preserve"> </w:t>
-      </w:r>
-      <w:r>
-        <w:t xml:space="preserve">screening.</w:t>
+        <w:t xml:space="preserve">spinopelvic assessment; variant studies; opportunistic screening.</w:t>
       </w:r>
       <w:r>
         <w:t xml:space="preserve"> </w:t>

</xml_diff>

<commit_message>
preprint and review copies rebuilt
Co-Authored-By: Claude Fable 5.1 <noreply@anthropic.com>
</commit_message>
<xml_diff>
--- a/paper/mpda/CTSpinoPelvic1K_review.docx
+++ b/paper/mpda/CTSpinoPelvic1K_review.docx
@@ -41,16 +41,22 @@
         <w:t xml:space="preserve"> </w:t>
       </w:r>
       <w:r>
-        <w:t xml:space="preserve">The reference standard for numbering an atypical spine counts caudally</w:t>
-      </w:r>
-      <w:r>
-        <w:t xml:space="preserve"> </w:t>
-      </w:r>
-      <w:r>
-        <w:t xml:space="preserve">from C2 on whole-spine imaging </w:t>
-      </w:r>
-      <w:r>
-        <w:t xml:space="preserve">. Abdominal CT does not contain C2, and where a lumbosacral</w:t>
+        <w:t xml:space="preserve">For transitional anatomy the gold standard for numeration remains</w:t>
+      </w:r>
+      <w:r>
+        <w:t xml:space="preserve"> </w:t>
+      </w:r>
+      <w:r>
+        <w:t xml:space="preserve">whole-spine imaging and counting caudally from C2 </w:t>
+      </w:r>
+      <w:r>
+        <w:t xml:space="preserve">. Abdominal CT does not</w:t>
+      </w:r>
+      <w:r>
+        <w:t xml:space="preserve"> </w:t>
+      </w:r>
+      <w:r>
+        <w:t xml:space="preserve">contain C2, and where a lumbosacral</w:t>
       </w:r>
       <w:r>
         <w:t xml:space="preserve"> </w:t>
@@ -457,22 +463,28 @@
         <w:t xml:space="preserve"> </w:t>
       </w:r>
       <w:r>
-        <w:t xml:space="preserve">support. Absent that, what remains is the sequence, which the reference standard establishes</w:t>
-      </w:r>
-      <w:r>
-        <w:t xml:space="preserve"> </w:t>
-      </w:r>
-      <w:r>
-        <w:t xml:space="preserve">by counting caudally from C2 on whole-spine imaging </w:t>
-      </w:r>
-      <w:r>
-        <w:t xml:space="preserve">, unavailable in any</w:t>
-      </w:r>
-      <w:r>
-        <w:t xml:space="preserve"> </w:t>
-      </w:r>
-      <w:r>
-        <w:t xml:space="preserve">spine-limited acquisition. LSTV is common,</w:t>
+        <w:t xml:space="preserve">support. Absent that, what remains is the count itself: the gold standard for numeration in</w:t>
+      </w:r>
+      <w:r>
+        <w:t xml:space="preserve"> </w:t>
+      </w:r>
+      <w:r>
+        <w:t xml:space="preserve">transitional anatomy is whole-spine imaging, counting caudally from C2 </w:t>
+      </w:r>
+      <w:r>
+        <w:t xml:space="preserve">, so</w:t>
+      </w:r>
+      <w:r>
+        <w:t xml:space="preserve"> </w:t>
+      </w:r>
+      <w:r>
+        <w:t xml:space="preserve">that each vertebra is named by its ordinal position whatever it carries, and no</w:t>
+      </w:r>
+      <w:r>
+        <w:t xml:space="preserve"> </w:t>
+      </w:r>
+      <w:r>
+        <w:t xml:space="preserve">spine-limited acquisition can supply it. LSTV is common,</w:t>
       </w:r>
       <w:r>
         <w:t xml:space="preserve"> </w:t>

</xml_diff>

<commit_message>
the whole-spine count fixes both the vertebra count and the rib-pair count; neither is available in a spine-limited acquisition
Co-Authored-By: Claude Fable 5.1 <noreply@anthropic.com>
</commit_message>
<xml_diff>
--- a/paper/mpda/CTSpinoPelvic1K_review.docx
+++ b/paper/mpda/CTSpinoPelvic1K_review.docx
@@ -472,19 +472,19 @@
         <w:t xml:space="preserve">transitional anatomy is whole-spine imaging, counting caudally from C2 </w:t>
       </w:r>
       <w:r>
-        <w:t xml:space="preserve">, so</w:t>
-      </w:r>
-      <w:r>
-        <w:t xml:space="preserve"> </w:t>
-      </w:r>
-      <w:r>
-        <w:t xml:space="preserve">that each vertebra is named by its ordinal position whatever it carries, and no</w:t>
-      </w:r>
-      <w:r>
-        <w:t xml:space="preserve"> </w:t>
-      </w:r>
-      <w:r>
-        <w:t xml:space="preserve">spine-limited acquisition can supply it. LSTV is common,</w:t>
+        <w:t xml:space="preserve">,</w:t>
+      </w:r>
+      <w:r>
+        <w:t xml:space="preserve"> </w:t>
+      </w:r>
+      <w:r>
+        <w:t xml:space="preserve">which fixes how many vertebrae and how many rib pairs the column holds, and no</w:t>
+      </w:r>
+      <w:r>
+        <w:t xml:space="preserve"> </w:t>
+      </w:r>
+      <w:r>
+        <w:t xml:space="preserve">spine-limited acquisition can supply either count. LSTV is common,</w:t>
       </w:r>
       <w:r>
         <w:t xml:space="preserve"> </w:t>

</xml_diff>

<commit_message>
Introduction: why the project exists, the cohort as one prospective protocol across 15 sites and five vendors (largest such spine-and-pelvis cohort, comparators verified), and the field-of-view price; restatements cut to hold ten pages
Co-Authored-By: Claude Fable 5.1 <noreply@anthropic.com>
</commit_message>
<xml_diff>
--- a/paper/mpda/CTSpinoPelvic1K_review.docx
+++ b/paper/mpda/CTSpinoPelvic1K_review.docx
@@ -685,6 +685,94 @@
         <w:pStyle w:val="BodyText"/>
       </w:pPr>
       <w:r>
+        <w:t xml:space="preserve">The project began as a surgeon’s question: whether a vertebra can be named from the</w:t>
+      </w:r>
+      <w:r>
+        <w:t xml:space="preserve"> </w:t>
+      </w:r>
+      <w:r>
+        <w:t xml:space="preserve">anatomy in front of the reader, on the abdominal and spine-limited images a surgeon actually</w:t>
+      </w:r>
+      <w:r>
+        <w:t xml:space="preserve"> </w:t>
+      </w:r>
+      <w:r>
+        <w:t xml:space="preserve">has, in the patients where counting fails. The cohort suits that question. Every record</w:t>
+      </w:r>
+      <w:r>
+        <w:t xml:space="preserve"> </w:t>
+      </w:r>
+      <w:r>
+        <w:t xml:space="preserve">comes from one prospective trial protocol, ACRIN 6664 </w:t>
+      </w:r>
+      <w:r>
+        <w:t xml:space="preserve">: 802 patients aged</w:t>
+      </w:r>
+      <w:r>
+        <w:t xml:space="preserve"> </w:t>
+      </w:r>
+      <w:r>
+        <w:t xml:space="preserve">50 and over, scanned supine and prone on multidetector CT at 15 centers, on five scanner</w:t>
+      </w:r>
+      <w:r>
+        <w:t xml:space="preserve"> </w:t>
+      </w:r>
+      <w:r>
+        <w:t xml:space="preserve">vendors and nine models, with manufacturer, model and reconstruction kernel recorded per</w:t>
+      </w:r>
+      <w:r>
+        <w:t xml:space="preserve"> </w:t>
+      </w:r>
+      <w:r>
+        <w:t xml:space="preserve">record. To our knowledge it is the largest spine-and-pelvis annotated CT cohort acquired</w:t>
+      </w:r>
+      <w:r>
+        <w:t xml:space="preserve"> </w:t>
+      </w:r>
+      <w:r>
+        <w:t xml:space="preserve">under a single protocol; the comparators pool several collections (CTSpine1K four,</w:t>
+      </w:r>
+      <w:r>
+        <w:t xml:space="preserve"> </w:t>
+      </w:r>
+      <w:r>
+        <w:t xml:space="preserve">CTPelvic1K seven), are multi-site by design (VerSe), or are routine clinical scans under</w:t>
+      </w:r>
+      <w:r>
+        <w:t xml:space="preserve"> </w:t>
+      </w:r>
+      <w:r>
+        <w:t xml:space="preserve">many protocols (TotalSegmentator). With the protocol held fixed, scanner effects on a</w:t>
+      </w:r>
+      <w:r>
+        <w:t xml:space="preserve"> </w:t>
+      </w:r>
+      <w:r>
+        <w:t xml:space="preserve">model become measurable rather than confounded. The price is the field of view: abdominal,</w:t>
+      </w:r>
+      <w:r>
+        <w:t xml:space="preserve"> </w:t>
+      </w:r>
+      <w:r>
+        <w:t xml:space="preserve">so the thoracic spine enters from below and C2 is never present (Sec. </w:t>
+      </w:r>
+      <w:hyperlink w:anchor="sec:applications">
+        <w:r>
+          <w:rPr>
+            <w:rStyle w:val="Hyperlink"/>
+          </w:rPr>
+          <w:t xml:space="preserve">5</w:t>
+        </w:r>
+      </w:hyperlink>
+      <w:r>
+        <w:t xml:space="preserve">).</w:t>
+      </w:r>
+    </w:p>
+    <w:p>
+      <w:pPr>
+        <w:pStyle w:val="BodyText"/>
+      </w:pPr>
+      <w:r>
         <w:rPr>
           <w:i/>
           <w:iCs/>
@@ -719,19 +807,7 @@
         <w:t xml:space="preserve"> </w:t>
       </w:r>
       <w:r>
-        <w:t xml:space="preserve">above pins the exact release measured in this manuscript. Documentation, the label scheme, the</w:t>
-      </w:r>
-      <w:r>
-        <w:t xml:space="preserve"> </w:t>
-      </w:r>
-      <w:r>
-        <w:t xml:space="preserve">reference loader and the per-record quality-control tables are distributed with the archive</w:t>
-      </w:r>
-      <w:r>
-        <w:t xml:space="preserve"> </w:t>
-      </w:r>
-      <w:r>
-        <w:t xml:space="preserve">and are described in Sec. </w:t>
+        <w:t xml:space="preserve">above pins the exact release measured in this manuscript (Sec. </w:t>
       </w:r>
       <w:hyperlink w:anchor="sec:format">
         <w:r>
@@ -742,7 +818,7 @@
         </w:r>
       </w:hyperlink>
       <w:r>
-        <w:t xml:space="preserve">.</w:t>
+        <w:t xml:space="preserve">).</w:t>
       </w:r>
     </w:p>
     <w:bookmarkStart w:id="9" w:name="X22b48b7b459c7d36a584115c3178f04b0b53450"/>
@@ -1696,25 +1772,19 @@
         <w:t xml:space="preserve"> </w:t>
       </w:r>
       <w:r>
-        <w:t xml:space="preserve">segmented to the edge. This is not a limitation reported by its authors: their evaluation</w:t>
-      </w:r>
-      <w:r>
-        <w:t xml:space="preserve"> </w:t>
-      </w:r>
-      <w:r>
-        <w:t xml:space="preserve">excluded subjects in which the last rib was not visible, and their failure analysis</w:t>
-      </w:r>
-      <w:r>
-        <w:t xml:space="preserve"> </w:t>
-      </w:r>
-      <w:r>
-        <w:t xml:space="preserve">attributes errors to costal-process fusion, so it is recorded here as an observation</w:t>
-      </w:r>
-      <w:r>
-        <w:t xml:space="preserve"> </w:t>
-      </w:r>
-      <w:r>
-        <w:t xml:space="preserve">from this cohort. Since this is a colonography cohort, the lower ribs are routinely</w:t>
+        <w:t xml:space="preserve">segmented to the edge. Its authors do not report this: their evaluation excluded subjects</w:t>
+      </w:r>
+      <w:r>
+        <w:t xml:space="preserve"> </w:t>
+      </w:r>
+      <w:r>
+        <w:t xml:space="preserve">whose last rib was not visible, so it is recorded here as an observation from this</w:t>
+      </w:r>
+      <w:r>
+        <w:t xml:space="preserve"> </w:t>
+      </w:r>
+      <w:r>
+        <w:t xml:space="preserve">cohort. Since this is a colonography cohort, the lower ribs are routinely</w:t>
       </w:r>
       <w:r>
         <w:t xml:space="preserve"> </w:t>
@@ -1809,31 +1879,13 @@
         <w:pStyle w:val="BodyText"/>
       </w:pPr>
       <w:r>
-        <w:t xml:space="preserve">The result is a pseudolabel whose review was triaged rather than exhaustive, which is worth</w:t>
-      </w:r>
-      <w:r>
-        <w:t xml:space="preserve"> </w:t>
-      </w:r>
-      <w:r>
-        <w:t xml:space="preserve">stating plainly because a layer described only as</w:t>
-      </w:r>
-      <w:r>
-        <w:t xml:space="preserve"> </w:t>
-      </w:r>
-      <w:r>
-        <w:t xml:space="preserve">“human-corrected”</w:t>
-      </w:r>
-      <w:r>
-        <w:t xml:space="preserve"> </w:t>
-      </w:r>
-      <w:r>
-        <w:t xml:space="preserve">invites the reader to</w:t>
-      </w:r>
-      <w:r>
-        <w:t xml:space="preserve"> </w:t>
-      </w:r>
-      <w:r>
-        <w:t xml:space="preserve">assume every bone was looked at. A label-based rule flagged every record in which one rib</w:t>
+        <w:t xml:space="preserve">The result is a pseudolabel whose review was triaged rather than exhaustive. A label-based</w:t>
+      </w:r>
+      <w:r>
+        <w:t xml:space="preserve"> </w:t>
+      </w:r>
+      <w:r>
+        <w:t xml:space="preserve">rule flagged every record in which one rib</w:t>
       </w:r>
       <w:r>
         <w:t xml:space="preserve"> </w:t>
@@ -2543,25 +2595,19 @@
         <w:t xml:space="preserve"> </w:t>
       </w:r>
       <w:r>
-        <w:t xml:space="preserve">Every processing step described above is performed by code released under an</w:t>
-      </w:r>
-      <w:r>
-        <w:t xml:space="preserve"> </w:t>
-      </w:r>
-      <w:r>
-        <w:t xml:space="preserve">open-source licence and archived with the dataset; no step depends on software that is not</w:t>
-      </w:r>
-      <w:r>
-        <w:t xml:space="preserve"> </w:t>
-      </w:r>
-      <w:r>
-        <w:t xml:space="preserve">publicly obtainable. The release archive carries the reference loader, the label-scheme</w:t>
-      </w:r>
-      <w:r>
-        <w:t xml:space="preserve"> </w:t>
-      </w:r>
-      <w:r>
-        <w:t xml:space="preserve">definition and the quality-control scripts that generated the tables in this manuscript.</w:t>
+        <w:t xml:space="preserve">Every step is performed by open-source code archived with the dataset,</w:t>
+      </w:r>
+      <w:r>
+        <w:t xml:space="preserve"> </w:t>
+      </w:r>
+      <w:r>
+        <w:t xml:space="preserve">together with the reference loader, the label scheme and the quality-control scripts that</w:t>
+      </w:r>
+      <w:r>
+        <w:t xml:space="preserve"> </w:t>
+      </w:r>
+      <w:r>
+        <w:t xml:space="preserve">generated the tables in this manuscript.</w:t>
       </w:r>
     </w:p>
     <w:p>
@@ -3186,13 +3232,7 @@
         <w:t xml:space="preserve"> </w:t>
       </w:r>
       <w:r>
-        <w:t xml:space="preserve">six alike, and seven of the 33 graded cases carry a perfectly normal count of five. A</w:t>
-      </w:r>
-      <w:r>
-        <w:t xml:space="preserve"> </w:t>
-      </w:r>
-      <w:r>
-        <w:t xml:space="preserve">corpus that recorded only the count would describe those seven as unremarkable.</w:t>
+        <w:t xml:space="preserve">six alike, and seven of the 33 graded cases carry a normal count of five.</w:t>
       </w:r>
     </w:p>
     <w:p>
@@ -5278,13 +5318,7 @@
         <w:t xml:space="preserve"> </w:t>
       </w:r>
       <w:r>
-        <w:t xml:space="preserve">The failure is structural rather than careless:</w:t>
-      </w:r>
-      <w:r>
-        <w:t xml:space="preserve"> </w:t>
-      </w:r>
-      <w:r>
-        <w:t xml:space="preserve">the count is ambiguous exactly where the variant sits. Per-level body height, canal width,</w:t>
+        <w:t xml:space="preserve">Per-level body height, canal width,</w:t>
       </w:r>
       <w:r>
         <w:t xml:space="preserve"> </w:t>
@@ -5935,7 +5969,7 @@
         <w:t xml:space="preserve"> </w:t>
       </w:r>
       <w:r>
-        <w:t xml:space="preserve">invites a different comparison, since it segments far more of the body than any single source used here. But its label scheme simply has no class for a sixth lumbar vertebra or for a rib on a lumbar body. A six-lumbar spine cannot be recorded in it: the column must be renumbered or a level dropped to fit. What this release adds, then, is not more anatomy per scan (TotalSegmentator already covers more), but the specific classes an enumeration anomaly needs in order to be recorded accurately.</w:t>
+        <w:t xml:space="preserve">segments far more of the body than any source used here but has no class for a sixth lumbar vertebra or a rib on a lumbar body; what this release adds is not more anatomy per scan but the classes an enumeration anomaly needs in order to be recorded accurately.</w:t>
       </w:r>
     </w:p>
     <w:p>
@@ -6586,19 +6620,72 @@
         <w:pStyle w:val="BodyText"/>
       </w:pPr>
       <w:r>
-        <w:t xml:space="preserve">M. R. Zindrick et al.,</w:t>
-      </w:r>
-      <w:r>
-        <w:t xml:space="preserve"> </w:t>
-      </w:r>
-      <w:r>
-        <w:t xml:space="preserve">Analysis of the morphometric characteristics of the thoracic and lumbar pedicles,</w:t>
-      </w:r>
-      <w:r>
-        <w:t xml:space="preserve"> </w:t>
-      </w:r>
-      <w:r>
-        <w:t xml:space="preserve">Spine (Phila. Pa. 1976)</w:t>
+        <w:t xml:space="preserve">K. Smith et al.,</w:t>
+      </w:r>
+      <w:r>
+        <w:t xml:space="preserve"> </w:t>
+      </w:r>
+      <w:r>
+        <w:t xml:space="preserve">Data from</w:t>
+      </w:r>
+      <w:r>
+        <w:t xml:space="preserve"> </w:t>
+      </w:r>
+      <w:r>
+        <w:t xml:space="preserve">CT COLONOGRAPHY</w:t>
+      </w:r>
+      <w:r>
+        <w:t xml:space="preserve">,</w:t>
+      </w:r>
+      <w:r>
+        <w:t xml:space="preserve"> </w:t>
+      </w:r>
+      <w:r>
+        <w:t xml:space="preserve">The Cancer Imaging Archive, 2015,</w:t>
+      </w:r>
+      <w:r>
+        <w:t xml:space="preserve"> </w:t>
+      </w:r>
+      <w:r>
+        <w:t xml:space="preserve">doi:10.7937/K9/TCIA.2015.NWTESAY1.</w:t>
+      </w:r>
+    </w:p>
+    <w:p>
+      <w:pPr>
+        <w:pStyle w:val="BodyText"/>
+      </w:pPr>
+      <w:r>
+        <w:t xml:space="preserve">K. Clark et al.,</w:t>
+      </w:r>
+      <w:r>
+        <w:t xml:space="preserve"> </w:t>
+      </w:r>
+      <w:r>
+        <w:t xml:space="preserve">The</w:t>
+      </w:r>
+      <w:r>
+        <w:t xml:space="preserve"> </w:t>
+      </w:r>
+      <w:r>
+        <w:t xml:space="preserve">Cancer Imaging Archive</w:t>
+      </w:r>
+      <w:r>
+        <w:t xml:space="preserve"> </w:t>
+      </w:r>
+      <w:r>
+        <w:t xml:space="preserve">(</w:t>
+      </w:r>
+      <w:r>
+        <w:t xml:space="preserve">TCIA</w:t>
+      </w:r>
+      <w:r>
+        <w:t xml:space="preserve">): maintaining and operating a public information repository,</w:t>
+      </w:r>
+      <w:r>
+        <w:t xml:space="preserve"> </w:t>
+      </w:r>
+      <w:r>
+        <w:t xml:space="preserve">J. Digit. Imaging</w:t>
       </w:r>
       <w:r>
         <w:t xml:space="preserve"> </w:t>
@@ -6608,16 +6695,16 @@
           <w:b/>
           <w:bCs/>
         </w:rPr>
-        <w:t xml:space="preserve">12</w:t>
-      </w:r>
-      <w:r>
-        <w:t xml:space="preserve">, 160–166 (1987),</w:t>
-      </w:r>
-      <w:r>
-        <w:t xml:space="preserve"> </w:t>
-      </w:r>
-      <w:r>
-        <w:t xml:space="preserve">doi:10.1097/00007632-198703000-00012.</w:t>
+        <w:t xml:space="preserve">26</w:t>
+      </w:r>
+      <w:r>
+        <w:t xml:space="preserve">, 1045–1057 (2013),</w:t>
+      </w:r>
+      <w:r>
+        <w:t xml:space="preserve"> </w:t>
+      </w:r>
+      <w:r>
+        <w:t xml:space="preserve">doi:10.1007/s10278-013-9622-7.</w:t>
       </w:r>
     </w:p>
     <w:p>
@@ -6625,13 +6712,13 @@
         <w:pStyle w:val="BodyText"/>
       </w:pPr>
       <w:r>
-        <w:t xml:space="preserve">M. M. Panjabi et al.,</w:t>
-      </w:r>
-      <w:r>
-        <w:t xml:space="preserve"> </w:t>
-      </w:r>
-      <w:r>
-        <w:t xml:space="preserve">Thoracic human vertebrae: quantitative three-dimensional anatomy,</w:t>
+        <w:t xml:space="preserve">M. R. Zindrick et al.,</w:t>
+      </w:r>
+      <w:r>
+        <w:t xml:space="preserve"> </w:t>
+      </w:r>
+      <w:r>
+        <w:t xml:space="preserve">Analysis of the morphometric characteristics of the thoracic and lumbar pedicles,</w:t>
       </w:r>
       <w:r>
         <w:t xml:space="preserve"> </w:t>
@@ -6647,16 +6734,16 @@
           <w:b/>
           <w:bCs/>
         </w:rPr>
-        <w:t xml:space="preserve">16</w:t>
-      </w:r>
-      <w:r>
-        <w:t xml:space="preserve">, 888–901 (1991),</w:t>
-      </w:r>
-      <w:r>
-        <w:t xml:space="preserve"> </w:t>
-      </w:r>
-      <w:r>
-        <w:t xml:space="preserve">doi:10.1097/00007632-199108000-00006.</w:t>
+        <w:t xml:space="preserve">12</w:t>
+      </w:r>
+      <w:r>
+        <w:t xml:space="preserve">, 160–166 (1987),</w:t>
+      </w:r>
+      <w:r>
+        <w:t xml:space="preserve"> </w:t>
+      </w:r>
+      <w:r>
+        <w:t xml:space="preserve">doi:10.1097/00007632-198703000-00012.</w:t>
       </w:r>
     </w:p>
     <w:p>
@@ -6670,7 +6757,7 @@
         <w:t xml:space="preserve"> </w:t>
       </w:r>
       <w:r>
-        <w:t xml:space="preserve">Human lumbar vertebrae: quantitative three-dimensional anatomy,</w:t>
+        <w:t xml:space="preserve">Thoracic human vertebrae: quantitative three-dimensional anatomy,</w:t>
       </w:r>
       <w:r>
         <w:t xml:space="preserve"> </w:t>
@@ -6686,16 +6773,16 @@
           <w:b/>
           <w:bCs/>
         </w:rPr>
-        <w:t xml:space="preserve">17</w:t>
-      </w:r>
-      <w:r>
-        <w:t xml:space="preserve">, 299–306 (1992),</w:t>
-      </w:r>
-      <w:r>
-        <w:t xml:space="preserve"> </w:t>
-      </w:r>
-      <w:r>
-        <w:t xml:space="preserve">doi:10.1097/00007632-199203000-00010.</w:t>
+        <w:t xml:space="preserve">16</w:t>
+      </w:r>
+      <w:r>
+        <w:t xml:space="preserve">, 888–901 (1991),</w:t>
+      </w:r>
+      <w:r>
+        <w:t xml:space="preserve"> </w:t>
+      </w:r>
+      <w:r>
+        <w:t xml:space="preserve">doi:10.1097/00007632-199108000-00006.</w:t>
       </w:r>
     </w:p>
     <w:p>
@@ -6703,48 +6790,19 @@
         <w:pStyle w:val="BodyText"/>
       </w:pPr>
       <w:r>
-        <w:t xml:space="preserve">E. C. Benzel,</w:t>
-      </w:r>
-      <w:r>
-        <w:t xml:space="preserve"> </w:t>
-      </w:r>
-      <w:r>
-        <w:t xml:space="preserve">,</w:t>
-      </w:r>
-      <w:r>
-        <w:t xml:space="preserve"> </w:t>
-      </w:r>
-      <w:r>
-        <w:t xml:space="preserve">Thieme, New York, 3rd edition, 2015.</w:t>
-      </w:r>
-    </w:p>
-    <w:p>
-      <w:pPr>
-        <w:pStyle w:val="BodyText"/>
-      </w:pPr>
-      <w:r>
-        <w:t xml:space="preserve">R. J. Hughes and A. Saifuddin,</w:t>
-      </w:r>
-      <w:r>
-        <w:t xml:space="preserve"> </w:t>
-      </w:r>
-      <w:r>
-        <w:t xml:space="preserve">Numbering of lumbosacral transitional vertebrae on</w:t>
-      </w:r>
-      <w:r>
-        <w:t xml:space="preserve"> </w:t>
-      </w:r>
-      <w:r>
-        <w:t xml:space="preserve">MRI</w:t>
-      </w:r>
-      <w:r>
-        <w:t xml:space="preserve">: role of the iliolumbar ligaments,</w:t>
-      </w:r>
-      <w:r>
-        <w:t xml:space="preserve"> </w:t>
-      </w:r>
-      <w:r>
-        <w:t xml:space="preserve">AJR Am. J. Roentgenol.</w:t>
+        <w:t xml:space="preserve">M. M. Panjabi et al.,</w:t>
+      </w:r>
+      <w:r>
+        <w:t xml:space="preserve"> </w:t>
+      </w:r>
+      <w:r>
+        <w:t xml:space="preserve">Human lumbar vertebrae: quantitative three-dimensional anatomy,</w:t>
+      </w:r>
+      <w:r>
+        <w:t xml:space="preserve"> </w:t>
+      </w:r>
+      <w:r>
+        <w:t xml:space="preserve">Spine (Phila. Pa. 1976)</w:t>
       </w:r>
       <w:r>
         <w:t xml:space="preserve"> </w:t>
@@ -6754,16 +6812,16 @@
           <w:b/>
           <w:bCs/>
         </w:rPr>
-        <w:t xml:space="preserve">187</w:t>
-      </w:r>
-      <w:r>
-        <w:t xml:space="preserve">, W59–W65 (2006),</w:t>
-      </w:r>
-      <w:r>
-        <w:t xml:space="preserve"> </w:t>
-      </w:r>
-      <w:r>
-        <w:t xml:space="preserve">doi:10.2214/AJR.05.0415.</w:t>
+        <w:t xml:space="preserve">17</w:t>
+      </w:r>
+      <w:r>
+        <w:t xml:space="preserve">, 299–306 (1992),</w:t>
+      </w:r>
+      <w:r>
+        <w:t xml:space="preserve"> </w:t>
+      </w:r>
+      <w:r>
+        <w:t xml:space="preserve">doi:10.1097/00007632-199203000-00010.</w:t>
       </w:r>
     </w:p>
     <w:p>
@@ -6771,19 +6829,48 @@
         <w:pStyle w:val="BodyText"/>
       </w:pPr>
       <w:r>
-        <w:t xml:space="preserve">L. Jin et al.,</w:t>
-      </w:r>
-      <w:r>
-        <w:t xml:space="preserve"> </w:t>
-      </w:r>
-      <w:r>
-        <w:t xml:space="preserve">v2: a large-scale benchmark for rib labeling and anatomical centerline extraction,</w:t>
-      </w:r>
-      <w:r>
-        <w:t xml:space="preserve"> </w:t>
-      </w:r>
-      <w:r>
-        <w:t xml:space="preserve">IEEE Trans. Med. Imaging</w:t>
+        <w:t xml:space="preserve">E. C. Benzel,</w:t>
+      </w:r>
+      <w:r>
+        <w:t xml:space="preserve"> </w:t>
+      </w:r>
+      <w:r>
+        <w:t xml:space="preserve">,</w:t>
+      </w:r>
+      <w:r>
+        <w:t xml:space="preserve"> </w:t>
+      </w:r>
+      <w:r>
+        <w:t xml:space="preserve">Thieme, New York, 3rd edition, 2015.</w:t>
+      </w:r>
+    </w:p>
+    <w:p>
+      <w:pPr>
+        <w:pStyle w:val="BodyText"/>
+      </w:pPr>
+      <w:r>
+        <w:t xml:space="preserve">R. J. Hughes and A. Saifuddin,</w:t>
+      </w:r>
+      <w:r>
+        <w:t xml:space="preserve"> </w:t>
+      </w:r>
+      <w:r>
+        <w:t xml:space="preserve">Numbering of lumbosacral transitional vertebrae on</w:t>
+      </w:r>
+      <w:r>
+        <w:t xml:space="preserve"> </w:t>
+      </w:r>
+      <w:r>
+        <w:t xml:space="preserve">MRI</w:t>
+      </w:r>
+      <w:r>
+        <w:t xml:space="preserve">: role of the iliolumbar ligaments,</w:t>
+      </w:r>
+      <w:r>
+        <w:t xml:space="preserve"> </w:t>
+      </w:r>
+      <w:r>
+        <w:t xml:space="preserve">AJR Am. J. Roentgenol.</w:t>
       </w:r>
       <w:r>
         <w:t xml:space="preserve"> </w:t>
@@ -6793,16 +6880,16 @@
           <w:b/>
           <w:bCs/>
         </w:rPr>
-        <w:t xml:space="preserve">43</w:t>
-      </w:r>
-      <w:r>
-        <w:t xml:space="preserve">, 570–581 (2024),</w:t>
-      </w:r>
-      <w:r>
-        <w:t xml:space="preserve"> </w:t>
-      </w:r>
-      <w:r>
-        <w:t xml:space="preserve">doi:10.1109/TMI.2023.3313627.</w:t>
+        <w:t xml:space="preserve">187</w:t>
+      </w:r>
+      <w:r>
+        <w:t xml:space="preserve">, W59–W65 (2006),</w:t>
+      </w:r>
+      <w:r>
+        <w:t xml:space="preserve"> </w:t>
+      </w:r>
+      <w:r>
+        <w:t xml:space="preserve">doi:10.2214/AJR.05.0415.</w:t>
       </w:r>
     </w:p>
     <w:p>
@@ -6810,72 +6897,19 @@
         <w:pStyle w:val="BodyText"/>
       </w:pPr>
       <w:r>
-        <w:t xml:space="preserve">K. Smith et al.,</w:t>
-      </w:r>
-      <w:r>
-        <w:t xml:space="preserve"> </w:t>
-      </w:r>
-      <w:r>
-        <w:t xml:space="preserve">Data from</w:t>
-      </w:r>
-      <w:r>
-        <w:t xml:space="preserve"> </w:t>
-      </w:r>
-      <w:r>
-        <w:t xml:space="preserve">CT COLONOGRAPHY</w:t>
-      </w:r>
-      <w:r>
-        <w:t xml:space="preserve">,</w:t>
-      </w:r>
-      <w:r>
-        <w:t xml:space="preserve"> </w:t>
-      </w:r>
-      <w:r>
-        <w:t xml:space="preserve">The Cancer Imaging Archive, 2015,</w:t>
-      </w:r>
-      <w:r>
-        <w:t xml:space="preserve"> </w:t>
-      </w:r>
-      <w:r>
-        <w:t xml:space="preserve">doi:10.7937/K9/TCIA.2015.NWTESAY1.</w:t>
-      </w:r>
-    </w:p>
-    <w:p>
-      <w:pPr>
-        <w:pStyle w:val="BodyText"/>
-      </w:pPr>
-      <w:r>
-        <w:t xml:space="preserve">K. Clark et al.,</w:t>
-      </w:r>
-      <w:r>
-        <w:t xml:space="preserve"> </w:t>
-      </w:r>
-      <w:r>
-        <w:t xml:space="preserve">The</w:t>
-      </w:r>
-      <w:r>
-        <w:t xml:space="preserve"> </w:t>
-      </w:r>
-      <w:r>
-        <w:t xml:space="preserve">Cancer Imaging Archive</w:t>
-      </w:r>
-      <w:r>
-        <w:t xml:space="preserve"> </w:t>
-      </w:r>
-      <w:r>
-        <w:t xml:space="preserve">(</w:t>
-      </w:r>
-      <w:r>
-        <w:t xml:space="preserve">TCIA</w:t>
-      </w:r>
-      <w:r>
-        <w:t xml:space="preserve">): maintaining and operating a public information repository,</w:t>
-      </w:r>
-      <w:r>
-        <w:t xml:space="preserve"> </w:t>
-      </w:r>
-      <w:r>
-        <w:t xml:space="preserve">J. Digit. Imaging</w:t>
+        <w:t xml:space="preserve">L. Jin et al.,</w:t>
+      </w:r>
+      <w:r>
+        <w:t xml:space="preserve"> </w:t>
+      </w:r>
+      <w:r>
+        <w:t xml:space="preserve">v2: a large-scale benchmark for rib labeling and anatomical centerline extraction,</w:t>
+      </w:r>
+      <w:r>
+        <w:t xml:space="preserve"> </w:t>
+      </w:r>
+      <w:r>
+        <w:t xml:space="preserve">IEEE Trans. Med. Imaging</w:t>
       </w:r>
       <w:r>
         <w:t xml:space="preserve"> </w:t>
@@ -6885,16 +6919,16 @@
           <w:b/>
           <w:bCs/>
         </w:rPr>
-        <w:t xml:space="preserve">26</w:t>
-      </w:r>
-      <w:r>
-        <w:t xml:space="preserve">, 1045–1057 (2013),</w:t>
-      </w:r>
-      <w:r>
-        <w:t xml:space="preserve"> </w:t>
-      </w:r>
-      <w:r>
-        <w:t xml:space="preserve">doi:10.1007/s10278-013-9622-7.</w:t>
+        <w:t xml:space="preserve">43</w:t>
+      </w:r>
+      <w:r>
+        <w:t xml:space="preserve">, 570–581 (2024),</w:t>
+      </w:r>
+      <w:r>
+        <w:t xml:space="preserve"> </w:t>
+      </w:r>
+      <w:r>
+        <w:t xml:space="preserve">doi:10.1109/TMI.2023.3313627.</w:t>
       </w:r>
     </w:p>
     <w:p>

</xml_diff>

<commit_message>
why 802 and not 1,005: the release is the COLONOG subset common to both sources, 782 + 20
Co-Authored-By: Claude Fable 5.1 <noreply@anthropic.com>
</commit_message>
<xml_diff>
--- a/paper/mpda/CTSpinoPelvic1K_review.docx
+++ b/paper/mpda/CTSpinoPelvic1K_review.docx
@@ -1460,13 +1460,49 @@
         <w:t xml:space="preserve"> </w:t>
       </w:r>
       <w:r>
-        <w:t xml:space="preserve">board-certified radiologist supervision. Neither released the mapping from an</w:t>
-      </w:r>
-      <w:r>
-        <w:t xml:space="preserve"> </w:t>
-      </w:r>
-      <w:r>
-        <w:t xml:space="preserve">annotation to the specific CT series it was drawn on.</w:t>
+        <w:t xml:space="preserve">board-certified radiologist supervision. CTSpine1K’s 1</w:t>
+      </w:r>
+      <w:r>
+        <w:t xml:space="preserve">,</w:t>
+      </w:r>
+      <w:r>
+        <w:t xml:space="preserve">005 volumes come from four</w:t>
+      </w:r>
+      <w:r>
+        <w:t xml:space="preserve"> </w:t>
+      </w:r>
+      <w:r>
+        <w:t xml:space="preserve">collections and CTPelvic1K’s 1</w:t>
+      </w:r>
+      <w:r>
+        <w:t xml:space="preserve">,</w:t>
+      </w:r>
+      <w:r>
+        <w:t xml:space="preserve">184 from seven; COLONOG is the only collection common to</w:t>
+      </w:r>
+      <w:r>
+        <w:t xml:space="preserve"> </w:t>
+      </w:r>
+      <w:r>
+        <w:t xml:space="preserve">both and the only one acquired under a single protocol, so this release is its COLONOG</w:t>
+      </w:r>
+      <w:r>
+        <w:t xml:space="preserve"> </w:t>
+      </w:r>
+      <w:r>
+        <w:t xml:space="preserve">subset: 782 patients with a CTSpine1K vertebral annotation and 20 with a CTPelvic1K pelvic</w:t>
+      </w:r>
+      <w:r>
+        <w:t xml:space="preserve"> </w:t>
+      </w:r>
+      <w:r>
+        <w:t xml:space="preserve">annotation only, 802 in all. Neither source released the mapping from an annotation to the</w:t>
+      </w:r>
+      <w:r>
+        <w:t xml:space="preserve"> </w:t>
+      </w:r>
+      <w:r>
+        <w:t xml:space="preserve">specific CT series it was drawn on.</w:t>
       </w:r>
     </w:p>
     <w:p>
@@ -1607,7 +1643,7 @@
         </w:r>
       </w:hyperlink>
       <w:r>
-        <w:t xml:space="preserve">). This turned out to matter for 351 patients, nearly half the cohort: the two collections had labeled different acquisitions of the same person, one prone and one supine, with neither recording which. Because posture changes spinal alignment, a spine label from one acquisition cannot simply be paired with a pelvic label from the other. These 351 records are released but held out of any analysis that assumes a single posture. Two labeled acquisitions of the same patient in different postures are, instead, a resource for studying postural alignment, not a defect.</w:t>
+        <w:t xml:space="preserve">). This turned out to matter for 351 patients, nearly half the cohort: the two collections had labeled different acquisitions of the same person, one prone and one supine, with neither recording which. Because posture changes spinal alignment, a spine label from one acquisition cannot simply be paired with a pelvic label from the other. These 351 records are released but held out of any analysis that assumes a single posture; two labeled postures of one patient are a resource for studying alignment, not a defect.</w:t>
       </w:r>
     </w:p>
     <w:bookmarkEnd w:id="13"/>
@@ -5261,13 +5297,7 @@
         <w:t xml:space="preserve"> </w:t>
       </w:r>
       <w:r>
-        <w:t xml:space="preserve">planned across a junction whose segments cannot be named. Level-numbering benchmarks,</w:t>
-      </w:r>
-      <w:r>
-        <w:t xml:space="preserve"> </w:t>
-      </w:r>
-      <w:r>
-        <w:t xml:space="preserve">variant studies and opportunistic screening follow from the same annotation.</w:t>
+        <w:t xml:space="preserve">planned across a junction whose segments cannot be named.</w:t>
       </w:r>
     </w:p>
     <w:bookmarkStart w:id="53" w:name="X1e405bcd3081b4ebb91076491188f6b710d9489"/>

</xml_diff>

<commit_message>
three tightenings to hold ten pages
Co-Authored-By: Claude Fable 5.1 <noreply@anthropic.com>
</commit_message>
<xml_diff>
--- a/paper/mpda/CTSpinoPelvic1K_review.docx
+++ b/paper/mpda/CTSpinoPelvic1K_review.docx
@@ -1895,19 +1895,19 @@
         </w:r>
       </w:hyperlink>
       <w:r>
-        <w:t xml:space="preserve">): TotalSegmentator supplies</w:t>
-      </w:r>
-      <w:r>
-        <w:t xml:space="preserve"> </w:t>
-      </w:r>
-      <w:r>
-        <w:t xml:space="preserve">numbering and the medial-clipped cases, Möller supplies detection where its output is more</w:t>
-      </w:r>
-      <w:r>
-        <w:t xml:space="preserve"> </w:t>
-      </w:r>
-      <w:r>
-        <w:t xml:space="preserve">complete, and the union carries TotalSegmentator’s per-level identities.</w:t>
+        <w:t xml:space="preserve">), TotalSegmentator supplying the</w:t>
+      </w:r>
+      <w:r>
+        <w:t xml:space="preserve"> </w:t>
+      </w:r>
+      <w:r>
+        <w:t xml:space="preserve">numbering and the medial-clipped cases, Möller the detection where its output is more</w:t>
+      </w:r>
+      <w:r>
+        <w:t xml:space="preserve"> </w:t>
+      </w:r>
+      <w:r>
+        <w:t xml:space="preserve">complete.</w:t>
       </w:r>
     </w:p>
     <w:p>
@@ -3779,13 +3779,7 @@
         <w:t xml:space="preserve"> </w:t>
       </w:r>
       <w:r>
-        <w:t xml:space="preserve">vertebra does. An unrecorded instrumented case is therefore a false positive on the central</w:t>
-      </w:r>
-      <w:r>
-        <w:t xml:space="preserve"> </w:t>
-      </w:r>
-      <w:r>
-        <w:t xml:space="preserve">measure.</w:t>
+        <w:t xml:space="preserve">vertebra does.</w:t>
       </w:r>
     </w:p>
     <w:bookmarkStart w:id="26" w:name="X6ccedf8a194116531bb518b375b53d9e1e007e9"/>
@@ -4230,19 +4224,7 @@
         <w:t xml:space="preserve"> </w:t>
       </w:r>
       <w:r>
-        <w:t xml:space="preserve">canonicalized to PIR, requiring no resampling. Masks are NIfTI rather than DICOM: the</w:t>
-      </w:r>
-      <w:r>
-        <w:t xml:space="preserve"> </w:t>
-      </w:r>
-      <w:r>
-        <w:t xml:space="preserve">policy prefers DICOM where applicable, and for volumetric segmentation masks NIfTI is</w:t>
-      </w:r>
-      <w:r>
-        <w:t xml:space="preserve"> </w:t>
-      </w:r>
-      <w:r>
-        <w:t xml:space="preserve">what the downstream tooling expects.</w:t>
+        <w:t xml:space="preserve">canonicalized to PIR, requiring no resampling. Masks are NIfTI rather than DICOM, which is what volumetric segmentation tooling expects.</w:t>
       </w:r>
     </w:p>
     <w:p>

</xml_diff>

<commit_message>
the case for the field of view rests on the imaging guidelines: ACR 2021 and NASS 2013 (regional lumbar imaging), ACS TQIP 2018 (whole spine only for identified trauma injury); bibliography sorted by first citation; ten pages
Co-Authored-By: Claude Fable 5.1 <noreply@anthropic.com>
</commit_message>
<xml_diff>
--- a/paper/mpda/CTSpinoPelvic1K_review.docx
+++ b/paper/mpda/CTSpinoPelvic1K_review.docx
@@ -50,13 +50,25 @@
         <w:t xml:space="preserve">whole-spine imaging and counting caudally from C2 </w:t>
       </w:r>
       <w:r>
-        <w:t xml:space="preserve">. Abdominal CT does not</w:t>
-      </w:r>
-      <w:r>
-        <w:t xml:space="preserve"> </w:t>
-      </w:r>
-      <w:r>
-        <w:t xml:space="preserve">contain C2, and where a lumbosacral</w:t>
+        <w:t xml:space="preserve">. The imaging a lumbar</w:t>
+      </w:r>
+      <w:r>
+        <w:t xml:space="preserve"> </w:t>
+      </w:r>
+      <w:r>
+        <w:t xml:space="preserve">case is planned on is regional by guideline </w:t>
+      </w:r>
+      <w:r>
+        <w:t xml:space="preserve"> </w:t>
+      </w:r>
+      <w:r>
+        <w:t xml:space="preserve">and never contains C2, and where</w:t>
+      </w:r>
+      <w:r>
+        <w:t xml:space="preserve"> </w:t>
+      </w:r>
+      <w:r>
+        <w:t xml:space="preserve">a lumbosacral</w:t>
       </w:r>
       <w:r>
         <w:t xml:space="preserve"> </w:t>
@@ -195,7 +207,7 @@
         <w:t xml:space="preserve"> </w:t>
       </w:r>
       <w:r>
-        <w:t xml:space="preserve">Gzipped NIfTI image/label pairs sharing one affine, canonicalized to PIR, with frozen patient-grouped LSTV-stratified five-fold splits and a reference loader; archived under a persistent identifier, .</w:t>
+        <w:t xml:space="preserve">Gzipped NIfTI image/label pairs sharing one affine, canonicalized to PIR, with frozen patient-grouped LSTV-stratified five-fold splits and a reference loader; archived at .</w:t>
       </w:r>
     </w:p>
     <w:p>
@@ -213,13 +225,13 @@
         <w:t xml:space="preserve"> </w:t>
       </w:r>
       <w:r>
-        <w:t xml:space="preserve">Testing whether a network can classify a vertebra from</w:t>
-      </w:r>
-      <w:r>
-        <w:t xml:space="preserve"> </w:t>
-      </w:r>
-      <w:r>
-        <w:t xml:space="preserve">local features alone; updating textbook morphometry drawn from small cadaveric series;</w:t>
+        <w:t xml:space="preserve">Classifying a vertebra from local features alone;</w:t>
+      </w:r>
+      <w:r>
+        <w:t xml:space="preserve"> </w:t>
+      </w:r>
+      <w:r>
+        <w:t xml:space="preserve">updating textbook morphometry from small cadaveric series;</w:t>
       </w:r>
       <w:r>
         <w:t xml:space="preserve"> </w:t>
@@ -691,13 +703,34 @@
         <w:t xml:space="preserve"> </w:t>
       </w:r>
       <w:r>
-        <w:t xml:space="preserve">anatomy in front of the reader, on the abdominal and spine-limited images a surgeon actually</w:t>
-      </w:r>
-      <w:r>
-        <w:t xml:space="preserve"> </w:t>
-      </w:r>
-      <w:r>
-        <w:t xml:space="preserve">has, in the patients where counting fails. The cohort suits that question. Every record</w:t>
+        <w:t xml:space="preserve">anatomy in front of the reader, on the images a lumbar case is actually planned on: by</w:t>
+      </w:r>
+      <w:r>
+        <w:t xml:space="preserve"> </w:t>
+      </w:r>
+      <w:r>
+        <w:t xml:space="preserve">guideline those are regional lumbar studies </w:t>
+      </w:r>
+      <w:r>
+        <w:t xml:space="preserve">, and whole-spine</w:t>
+      </w:r>
+      <w:r>
+        <w:t xml:space="preserve"> </w:t>
+      </w:r>
+      <w:r>
+        <w:t xml:space="preserve">coverage is reserved for trauma with an identified injury </w:t>
+      </w:r>
+      <w:r>
+        <w:t xml:space="preserve"> </w:t>
+      </w:r>
+      <w:r>
+        <w:t xml:space="preserve">and for deformity</w:t>
+      </w:r>
+      <w:r>
+        <w:t xml:space="preserve"> </w:t>
+      </w:r>
+      <w:r>
+        <w:t xml:space="preserve">radiographs. The cohort suits that question. Every record</w:t>
       </w:r>
       <w:r>
         <w:t xml:space="preserve"> </w:t>
@@ -1814,19 +1847,13 @@
         <w:t xml:space="preserve"> </w:t>
       </w:r>
       <w:r>
-        <w:t xml:space="preserve">whose last rib was not visible, so it is recorded here as an observation from this</w:t>
-      </w:r>
-      <w:r>
-        <w:t xml:space="preserve"> </w:t>
-      </w:r>
-      <w:r>
-        <w:t xml:space="preserve">cohort. Since this is a colonography cohort, the lower ribs are routinely</w:t>
-      </w:r>
-      <w:r>
-        <w:t xml:space="preserve"> </w:t>
-      </w:r>
-      <w:r>
-        <w:t xml:space="preserve">clipped, and those are precisely the ribs the count depends on.</w:t>
+        <w:t xml:space="preserve">whose last rib was not visible, so it is recorded here as an observation from this cohort. In a colonography cohort the lower ribs are routinely clipped, and</w:t>
+      </w:r>
+      <w:r>
+        <w:t xml:space="preserve"> </w:t>
+      </w:r>
+      <w:r>
+        <w:t xml:space="preserve">those are the ribs the count depends on.</w:t>
       </w:r>
     </w:p>
     <w:p>
@@ -2204,19 +2231,19 @@
         </m:sSup>
       </m:oMath>
       <w:r>
-        <w:t xml:space="preserve">. The level of the cut preserves the sub-division volume of the preceding</w:t>
-      </w:r>
-      <w:r>
-        <w:t xml:space="preserve"> </w:t>
-      </w:r>
-      <w:r>
-        <w:t xml:space="preserve">release, so the plane changes the shape and orientation of the S1/S2 boundary and not how</w:t>
-      </w:r>
-      <w:r>
-        <w:t xml:space="preserve"> </w:t>
-      </w:r>
-      <w:r>
-        <w:t xml:space="preserve">much of the sacrum is called S1. Per-record geometry ships with the archive.</w:t>
+        <w:t xml:space="preserve">. The cut preserves the sub-division volume of the preceding release,</w:t>
+      </w:r>
+      <w:r>
+        <w:t xml:space="preserve"> </w:t>
+      </w:r>
+      <w:r>
+        <w:t xml:space="preserve">changing the orientation of the S1/S2 boundary and not how much sacrum is called S1;</w:t>
+      </w:r>
+      <w:r>
+        <w:t xml:space="preserve"> </w:t>
+      </w:r>
+      <w:r>
+        <w:t xml:space="preserve">per-record geometry ships with the archive.</w:t>
       </w:r>
     </w:p>
     <w:p>
@@ -2821,13 +2848,13 @@
         <w:pStyle w:val="FirstParagraph"/>
       </w:pPr>
       <w:r>
-        <w:t xml:space="preserve">Validation is layered, and the ordering matters: measurements computed on a corpus that</w:t>
-      </w:r>
-      <w:r>
-        <w:t xml:space="preserve"> </w:t>
-      </w:r>
-      <w:r>
-        <w:t xml:space="preserve">has not established internal consistency do not look broken, they look finished.</w:t>
+        <w:t xml:space="preserve">Validation is layered: measurements on a corpus that has not established internal</w:t>
+      </w:r>
+      <w:r>
+        <w:t xml:space="preserve"> </w:t>
+      </w:r>
+      <w:r>
+        <w:t xml:space="preserve">consistency do not look broken, they look finished.</w:t>
       </w:r>
     </w:p>
     <w:p>
@@ -3234,13 +3261,7 @@
         <w:t xml:space="preserve"> </w:t>
       </w:r>
       <w:r>
-        <w:t xml:space="preserve">unilateral–bilateral qualifier. This is released as an</w:t>
-      </w:r>
-      <w:r>
-        <w:t xml:space="preserve"> </w:t>
-      </w:r>
-      <w:r>
-        <w:t xml:space="preserve">annotation layer because the grade and the count are</w:t>
+        <w:t xml:space="preserve">unilateral–bilateral qualifier. The grade and the count are</w:t>
       </w:r>
       <w:r>
         <w:t xml:space="preserve"> </w:t>
@@ -3253,16 +3274,13 @@
         <w:t xml:space="preserve">different axes</w:t>
       </w:r>
       <w:r>
-        <w:t xml:space="preserve"> </w:t>
-      </w:r>
-      <w:r>
-        <w:t xml:space="preserve">and the dataset</w:t>
-      </w:r>
-      <w:r>
-        <w:t xml:space="preserve"> </w:t>
-      </w:r>
-      <w:r>
-        <w:t xml:space="preserve">is built to show that they are: grade IIIb occurs here at rib-free counts of four, five and</w:t>
+        <w:t xml:space="preserve">: grade</w:t>
+      </w:r>
+      <w:r>
+        <w:t xml:space="preserve"> </w:t>
+      </w:r>
+      <w:r>
+        <w:t xml:space="preserve">IIIb occurs here at rib-free counts of four, five and</w:t>
       </w:r>
       <w:r>
         <w:t xml:space="preserve"> </w:t>
@@ -3866,13 +3884,7 @@
         <w:t xml:space="preserve"> </w:t>
       </w:r>
       <w:r>
-        <w:t xml:space="preserve">or below. Instrumentation prevalence is 1.4%, not the</w:t>
-      </w:r>
-      <w:r>
-        <w:t xml:space="preserve"> </w:t>
-      </w:r>
-      <w:r>
-        <w:t xml:space="preserve">6.5% the threshold alone reports.</w:t>
+        <w:t xml:space="preserve">or below.</w:t>
       </w:r>
     </w:p>
     <w:bookmarkEnd w:id="26"/>
@@ -4020,19 +4032,13 @@
         <w:t xml:space="preserve"> </w:t>
       </w:r>
       <w:r>
-        <w:t xml:space="preserve">than adding them. Pelvic incidence and tilt are measured from the femoral head center, and</w:t>
-      </w:r>
-      <w:r>
-        <w:t xml:space="preserve"> </w:t>
-      </w:r>
-      <w:r>
-        <w:t xml:space="preserve">in 8 of these cases that head is an implant: any spinopelvic parameter previously computed</w:t>
-      </w:r>
-      <w:r>
-        <w:t xml:space="preserve"> </w:t>
-      </w:r>
-      <w:r>
-        <w:t xml:space="preserve">from them was measured on metal.</w:t>
+        <w:t xml:space="preserve">than adding them. In 8 of these cases the femoral head that pelvic incidence and tilt are</w:t>
+      </w:r>
+      <w:r>
+        <w:t xml:space="preserve"> </w:t>
+      </w:r>
+      <w:r>
+        <w:t xml:space="preserve">measured from is an implant.</w:t>
       </w:r>
     </w:p>
     <w:bookmarkStart w:id="31" w:name="fig:hardware"/>
@@ -4043,7 +4049,7 @@
       <w:r>
         <w:drawing>
           <wp:inline>
-            <wp:extent cx="5334000" cy="1291500"/>
+            <wp:extent cx="5334000" cy="1228500"/>
             <wp:effectExtent b="0" l="0" r="0" t="0"/>
             <wp:docPr descr="" title="" id="29" name="Picture"/>
             <a:graphic>
@@ -4064,7 +4070,7 @@
                   <pic:spPr bwMode="auto">
                     <a:xfrm>
                       <a:off x="0" y="0"/>
-                      <a:ext cx="5334000" cy="1291500"/>
+                      <a:ext cx="5334000" cy="1228500"/>
                     </a:xfrm>
                     <a:prstGeom prst="rect">
                       <a:avLst/>
@@ -4964,13 +4970,7 @@
         <w:t xml:space="preserve"> </w:t>
       </w:r>
       <w:r>
-        <w:t xml:space="preserve">value, a recorded value and not a</w:t>
-      </w:r>
-      <w:r>
-        <w:t xml:space="preserve"> </w:t>
-      </w:r>
-      <w:r>
-        <w:t xml:space="preserve">missing one, and 53 carry no sex field. Age is present for 709 (median 59, range 50–89).</w:t>
+        <w:t xml:space="preserve">value and 53 no sex field. Age is present for 709 (median 59, range 50–89).</w:t>
       </w:r>
       <w:r>
         <w:t xml:space="preserve"> </w:t>
@@ -5073,19 +5073,13 @@
         <w:t xml:space="preserve"> </w:t>
       </w:r>
       <w:r>
-        <w:t xml:space="preserve">dimensions increase caudally in step with the load each level carries. Pelvic incidence</w:t>
-      </w:r>
-      <w:r>
-        <w:t xml:space="preserve"> </w:t>
-      </w:r>
-      <w:r>
-        <w:t xml:space="preserve">does not vary with age, while pelvic tilt increases, the descriptive signature of a</w:t>
-      </w:r>
-      <w:r>
-        <w:t xml:space="preserve"> </w:t>
-      </w:r>
-      <w:r>
-        <w:t xml:space="preserve">pelvis retroverting as a spine ages.</w:t>
+        <w:t xml:space="preserve">dimensions increase caudally; pelvic incidence does not vary with age while pelvic tilt</w:t>
+      </w:r>
+      <w:r>
+        <w:t xml:space="preserve"> </w:t>
+      </w:r>
+      <w:r>
+        <w:t xml:space="preserve">does, the signature of a pelvis retroverting as a spine ages.</w:t>
       </w:r>
     </w:p>
     <w:bookmarkStart w:id="43" w:name="fig:validation"/>
@@ -5514,33 +5508,7 @@
         <w:t xml:space="preserve"> </w:t>
       </w:r>
       <w:r>
-        <w:t xml:space="preserve">adding the width of each distribution, which is the part needed to judge an individual. A</w:t>
-      </w:r>
-      <w:r>
-        <w:t xml:space="preserve"> </w:t>
-      </w:r>
-      <w:r>
-        <w:t xml:space="preserve">larger</w:t>
-      </w:r>
-      <w:r>
-        <w:t xml:space="preserve"> </w:t>
-      </w:r>
-      <m:oMath>
-        <m:r>
-          <m:t>n</m:t>
-        </m:r>
-      </m:oMath>
-      <w:r>
-        <w:t xml:space="preserve"> </w:t>
-      </w:r>
-      <w:r>
-        <w:t xml:space="preserve">sharpens a distribution without changing the population it came from, and this</w:t>
-      </w:r>
-      <w:r>
-        <w:t xml:space="preserve"> </w:t>
-      </w:r>
-      <w:r>
-        <w:t xml:space="preserve">one is a screening cohort aged 50 and over.</w:t>
+        <w:t xml:space="preserve">adding the width of each distribution, which is the part needed to judge an individual.</w:t>
       </w:r>
     </w:p>
     <w:p>
@@ -5576,19 +5544,19 @@
         <w:t xml:space="preserve"> </w:t>
       </w:r>
       <w:r>
-        <w:t xml:space="preserve">femoral heads in one frame, which is this release’s construction. In 351 patients the</w:t>
-      </w:r>
-      <w:r>
-        <w:t xml:space="preserve"> </w:t>
-      </w:r>
-      <w:r>
-        <w:t xml:space="preserve">annotation sits on two acquisitions in different positions, giving a within-patient change in</w:t>
-      </w:r>
-      <w:r>
-        <w:t xml:space="preserve"> </w:t>
-      </w:r>
-      <w:r>
-        <w:t xml:space="preserve">alignment against which a predicted postural response can be checked.</w:t>
+        <w:t xml:space="preserve">femoral heads in one frame, which is this release’s construction; in 351 patients two</w:t>
+      </w:r>
+      <w:r>
+        <w:t xml:space="preserve"> </w:t>
+      </w:r>
+      <w:r>
+        <w:t xml:space="preserve">postures give a within-patient change in alignment against which a predicted postural</w:t>
+      </w:r>
+      <w:r>
+        <w:t xml:space="preserve"> </w:t>
+      </w:r>
+      <w:r>
+        <w:t xml:space="preserve">response can be checked.</w:t>
       </w:r>
     </w:p>
     <w:p>
@@ -5613,7 +5581,7 @@
       <w:r>
         <w:drawing>
           <wp:inline>
-            <wp:extent cx="2870200" cy="1549400"/>
+            <wp:extent cx="2870200" cy="1371600"/>
             <wp:effectExtent b="0" l="0" r="0" t="0"/>
             <wp:docPr descr="" title="" id="50" name="Picture"/>
             <a:graphic>
@@ -5634,7 +5602,7 @@
                   <pic:spPr bwMode="auto">
                     <a:xfrm>
                       <a:off x="0" y="0"/>
-                      <a:ext cx="2870200" cy="1549400"/>
+                      <a:ext cx="2870200" cy="1371600"/>
                     </a:xfrm>
                     <a:prstGeom prst="rect">
                       <a:avLst/>
@@ -6017,7 +5985,7 @@
         <w:t xml:space="preserve"> </w:t>
       </w:r>
       <w:r>
-        <w:t xml:space="preserve">The version history shows the scheme being extended more than once: femora and the S1 anchor, then per-level ribs, then lumbar ribs and surgical hardware, were each folded into the existing release rather than requiring a new dataset. The same path is open going forward: imaging from beyond this cohort’s single protocol, and the C2 anchor this acquisition cannot supply, are the natural next additions.</w:t>
+        <w:t xml:space="preserve">The version history shows the scheme being extended more than once: femora and the S1 anchor, then per-level ribs, then lumbar ribs and surgical hardware, were each folded into the existing release rather than requiring a new dataset. Imaging beyond this cohort’s protocol, and the C2 anchor it cannot supply, are the natural next additions.</w:t>
       </w:r>
     </w:p>
     <w:bookmarkEnd w:id="55"/>
@@ -6234,19 +6202,31 @@
         <w:pStyle w:val="BodyText"/>
       </w:pPr>
       <w:r>
-        <w:t xml:space="preserve">G. P. Konin and D. M. Walz,</w:t>
-      </w:r>
-      <w:r>
-        <w:t xml:space="preserve"> </w:t>
-      </w:r>
-      <w:r>
-        <w:t xml:space="preserve">Lumbosacral transitional vertebrae: classification, imaging findings, and clinical relevance,</w:t>
-      </w:r>
-      <w:r>
-        <w:t xml:space="preserve"> </w:t>
-      </w:r>
-      <w:r>
-        <w:t xml:space="preserve">AJNR Am. J. Neuroradiol.</w:t>
+        <w:t xml:space="preserve">Expert Panel on Neurological Imaging, T. A. Hutchins, M. Peckham, et al.,</w:t>
+      </w:r>
+      <w:r>
+        <w:t xml:space="preserve"> </w:t>
+      </w:r>
+      <w:r>
+        <w:t xml:space="preserve">Appropriateness</w:t>
+      </w:r>
+      <w:r>
+        <w:t xml:space="preserve"> </w:t>
+      </w:r>
+      <w:r>
+        <w:t xml:space="preserve">Criteria</w:t>
+      </w:r>
+      <w:r>
+        <w:t xml:space="preserve"> </w:t>
+      </w:r>
+      <w:r>
+        <w:t xml:space="preserve">low back pain: 2021 update,</w:t>
+      </w:r>
+      <w:r>
+        <w:t xml:space="preserve"> </w:t>
+      </w:r>
+      <w:r>
+        <w:t xml:space="preserve">J. Am. Coll. Radiol.</w:t>
       </w:r>
       <w:r>
         <w:t xml:space="preserve"> </w:t>
@@ -6256,16 +6236,16 @@
           <w:b/>
           <w:bCs/>
         </w:rPr>
-        <w:t xml:space="preserve">31</w:t>
-      </w:r>
-      <w:r>
-        <w:t xml:space="preserve">, 1778–1786 (2010),</w:t>
-      </w:r>
-      <w:r>
-        <w:t xml:space="preserve"> </w:t>
-      </w:r>
-      <w:r>
-        <w:t xml:space="preserve">doi:10.3174/ajnr.A2036.</w:t>
+        <w:t xml:space="preserve">18</w:t>
+      </w:r>
+      <w:r>
+        <w:t xml:space="preserve">, S361–S379 (2021),</w:t>
+      </w:r>
+      <w:r>
+        <w:t xml:space="preserve"> </w:t>
+      </w:r>
+      <w:r>
+        <w:t xml:space="preserve">doi:10.1016/j.jacr.2021.08.002.</w:t>
       </w:r>
     </w:p>
     <w:p>
@@ -6273,19 +6253,19 @@
         <w:pStyle w:val="BodyText"/>
       </w:pPr>
       <w:r>
-        <w:t xml:space="preserve">Y. Deng et al.,</w:t>
-      </w:r>
-      <w:r>
-        <w:t xml:space="preserve"> </w:t>
-      </w:r>
-      <w:r>
-        <w:t xml:space="preserve">: a large-scale dataset for spinal vertebrae segmentation in computed tomography,</w:t>
-      </w:r>
-      <w:r>
-        <w:t xml:space="preserve"> </w:t>
-      </w:r>
-      <w:r>
-        <w:t xml:space="preserve">Mach. Learn. Biomed. Imaging</w:t>
+        <w:t xml:space="preserve">G. P. Konin and D. M. Walz,</w:t>
+      </w:r>
+      <w:r>
+        <w:t xml:space="preserve"> </w:t>
+      </w:r>
+      <w:r>
+        <w:t xml:space="preserve">Lumbosacral transitional vertebrae: classification, imaging findings, and clinical relevance,</w:t>
+      </w:r>
+      <w:r>
+        <w:t xml:space="preserve"> </w:t>
+      </w:r>
+      <w:r>
+        <w:t xml:space="preserve">AJNR Am. J. Neuroradiol.</w:t>
       </w:r>
       <w:r>
         <w:t xml:space="preserve"> </w:t>
@@ -6295,16 +6275,16 @@
           <w:b/>
           <w:bCs/>
         </w:rPr>
-        <w:t xml:space="preserve">3</w:t>
-      </w:r>
-      <w:r>
-        <w:t xml:space="preserve">, 824–832 (2025),</w:t>
-      </w:r>
-      <w:r>
-        <w:t xml:space="preserve"> </w:t>
-      </w:r>
-      <w:r>
-        <w:t xml:space="preserve">doi:10.59275/j.melba.2025-gf84.</w:t>
+        <w:t xml:space="preserve">31</w:t>
+      </w:r>
+      <w:r>
+        <w:t xml:space="preserve">, 1778–1786 (2010),</w:t>
+      </w:r>
+      <w:r>
+        <w:t xml:space="preserve"> </w:t>
+      </w:r>
+      <w:r>
+        <w:t xml:space="preserve">doi:10.3174/ajnr.A2036.</w:t>
       </w:r>
     </w:p>
     <w:p>
@@ -6312,31 +6292,19 @@
         <w:pStyle w:val="BodyText"/>
       </w:pPr>
       <w:r>
-        <w:t xml:space="preserve">P. Liu et al.,</w:t>
-      </w:r>
-      <w:r>
-        <w:t xml:space="preserve"> </w:t>
-      </w:r>
-      <w:r>
-        <w:t xml:space="preserve">Deep learning to segment pelvic bones: large-scale</w:t>
-      </w:r>
-      <w:r>
-        <w:t xml:space="preserve"> </w:t>
-      </w:r>
-      <w:r>
-        <w:t xml:space="preserve">CT</w:t>
-      </w:r>
-      <w:r>
-        <w:t xml:space="preserve"> </w:t>
-      </w:r>
-      <w:r>
-        <w:t xml:space="preserve">datasets and baseline models,</w:t>
-      </w:r>
-      <w:r>
-        <w:t xml:space="preserve"> </w:t>
-      </w:r>
-      <w:r>
-        <w:t xml:space="preserve">Int. J. Comput. Assist. Radiol. Surg.</w:t>
+        <w:t xml:space="preserve">Y. Deng et al.,</w:t>
+      </w:r>
+      <w:r>
+        <w:t xml:space="preserve"> </w:t>
+      </w:r>
+      <w:r>
+        <w:t xml:space="preserve">: a large-scale dataset for spinal vertebrae segmentation in computed tomography,</w:t>
+      </w:r>
+      <w:r>
+        <w:t xml:space="preserve"> </w:t>
+      </w:r>
+      <w:r>
+        <w:t xml:space="preserve">Mach. Learn. Biomed. Imaging</w:t>
       </w:r>
       <w:r>
         <w:t xml:space="preserve"> </w:t>
@@ -6346,16 +6314,16 @@
           <w:b/>
           <w:bCs/>
         </w:rPr>
-        <w:t xml:space="preserve">16</w:t>
-      </w:r>
-      <w:r>
-        <w:t xml:space="preserve">, 749–756 (2021),</w:t>
-      </w:r>
-      <w:r>
-        <w:t xml:space="preserve"> </w:t>
-      </w:r>
-      <w:r>
-        <w:t xml:space="preserve">doi:10.1007/s11548-021-02363-8.</w:t>
+        <w:t xml:space="preserve">3</w:t>
+      </w:r>
+      <w:r>
+        <w:t xml:space="preserve">, 824–832 (2025),</w:t>
+      </w:r>
+      <w:r>
+        <w:t xml:space="preserve"> </w:t>
+      </w:r>
+      <w:r>
+        <w:t xml:space="preserve">doi:10.59275/j.melba.2025-gf84.</w:t>
       </w:r>
     </w:p>
     <w:p>
@@ -6363,39 +6331,13 @@
         <w:pStyle w:val="BodyText"/>
       </w:pPr>
       <w:r>
-        <w:t xml:space="preserve">H. M</w:t>
-      </w:r>
-      <w:r>
-        <w:t xml:space="preserve">ö</w:t>
-      </w:r>
-      <w:r>
-        <w:t xml:space="preserve">ller, H. Schoen, R. Graf, et al.,</w:t>
-      </w:r>
-      <w:r>
-        <w:t xml:space="preserve"> </w:t>
-      </w:r>
-      <w:r>
-        <w:t xml:space="preserve">: solving enumeration anomaly aware vertebra labeling across imaging sequences, 2026,</w:t>
-      </w:r>
-      <w:r>
-        <w:t xml:space="preserve"> </w:t>
-      </w:r>
-      <w:r>
-        <w:t xml:space="preserve">arXiv:2601.14066. doi:10.48550/arXiv.2601.14066.</w:t>
-      </w:r>
-    </w:p>
-    <w:p>
-      <w:pPr>
-        <w:pStyle w:val="BodyText"/>
-      </w:pPr>
-      <w:r>
-        <w:t xml:space="preserve">A. Sekuboyina et al.,</w:t>
-      </w:r>
-      <w:r>
-        <w:t xml:space="preserve"> </w:t>
-      </w:r>
-      <w:r>
-        <w:t xml:space="preserve">: a vertebrae labelling and segmentation benchmark for multi-detector</w:t>
+        <w:t xml:space="preserve">P. Liu et al.,</w:t>
+      </w:r>
+      <w:r>
+        <w:t xml:space="preserve"> </w:t>
+      </w:r>
+      <w:r>
+        <w:t xml:space="preserve">Deep learning to segment pelvic bones: large-scale</w:t>
       </w:r>
       <w:r>
         <w:t xml:space="preserve"> </w:t>
@@ -6407,13 +6349,13 @@
         <w:t xml:space="preserve"> </w:t>
       </w:r>
       <w:r>
-        <w:t xml:space="preserve">images,</w:t>
-      </w:r>
-      <w:r>
-        <w:t xml:space="preserve"> </w:t>
-      </w:r>
-      <w:r>
-        <w:t xml:space="preserve">Med. Image Anal.</w:t>
+        <w:t xml:space="preserve">datasets and baseline models,</w:t>
+      </w:r>
+      <w:r>
+        <w:t xml:space="preserve"> </w:t>
+      </w:r>
+      <w:r>
+        <w:t xml:space="preserve">Int. J. Comput. Assist. Radiol. Surg.</w:t>
       </w:r>
       <w:r>
         <w:t xml:space="preserve"> </w:t>
@@ -6423,16 +6365,16 @@
           <w:b/>
           <w:bCs/>
         </w:rPr>
-        <w:t xml:space="preserve">73</w:t>
-      </w:r>
-      <w:r>
-        <w:t xml:space="preserve">, 102166 (2021),</w:t>
-      </w:r>
-      <w:r>
-        <w:t xml:space="preserve"> </w:t>
-      </w:r>
-      <w:r>
-        <w:t xml:space="preserve">doi:10.1016/j.media.2021.102166.</w:t>
+        <w:t xml:space="preserve">16</w:t>
+      </w:r>
+      <w:r>
+        <w:t xml:space="preserve">, 749–756 (2021),</w:t>
+      </w:r>
+      <w:r>
+        <w:t xml:space="preserve"> </w:t>
+      </w:r>
+      <w:r>
+        <w:t xml:space="preserve">doi:10.1007/s11548-021-02363-8.</w:t>
       </w:r>
     </w:p>
     <w:p>
@@ -6440,19 +6382,57 @@
         <w:pStyle w:val="BodyText"/>
       </w:pPr>
       <w:r>
-        <w:t xml:space="preserve">H. Liebl et al.,</w:t>
-      </w:r>
-      <w:r>
-        <w:t xml:space="preserve"> </w:t>
-      </w:r>
-      <w:r>
-        <w:t xml:space="preserve">A computed tomography vertebral segmentation dataset with anatomical variations and multi-vendor scanner data,</w:t>
-      </w:r>
-      <w:r>
-        <w:t xml:space="preserve"> </w:t>
-      </w:r>
-      <w:r>
-        <w:t xml:space="preserve">Sci. Data</w:t>
+        <w:t xml:space="preserve">H. M</w:t>
+      </w:r>
+      <w:r>
+        <w:t xml:space="preserve">ö</w:t>
+      </w:r>
+      <w:r>
+        <w:t xml:space="preserve">ller, H. Schoen, R. Graf, et al.,</w:t>
+      </w:r>
+      <w:r>
+        <w:t xml:space="preserve"> </w:t>
+      </w:r>
+      <w:r>
+        <w:t xml:space="preserve">: solving enumeration anomaly aware vertebra labeling across imaging sequences, 2026,</w:t>
+      </w:r>
+      <w:r>
+        <w:t xml:space="preserve"> </w:t>
+      </w:r>
+      <w:r>
+        <w:t xml:space="preserve">arXiv:2601.14066. doi:10.48550/arXiv.2601.14066.</w:t>
+      </w:r>
+    </w:p>
+    <w:p>
+      <w:pPr>
+        <w:pStyle w:val="BodyText"/>
+      </w:pPr>
+      <w:r>
+        <w:t xml:space="preserve">A. Sekuboyina et al.,</w:t>
+      </w:r>
+      <w:r>
+        <w:t xml:space="preserve"> </w:t>
+      </w:r>
+      <w:r>
+        <w:t xml:space="preserve">: a vertebrae labelling and segmentation benchmark for multi-detector</w:t>
+      </w:r>
+      <w:r>
+        <w:t xml:space="preserve"> </w:t>
+      </w:r>
+      <w:r>
+        <w:t xml:space="preserve">CT</w:t>
+      </w:r>
+      <w:r>
+        <w:t xml:space="preserve"> </w:t>
+      </w:r>
+      <w:r>
+        <w:t xml:space="preserve">images,</w:t>
+      </w:r>
+      <w:r>
+        <w:t xml:space="preserve"> </w:t>
+      </w:r>
+      <w:r>
+        <w:t xml:space="preserve">Med. Image Anal.</w:t>
       </w:r>
       <w:r>
         <w:t xml:space="preserve"> </w:t>
@@ -6462,16 +6442,16 @@
           <w:b/>
           <w:bCs/>
         </w:rPr>
-        <w:t xml:space="preserve">8</w:t>
-      </w:r>
-      <w:r>
-        <w:t xml:space="preserve">, 284 (2021),</w:t>
-      </w:r>
-      <w:r>
-        <w:t xml:space="preserve"> </w:t>
-      </w:r>
-      <w:r>
-        <w:t xml:space="preserve">doi:10.1038/s41597-021-01060-0.</w:t>
+        <w:t xml:space="preserve">73</w:t>
+      </w:r>
+      <w:r>
+        <w:t xml:space="preserve">, 102166 (2021),</w:t>
+      </w:r>
+      <w:r>
+        <w:t xml:space="preserve"> </w:t>
+      </w:r>
+      <w:r>
+        <w:t xml:space="preserve">doi:10.1016/j.media.2021.102166.</w:t>
       </w:r>
     </w:p>
     <w:p>
@@ -6479,31 +6459,19 @@
         <w:pStyle w:val="BodyText"/>
       </w:pPr>
       <w:r>
-        <w:t xml:space="preserve">Y. Otake, S. Schafer, J. W. Stayman, et al.,</w:t>
-      </w:r>
-      <w:r>
-        <w:t xml:space="preserve"> </w:t>
-      </w:r>
-      <w:r>
-        <w:t xml:space="preserve">Automatic localization of vertebral levels in x-ray fluoroscopy using</w:t>
-      </w:r>
-      <w:r>
-        <w:t xml:space="preserve"> </w:t>
-      </w:r>
-      <w:r>
-        <w:t xml:space="preserve">3D-2D</w:t>
-      </w:r>
-      <w:r>
-        <w:t xml:space="preserve"> </w:t>
-      </w:r>
-      <w:r>
-        <w:t xml:space="preserve">registration: a tool to reduce wrong-site surgery,</w:t>
-      </w:r>
-      <w:r>
-        <w:t xml:space="preserve"> </w:t>
-      </w:r>
-      <w:r>
-        <w:t xml:space="preserve">Phys. Med. Biol.</w:t>
+        <w:t xml:space="preserve">H. Liebl et al.,</w:t>
+      </w:r>
+      <w:r>
+        <w:t xml:space="preserve"> </w:t>
+      </w:r>
+      <w:r>
+        <w:t xml:space="preserve">A computed tomography vertebral segmentation dataset with anatomical variations and multi-vendor scanner data,</w:t>
+      </w:r>
+      <w:r>
+        <w:t xml:space="preserve"> </w:t>
+      </w:r>
+      <w:r>
+        <w:t xml:space="preserve">Sci. Data</w:t>
       </w:r>
       <w:r>
         <w:t xml:space="preserve"> </w:t>
@@ -6513,16 +6481,16 @@
           <w:b/>
           <w:bCs/>
         </w:rPr>
-        <w:t xml:space="preserve">57</w:t>
-      </w:r>
-      <w:r>
-        <w:t xml:space="preserve">, 5485–5508 (2012),</w:t>
-      </w:r>
-      <w:r>
-        <w:t xml:space="preserve"> </w:t>
-      </w:r>
-      <w:r>
-        <w:t xml:space="preserve">doi:10.1088/0031-9155/57/17/5485.</w:t>
+        <w:t xml:space="preserve">8</w:t>
+      </w:r>
+      <w:r>
+        <w:t xml:space="preserve">, 284 (2021),</w:t>
+      </w:r>
+      <w:r>
+        <w:t xml:space="preserve"> </w:t>
+      </w:r>
+      <w:r>
+        <w:t xml:space="preserve">doi:10.1038/s41597-021-01060-0.</w:t>
       </w:r>
     </w:p>
     <w:p>
@@ -6530,31 +6498,31 @@
         <w:pStyle w:val="BodyText"/>
       </w:pPr>
       <w:r>
-        <w:t xml:space="preserve">S.-F. L. Lo, Y. Otake, V. Puvanesarajah, et al.,</w:t>
-      </w:r>
-      <w:r>
-        <w:t xml:space="preserve"> </w:t>
-      </w:r>
-      <w:r>
-        <w:t xml:space="preserve">Automatic localization of target vertebrae in spine surgery: clinical evaluation of the</w:t>
-      </w:r>
-      <w:r>
-        <w:t xml:space="preserve"> </w:t>
-      </w:r>
-      <w:r>
-        <w:t xml:space="preserve">LevelCheck</w:t>
-      </w:r>
-      <w:r>
-        <w:t xml:space="preserve"> </w:t>
-      </w:r>
-      <w:r>
-        <w:t xml:space="preserve">registration algorithm,</w:t>
-      </w:r>
-      <w:r>
-        <w:t xml:space="preserve"> </w:t>
-      </w:r>
-      <w:r>
-        <w:t xml:space="preserve">Spine (Phila. Pa. 1976)</w:t>
+        <w:t xml:space="preserve">Y. Otake, S. Schafer, J. W. Stayman, et al.,</w:t>
+      </w:r>
+      <w:r>
+        <w:t xml:space="preserve"> </w:t>
+      </w:r>
+      <w:r>
+        <w:t xml:space="preserve">Automatic localization of vertebral levels in x-ray fluoroscopy using</w:t>
+      </w:r>
+      <w:r>
+        <w:t xml:space="preserve"> </w:t>
+      </w:r>
+      <w:r>
+        <w:t xml:space="preserve">3D-2D</w:t>
+      </w:r>
+      <w:r>
+        <w:t xml:space="preserve"> </w:t>
+      </w:r>
+      <w:r>
+        <w:t xml:space="preserve">registration: a tool to reduce wrong-site surgery,</w:t>
+      </w:r>
+      <w:r>
+        <w:t xml:space="preserve"> </w:t>
+      </w:r>
+      <w:r>
+        <w:t xml:space="preserve">Phys. Med. Biol.</w:t>
       </w:r>
       <w:r>
         <w:t xml:space="preserve"> </w:t>
@@ -6564,16 +6532,16 @@
           <w:b/>
           <w:bCs/>
         </w:rPr>
-        <w:t xml:space="preserve">40</w:t>
-      </w:r>
-      <w:r>
-        <w:t xml:space="preserve">, E476–E483 (2015),</w:t>
-      </w:r>
-      <w:r>
-        <w:t xml:space="preserve"> </w:t>
-      </w:r>
-      <w:r>
-        <w:t xml:space="preserve">doi:10.1097/BRS.0000000000000814.</w:t>
+        <w:t xml:space="preserve">57</w:t>
+      </w:r>
+      <w:r>
+        <w:t xml:space="preserve">, 5485–5508 (2012),</w:t>
+      </w:r>
+      <w:r>
+        <w:t xml:space="preserve"> </w:t>
+      </w:r>
+      <w:r>
+        <w:t xml:space="preserve">doi:10.1088/0031-9155/57/17/5485.</w:t>
       </w:r>
     </w:p>
     <w:p>
@@ -6581,13 +6549,13 @@
         <w:pStyle w:val="BodyText"/>
       </w:pPr>
       <w:r>
-        <w:t xml:space="preserve">T. De Silva, S.-F. L. Lo, N. Aygun, et al.,</w:t>
-      </w:r>
-      <w:r>
-        <w:t xml:space="preserve"> </w:t>
-      </w:r>
-      <w:r>
-        <w:t xml:space="preserve">Utility of the</w:t>
+        <w:t xml:space="preserve">S.-F. L. Lo, Y. Otake, V. Puvanesarajah, et al.,</w:t>
+      </w:r>
+      <w:r>
+        <w:t xml:space="preserve"> </w:t>
+      </w:r>
+      <w:r>
+        <w:t xml:space="preserve">Automatic localization of target vertebrae in spine surgery: clinical evaluation of the</w:t>
       </w:r>
       <w:r>
         <w:t xml:space="preserve"> </w:t>
@@ -6599,7 +6567,7 @@
         <w:t xml:space="preserve"> </w:t>
       </w:r>
       <w:r>
-        <w:t xml:space="preserve">algorithm for decision support in vertebral localization,</w:t>
+        <w:t xml:space="preserve">registration algorithm,</w:t>
       </w:r>
       <w:r>
         <w:t xml:space="preserve"> </w:t>
@@ -6615,16 +6583,16 @@
           <w:b/>
           <w:bCs/>
         </w:rPr>
-        <w:t xml:space="preserve">41</w:t>
-      </w:r>
-      <w:r>
-        <w:t xml:space="preserve">, E1249–E1256 (2016),</w:t>
-      </w:r>
-      <w:r>
-        <w:t xml:space="preserve"> </w:t>
-      </w:r>
-      <w:r>
-        <w:t xml:space="preserve">doi:10.1097/BRS.0000000000001589.</w:t>
+        <w:t xml:space="preserve">40</w:t>
+      </w:r>
+      <w:r>
+        <w:t xml:space="preserve">, E476–E483 (2015),</w:t>
+      </w:r>
+      <w:r>
+        <w:t xml:space="preserve"> </w:t>
+      </w:r>
+      <w:r>
+        <w:t xml:space="preserve">doi:10.1097/BRS.0000000000000814.</w:t>
       </w:r>
     </w:p>
     <w:p>
@@ -6632,72 +6600,31 @@
         <w:pStyle w:val="BodyText"/>
       </w:pPr>
       <w:r>
-        <w:t xml:space="preserve">K. Smith et al.,</w:t>
-      </w:r>
-      <w:r>
-        <w:t xml:space="preserve"> </w:t>
-      </w:r>
-      <w:r>
-        <w:t xml:space="preserve">Data from</w:t>
-      </w:r>
-      <w:r>
-        <w:t xml:space="preserve"> </w:t>
-      </w:r>
-      <w:r>
-        <w:t xml:space="preserve">CT COLONOGRAPHY</w:t>
-      </w:r>
-      <w:r>
-        <w:t xml:space="preserve">,</w:t>
-      </w:r>
-      <w:r>
-        <w:t xml:space="preserve"> </w:t>
-      </w:r>
-      <w:r>
-        <w:t xml:space="preserve">The Cancer Imaging Archive, 2015,</w:t>
-      </w:r>
-      <w:r>
-        <w:t xml:space="preserve"> </w:t>
-      </w:r>
-      <w:r>
-        <w:t xml:space="preserve">doi:10.7937/K9/TCIA.2015.NWTESAY1.</w:t>
-      </w:r>
-    </w:p>
-    <w:p>
-      <w:pPr>
-        <w:pStyle w:val="BodyText"/>
-      </w:pPr>
-      <w:r>
-        <w:t xml:space="preserve">K. Clark et al.,</w:t>
-      </w:r>
-      <w:r>
-        <w:t xml:space="preserve"> </w:t>
-      </w:r>
-      <w:r>
-        <w:t xml:space="preserve">The</w:t>
-      </w:r>
-      <w:r>
-        <w:t xml:space="preserve"> </w:t>
-      </w:r>
-      <w:r>
-        <w:t xml:space="preserve">Cancer Imaging Archive</w:t>
-      </w:r>
-      <w:r>
-        <w:t xml:space="preserve"> </w:t>
-      </w:r>
-      <w:r>
-        <w:t xml:space="preserve">(</w:t>
-      </w:r>
-      <w:r>
-        <w:t xml:space="preserve">TCIA</w:t>
-      </w:r>
-      <w:r>
-        <w:t xml:space="preserve">): maintaining and operating a public information repository,</w:t>
-      </w:r>
-      <w:r>
-        <w:t xml:space="preserve"> </w:t>
-      </w:r>
-      <w:r>
-        <w:t xml:space="preserve">J. Digit. Imaging</w:t>
+        <w:t xml:space="preserve">T. De Silva, S.-F. L. Lo, N. Aygun, et al.,</w:t>
+      </w:r>
+      <w:r>
+        <w:t xml:space="preserve"> </w:t>
+      </w:r>
+      <w:r>
+        <w:t xml:space="preserve">Utility of the</w:t>
+      </w:r>
+      <w:r>
+        <w:t xml:space="preserve"> </w:t>
+      </w:r>
+      <w:r>
+        <w:t xml:space="preserve">LevelCheck</w:t>
+      </w:r>
+      <w:r>
+        <w:t xml:space="preserve"> </w:t>
+      </w:r>
+      <w:r>
+        <w:t xml:space="preserve">algorithm for decision support in vertebral localization,</w:t>
+      </w:r>
+      <w:r>
+        <w:t xml:space="preserve"> </w:t>
+      </w:r>
+      <w:r>
+        <w:t xml:space="preserve">Spine (Phila. Pa. 1976)</w:t>
       </w:r>
       <w:r>
         <w:t xml:space="preserve"> </w:t>
@@ -6707,16 +6634,16 @@
           <w:b/>
           <w:bCs/>
         </w:rPr>
-        <w:t xml:space="preserve">26</w:t>
-      </w:r>
-      <w:r>
-        <w:t xml:space="preserve">, 1045–1057 (2013),</w:t>
-      </w:r>
-      <w:r>
-        <w:t xml:space="preserve"> </w:t>
-      </w:r>
-      <w:r>
-        <w:t xml:space="preserve">doi:10.1007/s10278-013-9622-7.</w:t>
+        <w:t xml:space="preserve">41</w:t>
+      </w:r>
+      <w:r>
+        <w:t xml:space="preserve">, E1249–E1256 (2016),</w:t>
+      </w:r>
+      <w:r>
+        <w:t xml:space="preserve"> </w:t>
+      </w:r>
+      <w:r>
+        <w:t xml:space="preserve">doi:10.1097/BRS.0000000000001589.</w:t>
       </w:r>
     </w:p>
     <w:p>
@@ -6724,19 +6651,19 @@
         <w:pStyle w:val="BodyText"/>
       </w:pPr>
       <w:r>
-        <w:t xml:space="preserve">M. R. Zindrick et al.,</w:t>
-      </w:r>
-      <w:r>
-        <w:t xml:space="preserve"> </w:t>
-      </w:r>
-      <w:r>
-        <w:t xml:space="preserve">Analysis of the morphometric characteristics of the thoracic and lumbar pedicles,</w:t>
-      </w:r>
-      <w:r>
-        <w:t xml:space="preserve"> </w:t>
-      </w:r>
-      <w:r>
-        <w:t xml:space="preserve">Spine (Phila. Pa. 1976)</w:t>
+        <w:t xml:space="preserve">D. S. Kreiner, W. O. Shaffer, J. L. Baisden, et al.,</w:t>
+      </w:r>
+      <w:r>
+        <w:t xml:space="preserve"> </w:t>
+      </w:r>
+      <w:r>
+        <w:t xml:space="preserve">An evidence-based clinical guideline for the diagnosis and treatment of degenerative lumbar spinal stenosis (update),</w:t>
+      </w:r>
+      <w:r>
+        <w:t xml:space="preserve"> </w:t>
+      </w:r>
+      <w:r>
+        <w:t xml:space="preserve">Spine J.</w:t>
       </w:r>
       <w:r>
         <w:t xml:space="preserve"> </w:t>
@@ -6746,16 +6673,16 @@
           <w:b/>
           <w:bCs/>
         </w:rPr>
-        <w:t xml:space="preserve">12</w:t>
-      </w:r>
-      <w:r>
-        <w:t xml:space="preserve">, 160–166 (1987),</w:t>
-      </w:r>
-      <w:r>
-        <w:t xml:space="preserve"> </w:t>
-      </w:r>
-      <w:r>
-        <w:t xml:space="preserve">doi:10.1097/00007632-198703000-00012.</w:t>
+        <w:t xml:space="preserve">13</w:t>
+      </w:r>
+      <w:r>
+        <w:t xml:space="preserve">, 734–743 (2013),</w:t>
+      </w:r>
+      <w:r>
+        <w:t xml:space="preserve"> </w:t>
+      </w:r>
+      <w:r>
+        <w:t xml:space="preserve">doi:10.1016/j.spinee.2012.11.059.</w:t>
       </w:r>
     </w:p>
     <w:p>
@@ -6763,19 +6690,98 @@
         <w:pStyle w:val="BodyText"/>
       </w:pPr>
       <w:r>
-        <w:t xml:space="preserve">M. M. Panjabi et al.,</w:t>
-      </w:r>
-      <w:r>
-        <w:t xml:space="preserve"> </w:t>
-      </w:r>
-      <w:r>
-        <w:t xml:space="preserve">Thoracic human vertebrae: quantitative three-dimensional anatomy,</w:t>
-      </w:r>
-      <w:r>
-        <w:t xml:space="preserve"> </w:t>
-      </w:r>
-      <w:r>
-        <w:t xml:space="preserve">Spine (Phila. Pa. 1976)</w:t>
+        <w:t xml:space="preserve">American College of Surgeons Committee on Trauma,</w:t>
+      </w:r>
+      <w:r>
+        <w:t xml:space="preserve"> </w:t>
+      </w:r>
+      <w:r>
+        <w:t xml:space="preserve">TQIP</w:t>
+      </w:r>
+      <w:r>
+        <w:t xml:space="preserve"> </w:t>
+      </w:r>
+      <w:r>
+        <w:t xml:space="preserve">best practices guidelines in imaging,</w:t>
+      </w:r>
+      <w:r>
+        <w:t xml:space="preserve"> </w:t>
+      </w:r>
+      <w:r>
+        <w:t xml:space="preserve">American College of Surgeons, Chicago, 2018.</w:t>
+      </w:r>
+    </w:p>
+    <w:p>
+      <w:pPr>
+        <w:pStyle w:val="BodyText"/>
+      </w:pPr>
+      <w:r>
+        <w:t xml:space="preserve">K. Smith et al.,</w:t>
+      </w:r>
+      <w:r>
+        <w:t xml:space="preserve"> </w:t>
+      </w:r>
+      <w:r>
+        <w:t xml:space="preserve">Data from</w:t>
+      </w:r>
+      <w:r>
+        <w:t xml:space="preserve"> </w:t>
+      </w:r>
+      <w:r>
+        <w:t xml:space="preserve">CT COLONOGRAPHY</w:t>
+      </w:r>
+      <w:r>
+        <w:t xml:space="preserve">,</w:t>
+      </w:r>
+      <w:r>
+        <w:t xml:space="preserve"> </w:t>
+      </w:r>
+      <w:r>
+        <w:t xml:space="preserve">The Cancer Imaging Archive, 2015,</w:t>
+      </w:r>
+      <w:r>
+        <w:t xml:space="preserve"> </w:t>
+      </w:r>
+      <w:r>
+        <w:t xml:space="preserve">doi:10.7937/K9/TCIA.2015.NWTESAY1.</w:t>
+      </w:r>
+    </w:p>
+    <w:p>
+      <w:pPr>
+        <w:pStyle w:val="BodyText"/>
+      </w:pPr>
+      <w:r>
+        <w:t xml:space="preserve">K. Clark et al.,</w:t>
+      </w:r>
+      <w:r>
+        <w:t xml:space="preserve"> </w:t>
+      </w:r>
+      <w:r>
+        <w:t xml:space="preserve">The</w:t>
+      </w:r>
+      <w:r>
+        <w:t xml:space="preserve"> </w:t>
+      </w:r>
+      <w:r>
+        <w:t xml:space="preserve">Cancer Imaging Archive</w:t>
+      </w:r>
+      <w:r>
+        <w:t xml:space="preserve"> </w:t>
+      </w:r>
+      <w:r>
+        <w:t xml:space="preserve">(</w:t>
+      </w:r>
+      <w:r>
+        <w:t xml:space="preserve">TCIA</w:t>
+      </w:r>
+      <w:r>
+        <w:t xml:space="preserve">): maintaining and operating a public information repository,</w:t>
+      </w:r>
+      <w:r>
+        <w:t xml:space="preserve"> </w:t>
+      </w:r>
+      <w:r>
+        <w:t xml:space="preserve">J. Digit. Imaging</w:t>
       </w:r>
       <w:r>
         <w:t xml:space="preserve"> </w:t>
@@ -6785,16 +6791,16 @@
           <w:b/>
           <w:bCs/>
         </w:rPr>
-        <w:t xml:space="preserve">16</w:t>
-      </w:r>
-      <w:r>
-        <w:t xml:space="preserve">, 888–901 (1991),</w:t>
-      </w:r>
-      <w:r>
-        <w:t xml:space="preserve"> </w:t>
-      </w:r>
-      <w:r>
-        <w:t xml:space="preserve">doi:10.1097/00007632-199108000-00006.</w:t>
+        <w:t xml:space="preserve">26</w:t>
+      </w:r>
+      <w:r>
+        <w:t xml:space="preserve">, 1045–1057 (2013),</w:t>
+      </w:r>
+      <w:r>
+        <w:t xml:space="preserve"> </w:t>
+      </w:r>
+      <w:r>
+        <w:t xml:space="preserve">doi:10.1007/s10278-013-9622-7.</w:t>
       </w:r>
     </w:p>
     <w:p>
@@ -6802,13 +6808,13 @@
         <w:pStyle w:val="BodyText"/>
       </w:pPr>
       <w:r>
-        <w:t xml:space="preserve">M. M. Panjabi et al.,</w:t>
-      </w:r>
-      <w:r>
-        <w:t xml:space="preserve"> </w:t>
-      </w:r>
-      <w:r>
-        <w:t xml:space="preserve">Human lumbar vertebrae: quantitative three-dimensional anatomy,</w:t>
+        <w:t xml:space="preserve">M. R. Zindrick et al.,</w:t>
+      </w:r>
+      <w:r>
+        <w:t xml:space="preserve"> </w:t>
+      </w:r>
+      <w:r>
+        <w:t xml:space="preserve">Analysis of the morphometric characteristics of the thoracic and lumbar pedicles,</w:t>
       </w:r>
       <w:r>
         <w:t xml:space="preserve"> </w:t>
@@ -6824,16 +6830,16 @@
           <w:b/>
           <w:bCs/>
         </w:rPr>
-        <w:t xml:space="preserve">17</w:t>
-      </w:r>
-      <w:r>
-        <w:t xml:space="preserve">, 299–306 (1992),</w:t>
-      </w:r>
-      <w:r>
-        <w:t xml:space="preserve"> </w:t>
-      </w:r>
-      <w:r>
-        <w:t xml:space="preserve">doi:10.1097/00007632-199203000-00010.</w:t>
+        <w:t xml:space="preserve">12</w:t>
+      </w:r>
+      <w:r>
+        <w:t xml:space="preserve">, 160–166 (1987),</w:t>
+      </w:r>
+      <w:r>
+        <w:t xml:space="preserve"> </w:t>
+      </w:r>
+      <w:r>
+        <w:t xml:space="preserve">doi:10.1097/00007632-198703000-00012.</w:t>
       </w:r>
     </w:p>
     <w:p>
@@ -6841,48 +6847,19 @@
         <w:pStyle w:val="BodyText"/>
       </w:pPr>
       <w:r>
-        <w:t xml:space="preserve">E. C. Benzel,</w:t>
-      </w:r>
-      <w:r>
-        <w:t xml:space="preserve"> </w:t>
-      </w:r>
-      <w:r>
-        <w:t xml:space="preserve">,</w:t>
-      </w:r>
-      <w:r>
-        <w:t xml:space="preserve"> </w:t>
-      </w:r>
-      <w:r>
-        <w:t xml:space="preserve">Thieme, New York, 3rd edition, 2015.</w:t>
-      </w:r>
-    </w:p>
-    <w:p>
-      <w:pPr>
-        <w:pStyle w:val="BodyText"/>
-      </w:pPr>
-      <w:r>
-        <w:t xml:space="preserve">R. J. Hughes and A. Saifuddin,</w:t>
-      </w:r>
-      <w:r>
-        <w:t xml:space="preserve"> </w:t>
-      </w:r>
-      <w:r>
-        <w:t xml:space="preserve">Numbering of lumbosacral transitional vertebrae on</w:t>
-      </w:r>
-      <w:r>
-        <w:t xml:space="preserve"> </w:t>
-      </w:r>
-      <w:r>
-        <w:t xml:space="preserve">MRI</w:t>
-      </w:r>
-      <w:r>
-        <w:t xml:space="preserve">: role of the iliolumbar ligaments,</w:t>
-      </w:r>
-      <w:r>
-        <w:t xml:space="preserve"> </w:t>
-      </w:r>
-      <w:r>
-        <w:t xml:space="preserve">AJR Am. J. Roentgenol.</w:t>
+        <w:t xml:space="preserve">M. M. Panjabi et al.,</w:t>
+      </w:r>
+      <w:r>
+        <w:t xml:space="preserve"> </w:t>
+      </w:r>
+      <w:r>
+        <w:t xml:space="preserve">Thoracic human vertebrae: quantitative three-dimensional anatomy,</w:t>
+      </w:r>
+      <w:r>
+        <w:t xml:space="preserve"> </w:t>
+      </w:r>
+      <w:r>
+        <w:t xml:space="preserve">Spine (Phila. Pa. 1976)</w:t>
       </w:r>
       <w:r>
         <w:t xml:space="preserve"> </w:t>
@@ -6892,16 +6869,16 @@
           <w:b/>
           <w:bCs/>
         </w:rPr>
-        <w:t xml:space="preserve">187</w:t>
-      </w:r>
-      <w:r>
-        <w:t xml:space="preserve">, W59–W65 (2006),</w:t>
-      </w:r>
-      <w:r>
-        <w:t xml:space="preserve"> </w:t>
-      </w:r>
-      <w:r>
-        <w:t xml:space="preserve">doi:10.2214/AJR.05.0415.</w:t>
+        <w:t xml:space="preserve">16</w:t>
+      </w:r>
+      <w:r>
+        <w:t xml:space="preserve">, 888–901 (1991),</w:t>
+      </w:r>
+      <w:r>
+        <w:t xml:space="preserve"> </w:t>
+      </w:r>
+      <w:r>
+        <w:t xml:space="preserve">doi:10.1097/00007632-199108000-00006.</w:t>
       </w:r>
     </w:p>
     <w:p>
@@ -6909,19 +6886,19 @@
         <w:pStyle w:val="BodyText"/>
       </w:pPr>
       <w:r>
-        <w:t xml:space="preserve">L. Jin et al.,</w:t>
-      </w:r>
-      <w:r>
-        <w:t xml:space="preserve"> </w:t>
-      </w:r>
-      <w:r>
-        <w:t xml:space="preserve">v2: a large-scale benchmark for rib labeling and anatomical centerline extraction,</w:t>
-      </w:r>
-      <w:r>
-        <w:t xml:space="preserve"> </w:t>
-      </w:r>
-      <w:r>
-        <w:t xml:space="preserve">IEEE Trans. Med. Imaging</w:t>
+        <w:t xml:space="preserve">M. M. Panjabi et al.,</w:t>
+      </w:r>
+      <w:r>
+        <w:t xml:space="preserve"> </w:t>
+      </w:r>
+      <w:r>
+        <w:t xml:space="preserve">Human lumbar vertebrae: quantitative three-dimensional anatomy,</w:t>
+      </w:r>
+      <w:r>
+        <w:t xml:space="preserve"> </w:t>
+      </w:r>
+      <w:r>
+        <w:t xml:space="preserve">Spine (Phila. Pa. 1976)</w:t>
       </w:r>
       <w:r>
         <w:t xml:space="preserve"> </w:t>
@@ -6931,16 +6908,16 @@
           <w:b/>
           <w:bCs/>
         </w:rPr>
-        <w:t xml:space="preserve">43</w:t>
-      </w:r>
-      <w:r>
-        <w:t xml:space="preserve">, 570–581 (2024),</w:t>
-      </w:r>
-      <w:r>
-        <w:t xml:space="preserve"> </w:t>
-      </w:r>
-      <w:r>
-        <w:t xml:space="preserve">doi:10.1109/TMI.2023.3313627.</w:t>
+        <w:t xml:space="preserve">17</w:t>
+      </w:r>
+      <w:r>
+        <w:t xml:space="preserve">, 299–306 (1992),</w:t>
+      </w:r>
+      <w:r>
+        <w:t xml:space="preserve"> </w:t>
+      </w:r>
+      <w:r>
+        <w:t xml:space="preserve">doi:10.1097/00007632-199203000-00010.</w:t>
       </w:r>
     </w:p>
     <w:p>
@@ -6948,37 +6925,19 @@
         <w:pStyle w:val="BodyText"/>
       </w:pPr>
       <w:r>
-        <w:t xml:space="preserve">H. M</w:t>
-      </w:r>
-      <w:r>
-        <w:t xml:space="preserve">ö</w:t>
-      </w:r>
-      <w:r>
-        <w:t xml:space="preserve">ller et al.,</w:t>
-      </w:r>
-      <w:r>
-        <w:t xml:space="preserve"> </w:t>
-      </w:r>
-      <w:r>
-        <w:t xml:space="preserve">Automated thoracolumbar stump rib detection and analysis in a large</w:t>
-      </w:r>
-      <w:r>
-        <w:t xml:space="preserve"> </w:t>
-      </w:r>
-      <w:r>
-        <w:t xml:space="preserve">CT</w:t>
-      </w:r>
-      <w:r>
-        <w:t xml:space="preserve"> </w:t>
-      </w:r>
-      <w:r>
-        <w:t xml:space="preserve">cohort, 2025,</w:t>
-      </w:r>
-      <w:r>
-        <w:t xml:space="preserve"> </w:t>
-      </w:r>
-      <w:r>
-        <w:t xml:space="preserve">arXiv:2505.05004. doi:10.48550/arXiv.2505.05004.</w:t>
+        <w:t xml:space="preserve">E. C. Benzel,</w:t>
+      </w:r>
+      <w:r>
+        <w:t xml:space="preserve"> </w:t>
+      </w:r>
+      <w:r>
+        <w:t xml:space="preserve">,</w:t>
+      </w:r>
+      <w:r>
+        <w:t xml:space="preserve"> </w:t>
+      </w:r>
+      <w:r>
+        <w:t xml:space="preserve">Thieme, New York, 3rd edition, 2015.</w:t>
       </w:r>
     </w:p>
     <w:p>
@@ -6986,31 +6945,28 @@
         <w:pStyle w:val="BodyText"/>
       </w:pPr>
       <w:r>
-        <w:t xml:space="preserve">J. Wasserthal et al.,</w:t>
-      </w:r>
-      <w:r>
-        <w:t xml:space="preserve"> </w:t>
-      </w:r>
-      <w:r>
-        <w:t xml:space="preserve">: robust segmentation of 104 anatomic structures in</w:t>
-      </w:r>
-      <w:r>
-        <w:t xml:space="preserve"> </w:t>
-      </w:r>
-      <w:r>
-        <w:t xml:space="preserve">CT</w:t>
-      </w:r>
-      <w:r>
-        <w:t xml:space="preserve"> </w:t>
-      </w:r>
-      <w:r>
-        <w:t xml:space="preserve">images,</w:t>
-      </w:r>
-      <w:r>
-        <w:t xml:space="preserve"> </w:t>
-      </w:r>
-      <w:r>
-        <w:t xml:space="preserve">Radiol. Artif. Intell.</w:t>
+        <w:t xml:space="preserve">R. J. Hughes and A. Saifuddin,</w:t>
+      </w:r>
+      <w:r>
+        <w:t xml:space="preserve"> </w:t>
+      </w:r>
+      <w:r>
+        <w:t xml:space="preserve">Numbering of lumbosacral transitional vertebrae on</w:t>
+      </w:r>
+      <w:r>
+        <w:t xml:space="preserve"> </w:t>
+      </w:r>
+      <w:r>
+        <w:t xml:space="preserve">MRI</w:t>
+      </w:r>
+      <w:r>
+        <w:t xml:space="preserve">: role of the iliolumbar ligaments,</w:t>
+      </w:r>
+      <w:r>
+        <w:t xml:space="preserve"> </w:t>
+      </w:r>
+      <w:r>
+        <w:t xml:space="preserve">AJR Am. J. Roentgenol.</w:t>
       </w:r>
       <w:r>
         <w:t xml:space="preserve"> </w:t>
@@ -7020,6 +6976,96 @@
           <w:b/>
           <w:bCs/>
         </w:rPr>
+        <w:t xml:space="preserve">187</w:t>
+      </w:r>
+      <w:r>
+        <w:t xml:space="preserve">, W59–W65 (2006),</w:t>
+      </w:r>
+      <w:r>
+        <w:t xml:space="preserve"> </w:t>
+      </w:r>
+      <w:r>
+        <w:t xml:space="preserve">doi:10.2214/AJR.05.0415.</w:t>
+      </w:r>
+    </w:p>
+    <w:p>
+      <w:pPr>
+        <w:pStyle w:val="BodyText"/>
+      </w:pPr>
+      <w:r>
+        <w:t xml:space="preserve">L. Jin et al.,</w:t>
+      </w:r>
+      <w:r>
+        <w:t xml:space="preserve"> </w:t>
+      </w:r>
+      <w:r>
+        <w:t xml:space="preserve">v2: a large-scale benchmark for rib labeling and anatomical centerline extraction,</w:t>
+      </w:r>
+      <w:r>
+        <w:t xml:space="preserve"> </w:t>
+      </w:r>
+      <w:r>
+        <w:t xml:space="preserve">IEEE Trans. Med. Imaging</w:t>
+      </w:r>
+      <w:r>
+        <w:t xml:space="preserve"> </w:t>
+      </w:r>
+      <w:r>
+        <w:rPr>
+          <w:b/>
+          <w:bCs/>
+        </w:rPr>
+        <w:t xml:space="preserve">43</w:t>
+      </w:r>
+      <w:r>
+        <w:t xml:space="preserve">, 570–581 (2024),</w:t>
+      </w:r>
+      <w:r>
+        <w:t xml:space="preserve"> </w:t>
+      </w:r>
+      <w:r>
+        <w:t xml:space="preserve">doi:10.1109/TMI.2023.3313627.</w:t>
+      </w:r>
+    </w:p>
+    <w:p>
+      <w:pPr>
+        <w:pStyle w:val="BodyText"/>
+      </w:pPr>
+      <w:r>
+        <w:t xml:space="preserve">J. Wasserthal et al.,</w:t>
+      </w:r>
+      <w:r>
+        <w:t xml:space="preserve"> </w:t>
+      </w:r>
+      <w:r>
+        <w:t xml:space="preserve">: robust segmentation of 104 anatomic structures in</w:t>
+      </w:r>
+      <w:r>
+        <w:t xml:space="preserve"> </w:t>
+      </w:r>
+      <w:r>
+        <w:t xml:space="preserve">CT</w:t>
+      </w:r>
+      <w:r>
+        <w:t xml:space="preserve"> </w:t>
+      </w:r>
+      <w:r>
+        <w:t xml:space="preserve">images,</w:t>
+      </w:r>
+      <w:r>
+        <w:t xml:space="preserve"> </w:t>
+      </w:r>
+      <w:r>
+        <w:t xml:space="preserve">Radiol. Artif. Intell.</w:t>
+      </w:r>
+      <w:r>
+        <w:t xml:space="preserve"> </w:t>
+      </w:r>
+      <w:r>
+        <w:rPr>
+          <w:b/>
+          <w:bCs/>
+        </w:rPr>
         <w:t xml:space="preserve">5</w:t>
       </w:r>
       <w:r>
@@ -7030,6 +7076,44 @@
       </w:r>
       <w:r>
         <w:t xml:space="preserve">doi:10.1148/ryai.230024.</w:t>
+      </w:r>
+    </w:p>
+    <w:p>
+      <w:pPr>
+        <w:pStyle w:val="BodyText"/>
+      </w:pPr>
+      <w:r>
+        <w:t xml:space="preserve">H. M</w:t>
+      </w:r>
+      <w:r>
+        <w:t xml:space="preserve">ö</w:t>
+      </w:r>
+      <w:r>
+        <w:t xml:space="preserve">ller et al.,</w:t>
+      </w:r>
+      <w:r>
+        <w:t xml:space="preserve"> </w:t>
+      </w:r>
+      <w:r>
+        <w:t xml:space="preserve">Automated thoracolumbar stump rib detection and analysis in a large</w:t>
+      </w:r>
+      <w:r>
+        <w:t xml:space="preserve"> </w:t>
+      </w:r>
+      <w:r>
+        <w:t xml:space="preserve">CT</w:t>
+      </w:r>
+      <w:r>
+        <w:t xml:space="preserve"> </w:t>
+      </w:r>
+      <w:r>
+        <w:t xml:space="preserve">cohort, 2025,</w:t>
+      </w:r>
+      <w:r>
+        <w:t xml:space="preserve"> </w:t>
+      </w:r>
+      <w:r>
+        <w:t xml:space="preserve">arXiv:2505.05004. doi:10.48550/arXiv.2505.05004.</w:t>
       </w:r>
     </w:p>
     <w:p>

</xml_diff>

<commit_message>
abstract Purpose rewritten in the paper's voice
Co-Authored-By: Claude Fable 5.1 <noreply@anthropic.com>
</commit_message>
<xml_diff>
--- a/paper/mpda/CTSpinoPelvic1K_review.docx
+++ b/paper/mpda/CTSpinoPelvic1K_review.docx
@@ -41,107 +41,88 @@
         <w:t xml:space="preserve"> </w:t>
       </w:r>
       <w:r>
-        <w:t xml:space="preserve">For transitional anatomy the gold standard for numeration remains</w:t>
-      </w:r>
-      <w:r>
-        <w:t xml:space="preserve"> </w:t>
-      </w:r>
-      <w:r>
-        <w:t xml:space="preserve">whole-spine imaging and counting caudally from C2 </w:t>
-      </w:r>
-      <w:r>
-        <w:t xml:space="preserve">. The imaging a lumbar</w:t>
-      </w:r>
-      <w:r>
-        <w:t xml:space="preserve"> </w:t>
-      </w:r>
-      <w:r>
-        <w:t xml:space="preserve">case is planned on is regional by guideline </w:t>
-      </w:r>
-      <w:r>
-        <w:t xml:space="preserve"> </w:t>
-      </w:r>
-      <w:r>
-        <w:t xml:space="preserve">and never contains C2, and where</w:t>
-      </w:r>
-      <w:r>
-        <w:t xml:space="preserve"> </w:t>
-      </w:r>
-      <w:r>
-        <w:t xml:space="preserve">a lumbosacral</w:t>
-      </w:r>
-      <w:r>
-        <w:t xml:space="preserve"> </w:t>
-      </w:r>
-      <w:r>
-        <w:t xml:space="preserve">transitional vertebra (LSTV) alters the count the local anatomy is ambiguous: four rib-free lumbar</w:t>
-      </w:r>
-      <w:r>
-        <w:t xml:space="preserve"> </w:t>
-      </w:r>
-      <w:r>
-        <w:t xml:space="preserve">vertebrae may mean an L1 bearing a lumbar rib or an L5 assimilated to the sacrum, and six</w:t>
-      </w:r>
-      <w:r>
-        <w:t xml:space="preserve"> </w:t>
-      </w:r>
-      <w:r>
-        <w:t xml:space="preserve">may mean a sixth lumbar vertebra, a T12 whose ribs are aplastic, or an S1 lumbarized from</w:t>
-      </w:r>
-      <w:r>
-        <w:t xml:space="preserve"> </w:t>
-      </w:r>
-      <w:r>
-        <w:t xml:space="preserve">the sacrum </w:t>
-      </w:r>
-      <w:r>
-        <w:t xml:space="preserve">. CTSpinoPelvic1K is built so that this can be</w:t>
-      </w:r>
-      <w:r>
-        <w:t xml:space="preserve"> </w:t>
-      </w:r>
-      <w:r>
-        <w:t xml:space="preserve">asked of the data: whether local morphology resolves them without counting from C2. It provides 802 CT records anchoring each lumbar level on</w:t>
-      </w:r>
-      <w:r>
-        <w:t xml:space="preserve"> </w:t>
-      </w:r>
-      <w:r>
-        <w:t xml:space="preserve">the lowest rib-bearing vertebra above and the first sacral segment below, with</w:t>
-      </w:r>
-      <w:r>
-        <w:t xml:space="preserve"> </w:t>
-      </w:r>
-      <w:r>
-        <w:t xml:space="preserve">radiologist-sourced spine</w:t>
-      </w:r>
-      <w:r>
-        <w:t xml:space="preserve"> </w:t>
-      </w:r>
-      <w:r>
-        <w:rPr>
-          <w:i/>
-          <w:iCs/>
-        </w:rPr>
-        <w:t xml:space="preserve">and</w:t>
-      </w:r>
-      <w:r>
-        <w:t xml:space="preserve"> </w:t>
-      </w:r>
-      <w:r>
-        <w:t xml:space="preserve">pelvic annotation on one frame, per-level ribs and</w:t>
-      </w:r>
-      <w:r>
-        <w:t xml:space="preserve"> </w:t>
-      </w:r>
-      <w:r>
-        <w:t xml:space="preserve">femora. Classes for a sixth lumbar vertebra, a thirteenth thoracic vertebra, a separate first</w:t>
-      </w:r>
-      <w:r>
-        <w:t xml:space="preserve"> </w:t>
-      </w:r>
-      <w:r>
-        <w:t xml:space="preserve">sacral segment and lumbar ribs cover the anomalies.</w:t>
+        <w:t xml:space="preserve">A vertebra at the lumbosacral junction is named by counting. The gold</w:t>
+      </w:r>
+      <w:r>
+        <w:t xml:space="preserve"> </w:t>
+      </w:r>
+      <w:r>
+        <w:t xml:space="preserve">standard counts caudally from C2 on whole-spine imaging </w:t>
+      </w:r>
+      <w:r>
+        <w:t xml:space="preserve">; the imaging a lumbar</w:t>
+      </w:r>
+      <w:r>
+        <w:t xml:space="preserve"> </w:t>
+      </w:r>
+      <w:r>
+        <w:t xml:space="preserve">case is planned on is regional </w:t>
+      </w:r>
+      <w:r>
+        <w:t xml:space="preserve">, and an abdominal field of view never contains</w:t>
+      </w:r>
+      <w:r>
+        <w:t xml:space="preserve"> </w:t>
+      </w:r>
+      <w:r>
+        <w:t xml:space="preserve">C2. Where a lumbosacral transitional vertebra (LSTV) alters the count, the local anatomy is</w:t>
+      </w:r>
+      <w:r>
+        <w:t xml:space="preserve"> </w:t>
+      </w:r>
+      <w:r>
+        <w:t xml:space="preserve">ambiguous: four rib-free vertebrae above the sacrum may be an L1 bearing a lumbar rib or an</w:t>
+      </w:r>
+      <w:r>
+        <w:t xml:space="preserve"> </w:t>
+      </w:r>
+      <w:r>
+        <w:t xml:space="preserve">L5 assimilated to the sacrum, and six may be a sixth lumbar vertebra, a T12 whose ribs are</w:t>
+      </w:r>
+      <w:r>
+        <w:t xml:space="preserve"> </w:t>
+      </w:r>
+      <w:r>
+        <w:t xml:space="preserve">aplastic, or an S1 lumbarized from the sacrum </w:t>
+      </w:r>
+      <w:r>
+        <w:t xml:space="preserve">. CTSpinoPelvic1K exists</w:t>
+      </w:r>
+      <w:r>
+        <w:t xml:space="preserve"> </w:t>
+      </w:r>
+      <w:r>
+        <w:t xml:space="preserve">to ask whether local morphology can resolve that ambiguity without the count. It provides</w:t>
+      </w:r>
+      <w:r>
+        <w:t xml:space="preserve"> </w:t>
+      </w:r>
+      <w:r>
+        <w:t xml:space="preserve">802 CT records with radiologist-sourced spine and pelvic annotation on one frame, per-level</w:t>
+      </w:r>
+      <w:r>
+        <w:t xml:space="preserve"> </w:t>
+      </w:r>
+      <w:r>
+        <w:t xml:space="preserve">ribs and femora, each lumbar level anchored on the lowest rib-bearing vertebra above and the</w:t>
+      </w:r>
+      <w:r>
+        <w:t xml:space="preserve"> </w:t>
+      </w:r>
+      <w:r>
+        <w:t xml:space="preserve">first sacral segment below, and classes for a sixth lumbar vertebra, a thirteenth thoracic</w:t>
+      </w:r>
+      <w:r>
+        <w:t xml:space="preserve"> </w:t>
+      </w:r>
+      <w:r>
+        <w:t xml:space="preserve">vertebra, a separate first sacral segment and lumbar ribs, so that the anomalies are</w:t>
+      </w:r>
+      <w:r>
+        <w:t xml:space="preserve"> </w:t>
+      </w:r>
+      <w:r>
+        <w:t xml:space="preserve">recorded as themselves.</w:t>
       </w:r>
     </w:p>
     <w:p>

</xml_diff>

<commit_message>
abstract under 300 words again
Co-Authored-By: Claude Fable 5.1 <noreply@anthropic.com>
</commit_message>
<xml_diff>
--- a/paper/mpda/CTSpinoPelvic1K_review.docx
+++ b/paper/mpda/CTSpinoPelvic1K_review.docx
@@ -59,19 +59,19 @@
         <w:t xml:space="preserve">case is planned on is regional </w:t>
       </w:r>
       <w:r>
-        <w:t xml:space="preserve">, and an abdominal field of view never contains</w:t>
-      </w:r>
-      <w:r>
-        <w:t xml:space="preserve"> </w:t>
-      </w:r>
-      <w:r>
-        <w:t xml:space="preserve">C2. Where a lumbosacral transitional vertebra (LSTV) alters the count, the local anatomy is</w:t>
-      </w:r>
-      <w:r>
-        <w:t xml:space="preserve"> </w:t>
-      </w:r>
-      <w:r>
-        <w:t xml:space="preserve">ambiguous: four rib-free vertebrae above the sacrum may be an L1 bearing a lumbar rib or an</w:t>
+        <w:t xml:space="preserve">, and abdominal CT never contains C2. Where a</w:t>
+      </w:r>
+      <w:r>
+        <w:t xml:space="preserve"> </w:t>
+      </w:r>
+      <w:r>
+        <w:t xml:space="preserve">lumbosacral transitional vertebra (LSTV) alters the count, the local anatomy is ambiguous:</w:t>
+      </w:r>
+      <w:r>
+        <w:t xml:space="preserve"> </w:t>
+      </w:r>
+      <w:r>
+        <w:t xml:space="preserve">four rib-free vertebrae may be an L1 bearing a lumbar rib or an</w:t>
       </w:r>
       <w:r>
         <w:t xml:space="preserve"> </w:t>
@@ -92,7 +92,7 @@
         <w:t xml:space="preserve"> </w:t>
       </w:r>
       <w:r>
-        <w:t xml:space="preserve">to ask whether local morphology can resolve that ambiguity without the count. It provides</w:t>
+        <w:t xml:space="preserve">to ask whether local morphology resolves that ambiguity without the count. It provides</w:t>
       </w:r>
       <w:r>
         <w:t xml:space="preserve"> </w:t>
@@ -104,13 +104,13 @@
         <w:t xml:space="preserve"> </w:t>
       </w:r>
       <w:r>
-        <w:t xml:space="preserve">ribs and femora, each lumbar level anchored on the lowest rib-bearing vertebra above and the</w:t>
-      </w:r>
-      <w:r>
-        <w:t xml:space="preserve"> </w:t>
-      </w:r>
-      <w:r>
-        <w:t xml:space="preserve">first sacral segment below, and classes for a sixth lumbar vertebra, a thirteenth thoracic</w:t>
+        <w:t xml:space="preserve">ribs and femora, each lumbar level anchored on the lowest rib-bearing vertebra and the first</w:t>
+      </w:r>
+      <w:r>
+        <w:t xml:space="preserve"> </w:t>
+      </w:r>
+      <w:r>
+        <w:t xml:space="preserve">sacral segment, and classes for a sixth lumbar vertebra, a thirteenth thoracic</w:t>
       </w:r>
       <w:r>
         <w:t xml:space="preserve"> </w:t>

</xml_diff>

<commit_message>
submission set: caption list after the references, Fig. 1 as a standalone file, numbered figure files, cover letter; the AI disclosure names the tool
Co-Authored-By: Claude Fable 5.1 <noreply@anthropic.com>
</commit_message>
<xml_diff>
--- a/paper/mpda/CTSpinoPelvic1K_review.docx
+++ b/paper/mpda/CTSpinoPelvic1K_review.docx
@@ -2793,25 +2793,31 @@
         <w:t xml:space="preserve"> </w:t>
       </w:r>
       <w:r>
-        <w:t xml:space="preserve">Large language models assisted with drafting</w:t>
-      </w:r>
-      <w:r>
-        <w:t xml:space="preserve"> </w:t>
-      </w:r>
-      <w:r>
-        <w:t xml:space="preserve">and editing text and with analysis and figure code, under author review. They were not</w:t>
-      </w:r>
-      <w:r>
-        <w:t xml:space="preserve"> </w:t>
-      </w:r>
-      <w:r>
-        <w:t xml:space="preserve">used to generate, annotate or interpret imaging data; every number reported here is</w:t>
-      </w:r>
-      <w:r>
-        <w:t xml:space="preserve"> </w:t>
-      </w:r>
-      <w:r>
-        <w:t xml:space="preserve">computed by the released code from the released volumes.</w:t>
+        <w:t xml:space="preserve">A large language model (Claude, Anthropic)</w:t>
+      </w:r>
+      <w:r>
+        <w:t xml:space="preserve"> </w:t>
+      </w:r>
+      <w:r>
+        <w:t xml:space="preserve">assisted with drafting and editing the manuscript text and with writing the analysis and</w:t>
+      </w:r>
+      <w:r>
+        <w:t xml:space="preserve"> </w:t>
+      </w:r>
+      <w:r>
+        <w:t xml:space="preserve">figure code, all under author review. It was not used to generate, annotate or interpret</w:t>
+      </w:r>
+      <w:r>
+        <w:t xml:space="preserve"> </w:t>
+      </w:r>
+      <w:r>
+        <w:t xml:space="preserve">imaging data; every number reported here is computed by the released code from the</w:t>
+      </w:r>
+      <w:r>
+        <w:t xml:space="preserve"> </w:t>
+      </w:r>
+      <w:r>
+        <w:t xml:space="preserve">released volumes.</w:t>
       </w:r>
     </w:p>
     <w:bookmarkEnd w:id="23"/>
@@ -7358,6 +7364,270 @@
       </w:r>
     </w:p>
     <w:bookmarkEnd w:id="60"/>
+    <w:bookmarkStart w:id="61" w:name="figure-captions"/>
+    <w:p>
+      <w:pPr>
+        <w:pStyle w:val="Heading1"/>
+      </w:pPr>
+      <w:r>
+        <w:t xml:space="preserve">Figure captions</w:t>
+      </w:r>
+    </w:p>
+    <w:p>
+      <w:pPr>
+        <w:pStyle w:val="FirstParagraph"/>
+      </w:pPr>
+      <w:r>
+        <w:rPr>
+          <w:b/>
+          <w:bCs/>
+        </w:rPr>
+        <w:t xml:space="preserve">Figure 1.</w:t>
+      </w:r>
+      <w:r>
+        <w:t xml:space="preserve"> </w:t>
+      </w:r>
+      <w:r>
+        <w:t xml:space="preserve">How the dataset was built.</w:t>
+      </w:r>
+      <w:r>
+        <w:t xml:space="preserve"> </w:t>
+      </w:r>
+      <m:oMath>
+        <m:r>
+          <m:t>n</m:t>
+        </m:r>
+      </m:oMath>
+      <w:r>
+        <w:t xml:space="preserve"> </w:t>
+      </w:r>
+      <w:r>
+        <w:t xml:space="preserve">counts scans, or corrections, at each step.</w:t>
+      </w:r>
+    </w:p>
+    <w:p>
+      <w:pPr>
+        <w:pStyle w:val="BodyText"/>
+      </w:pPr>
+      <w:r>
+        <w:rPr>
+          <w:b/>
+          <w:bCs/>
+        </w:rPr>
+        <w:t xml:space="preserve">Figure 2.</w:t>
+      </w:r>
+      <w:r>
+        <w:t xml:space="preserve"> </w:t>
+      </w:r>
+      <w:r>
+        <w:t xml:space="preserve">The two anchors, from the released labels. Red, lowest rib-bearing vertebra and its rib; blue, S1; yellow, the rib-free vertebrae between. (b) and (c) both count four.</w:t>
+      </w:r>
+    </w:p>
+    <w:p>
+      <w:pPr>
+        <w:pStyle w:val="BodyText"/>
+      </w:pPr>
+      <w:r>
+        <w:rPr>
+          <w:b/>
+          <w:bCs/>
+        </w:rPr>
+        <w:t xml:space="preserve">Figure 3.</w:t>
+      </w:r>
+      <w:r>
+        <w:t xml:space="preserve"> </w:t>
+      </w:r>
+      <w:r>
+        <w:t xml:space="preserve">Instrumentation in the release, one exemplar each, drawn through bone. (a) Hip arthroplasty, 80,</w:t>
+      </w:r>
+      <w:r>
+        <w:t xml:space="preserve"> </w:t>
+      </w:r>
+      <m:oMath>
+        <m:r>
+          <m:t>n</m:t>
+        </m:r>
+        <m:r>
+          <m:rPr>
+            <m:sty m:val="p"/>
+          </m:rPr>
+          <m:t>=</m:t>
+        </m:r>
+        <m:r>
+          <m:t>8</m:t>
+        </m:r>
+      </m:oMath>
+      <w:r>
+        <w:t xml:space="preserve">. (b) Femoral-neck screws, 82,</w:t>
+      </w:r>
+      <w:r>
+        <w:t xml:space="preserve"> </w:t>
+      </w:r>
+      <m:oMath>
+        <m:r>
+          <m:t>n</m:t>
+        </m:r>
+        <m:r>
+          <m:rPr>
+            <m:sty m:val="p"/>
+          </m:rPr>
+          <m:t>=</m:t>
+        </m:r>
+        <m:r>
+          <m:t>1</m:t>
+        </m:r>
+      </m:oMath>
+      <w:r>
+        <w:t xml:space="preserve">. (c) Sacroiliac screws, 81,</w:t>
+      </w:r>
+      <w:r>
+        <w:t xml:space="preserve"> </w:t>
+      </w:r>
+      <m:oMath>
+        <m:r>
+          <m:t>n</m:t>
+        </m:r>
+        <m:r>
+          <m:rPr>
+            <m:sty m:val="p"/>
+          </m:rPr>
+          <m:t>=</m:t>
+        </m:r>
+        <m:r>
+          <m:t>1</m:t>
+        </m:r>
+      </m:oMath>
+      <w:r>
+        <w:t xml:space="preserve">. (d) Interbody cages, 77,</w:t>
+      </w:r>
+      <w:r>
+        <w:t xml:space="preserve"> </w:t>
+      </w:r>
+      <m:oMath>
+        <m:r>
+          <m:t>n</m:t>
+        </m:r>
+        <m:r>
+          <m:rPr>
+            <m:sty m:val="p"/>
+          </m:rPr>
+          <m:t>=</m:t>
+        </m:r>
+        <m:r>
+          <m:t>1</m:t>
+        </m:r>
+      </m:oMath>
+      <w:r>
+        <w:t xml:space="preserve">. Bar, 5 cm.</w:t>
+      </w:r>
+    </w:p>
+    <w:p>
+      <w:pPr>
+        <w:pStyle w:val="BodyText"/>
+      </w:pPr>
+      <w:r>
+        <w:rPr>
+          <w:b/>
+          <w:bCs/>
+        </w:rPr>
+        <w:t xml:space="preserve">Figure 4.</w:t>
+      </w:r>
+      <w:r>
+        <w:t xml:space="preserve"> </w:t>
+      </w:r>
+      <w:r>
+        <w:t xml:space="preserve">Count-free measures. (a) Vertebrae between the lowest rib and the sacrum. (b) Lowest rib length over the rib above. (c) Lowest lumbar transverse span against its gap to the ala; transitional labels marked.</w:t>
+      </w:r>
+    </w:p>
+    <w:p>
+      <w:pPr>
+        <w:pStyle w:val="BodyText"/>
+      </w:pPr>
+      <w:r>
+        <w:rPr>
+          <w:b/>
+          <w:bCs/>
+        </w:rPr>
+        <w:t xml:space="preserve">Figure 5.</w:t>
+      </w:r>
+      <w:r>
+        <w:t xml:space="preserve"> </w:t>
+      </w:r>
+      <w:r>
+        <w:t xml:space="preserve">Spinopelvic measures against standing reference bands (mean</w:t>
+      </w:r>
+      <w:r>
+        <w:t xml:space="preserve"> </w:t>
+      </w:r>
+      <m:oMath>
+        <m:r>
+          <m:rPr>
+            <m:sty m:val="p"/>
+          </m:rPr>
+          <m:t>±</m:t>
+        </m:r>
+      </m:oMath>
+      <w:r>
+        <w:t xml:space="preserve"> </w:t>
+      </w:r>
+      <w:r>
+        <w:t xml:space="preserve">SD) </w:t>
+      </w:r>
+      <w:r>
+        <w:t xml:space="preserve">.</w:t>
+      </w:r>
+    </w:p>
+    <w:p>
+      <w:pPr>
+        <w:pStyle w:val="BodyText"/>
+      </w:pPr>
+      <w:r>
+        <w:rPr>
+          <w:b/>
+          <w:bCs/>
+        </w:rPr>
+        <w:t xml:space="preserve">Figure 6.</w:t>
+      </w:r>
+      <w:r>
+        <w:t xml:space="preserve"> </w:t>
+      </w:r>
+      <w:r>
+        <w:t xml:space="preserve">Morphometry by level: median, interquartile range, 5th–95th percentile,</w:t>
+      </w:r>
+      <w:r>
+        <w:t xml:space="preserve"> </w:t>
+      </w:r>
+      <m:oMath>
+        <m:r>
+          <m:t>n</m:t>
+        </m:r>
+      </m:oMath>
+      <w:r>
+        <w:t xml:space="preserve"> </w:t>
+      </w:r>
+      <w:r>
+        <w:t xml:space="preserve">at right. (a) Body height. (b) Endplate width. (c) Canal. (d) Pedicle width. (e) Disc height. (f) Trabecular attenuation.</w:t>
+      </w:r>
+    </w:p>
+    <w:p>
+      <w:pPr>
+        <w:pStyle w:val="BodyText"/>
+      </w:pPr>
+      <w:r>
+        <w:rPr>
+          <w:b/>
+          <w:bCs/>
+        </w:rPr>
+        <w:t xml:space="preserve">Figure 7.</w:t>
+      </w:r>
+      <w:r>
+        <w:t xml:space="preserve"> </w:t>
+      </w:r>
+      <w:r>
+        <w:t xml:space="preserve">Records carrying each vertebral level, cranial to caudal. Counts per identifier in Table S1.</w:t>
+      </w:r>
+    </w:p>
+    <w:bookmarkEnd w:id="61"/>
     <w:sectPr>
       <w:footnotePr>
         <w:numRestart w:val="eachSect"/>

</xml_diff>